<commit_message>
Creacion: Elaboracion del cliente de escritorio con JavaSwinger. Punto: la raiz tiene en este caso una paleta de colores y toporafia importante. Falta: CambiarConstraseña
</commit_message>
<xml_diff>
--- a/TI.1.1. PAO202651_SOAP_JAVA_SINBDD_NRC36884_GR03/01. UML/01 ERS/ERS_SOAP_JAVA_SINBDD_GR03.docx
+++ b/TI.1.1. PAO202651_SOAP_JAVA_SINBDD_NRC36884_GR03/01. UML/01 ERS/ERS_SOAP_JAVA_SINBDD_GR03.docx
@@ -1,6 +1,6 @@
 
 <file path=word/document.xml><?xml version="1.0" encoding="utf-8"?>
-<w:document xmlns:wpc="http://schemas.microsoft.com/office/word/2010/wordprocessingCanvas" xmlns:cx="http://schemas.microsoft.com/office/drawing/2014/chartex" xmlns:cx1="http://schemas.microsoft.com/office/drawing/2015/9/8/chartex" xmlns:cx2="http://schemas.microsoft.com/office/drawing/2015/10/21/chartex" xmlns:cx3="http://schemas.microsoft.com/office/drawing/2016/5/9/chartex" xmlns:cx4="http://schemas.microsoft.com/office/drawing/2016/5/10/chartex" xmlns:cx5="http://schemas.microsoft.com/office/drawing/2016/5/11/chartex" xmlns:cx6="http://schemas.microsoft.com/office/drawing/2016/5/12/chartex" xmlns:cx7="http://schemas.microsoft.com/office/drawing/2016/5/13/chartex" xmlns:cx8="http://schemas.microsoft.com/office/drawing/2016/5/14/chartex" xmlns:mc="http://schemas.openxmlformats.org/markup-compatibility/2006" xmlns:aink="http://schemas.microsoft.com/office/drawing/2016/ink" xmlns:am3d="http://schemas.microsoft.com/office/drawing/2017/model3d" xmlns:o="urn:schemas-microsoft-com:office:office" xmlns:oel="http://schemas.microsoft.com/office/2019/extlst" xmlns:r="http://schemas.openxmlformats.org/officeDocument/2006/relationships" xmlns:m="http://schemas.openxmlformats.org/officeDocument/2006/math" xmlns:v="urn:schemas-microsoft-com:vml" xmlns:wp14="http://schemas.microsoft.com/office/word/2010/wordprocessingDrawing" xmlns:wp="http://schemas.openxmlformats.org/drawingml/2006/wordprocessingDrawing" xmlns:w10="urn:schemas-microsoft-com:office:word" xmlns:w="http://schemas.openxmlformats.org/wordprocessingml/2006/main" xmlns:w14="http://schemas.microsoft.com/office/word/2010/wordml" xmlns:w15="http://schemas.microsoft.com/office/word/2012/wordml" xmlns:w16cex="http://schemas.microsoft.com/office/word/2018/wordml/cex" xmlns:w16cid="http://schemas.microsoft.com/office/word/2016/wordml/cid" xmlns:w16="http://schemas.microsoft.com/office/word/2018/wordml" xmlns:w16du="http://schemas.microsoft.com/office/word/2023/wordml/word16du" xmlns:w16sdtdh="http://schemas.microsoft.com/office/word/2020/wordml/sdtdatahash" xmlns:w16sdtfl="http://schemas.microsoft.com/office/word/2024/wordml/sdtformatlock" xmlns:w16se="http://schemas.microsoft.com/office/word/2015/wordml/symex" xmlns:wpg="http://schemas.microsoft.com/office/word/2010/wordprocessingGroup" xmlns:wpi="http://schemas.microsoft.com/office/word/2010/wordprocessingInk" xmlns:wne="http://schemas.microsoft.com/office/word/2006/wordml" xmlns:wps="http://schemas.microsoft.com/office/word/2010/wordprocessingShape" mc:Ignorable="w14 w15 w16se w16cid w16 w16cex w16sdtdh w16sdtfl w16du wp14">
+<w:document xmlns:wpc="http://schemas.microsoft.com/office/word/2010/wordprocessingCanvas" xmlns:cx="http://schemas.microsoft.com/office/drawing/2014/chartex" xmlns:cx1="http://schemas.microsoft.com/office/drawing/2015/9/8/chartex" xmlns:cx2="http://schemas.microsoft.com/office/drawing/2015/10/21/chartex" xmlns:cx3="http://schemas.microsoft.com/office/drawing/2016/5/9/chartex" xmlns:cx4="http://schemas.microsoft.com/office/drawing/2016/5/10/chartex" xmlns:cx5="http://schemas.microsoft.com/office/drawing/2016/5/11/chartex" xmlns:cx6="http://schemas.microsoft.com/office/drawing/2016/5/12/chartex" xmlns:cx7="http://schemas.microsoft.com/office/drawing/2016/5/13/chartex" xmlns:cx8="http://schemas.microsoft.com/office/drawing/2016/5/14/chartex" xmlns:mc="http://schemas.openxmlformats.org/markup-compatibility/2006" xmlns:aink="http://schemas.microsoft.com/office/drawing/2016/ink" xmlns:am3d="http://schemas.microsoft.com/office/drawing/2017/model3d" xmlns:o="urn:schemas-microsoft-com:office:office" xmlns:r="http://schemas.openxmlformats.org/officeDocument/2006/relationships" xmlns:m="http://schemas.openxmlformats.org/officeDocument/2006/math" xmlns:v="urn:schemas-microsoft-com:vml" xmlns:wp14="http://schemas.microsoft.com/office/word/2010/wordprocessingDrawing" xmlns:wp="http://schemas.openxmlformats.org/drawingml/2006/wordprocessingDrawing" xmlns:w10="urn:schemas-microsoft-com:office:word" xmlns:w="http://schemas.openxmlformats.org/wordprocessingml/2006/main" xmlns:w14="http://schemas.microsoft.com/office/word/2010/wordml" xmlns:w15="http://schemas.microsoft.com/office/word/2012/wordml" xmlns:w16cex="http://schemas.microsoft.com/office/word/2018/wordml/cex" xmlns:w16cid="http://schemas.microsoft.com/office/word/2016/wordml/cid" xmlns:w16="http://schemas.microsoft.com/office/word/2018/wordml" xmlns:w16sdtdh="http://schemas.microsoft.com/office/word/2020/wordml/sdtdatahash" xmlns:w16se="http://schemas.microsoft.com/office/word/2015/wordml/symex" xmlns:wpg="http://schemas.microsoft.com/office/word/2010/wordprocessingGroup" xmlns:wpi="http://schemas.microsoft.com/office/word/2010/wordprocessingInk" xmlns:wne="http://schemas.microsoft.com/office/word/2006/wordml" xmlns:wps="http://schemas.microsoft.com/office/word/2010/wordprocessingShape" mc:Ignorable="w14 w15 w16se w16cid w16 w16cex w16sdtdh wp14">
   <w:body>
     <w:p>
       <w:pPr>
@@ -248,13 +248,8 @@
                             <w:pPr>
                               <w:jc w:val="center"/>
                             </w:pPr>
-                            <w:proofErr w:type="gramStart"/>
                             <w:r>
-                              <w:t>MIS.MDU.CCNA.CCIA</w:t>
-                            </w:r>
-                            <w:proofErr w:type="gramEnd"/>
-                            <w:r>
-                              <w:t>.</w:t>
+                              <w:t>MIS.MDU.CCNA.CCIA.</w:t>
                             </w:r>
                           </w:p>
                           <w:p>
@@ -357,7 +352,7 @@
                                 <w:szCs w:val="28"/>
                                 <w:lang w:eastAsia="es-EC"/>
                               </w:rPr>
-                              <w:t>07/10/2026</w:t>
+                              <w:t>11/10/2026</w:t>
                             </w:r>
                             <w:r>
                               <w:rPr>
@@ -393,7 +388,7 @@
           </mc:Choice>
           <mc:Fallback>
             <w:pict>
-              <v:rect w14:anchorId="2648791E" id="Rectángulo 1" o:spid="_x0000_s1026" style="position:absolute;left:0;text-align:left;margin-left:13.35pt;margin-top:208.1pt;width:416.25pt;height:441.6pt;z-index:251665408;visibility:visible;mso-wrap-style:square;mso-width-percent:0;mso-height-percent:0;mso-wrap-distance-left:9pt;mso-wrap-distance-top:0;mso-wrap-distance-right:9pt;mso-wrap-distance-bottom:0;mso-position-horizontal:absolute;mso-position-horizontal-relative:margin;mso-position-vertical:absolute;mso-position-vertical-relative:text;mso-width-percent:0;mso-height-percent:0;mso-width-relative:page;mso-height-relative:margin;v-text-anchor:middle" o:gfxdata="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" filled="f" stroked="f" strokeweight="2pt">
+              <v:rect w14:anchorId="2648791E" id="Rectángulo 1" o:spid="_x0000_s1026" style="position:absolute;left:0;text-align:left;margin-left:13.35pt;margin-top:208.1pt;width:416.25pt;height:441.6pt;z-index:251665408;visibility:visible;mso-wrap-style:square;mso-width-percent:0;mso-height-percent:0;mso-wrap-distance-left:9pt;mso-wrap-distance-top:0;mso-wrap-distance-right:9pt;mso-wrap-distance-bottom:0;mso-position-horizontal:absolute;mso-position-horizontal-relative:margin;mso-position-vertical:absolute;mso-position-vertical-relative:text;mso-width-percent:0;mso-height-percent:0;mso-width-relative:page;mso-height-relative:margin;v-text-anchor:middle" o:gfxdata="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" filled="f" stroked="f" strokeweight="2pt">
                 <v:textbox>
                   <w:txbxContent>
                     <w:p>
@@ -575,13 +570,8 @@
                       <w:pPr>
                         <w:jc w:val="center"/>
                       </w:pPr>
-                      <w:proofErr w:type="gramStart"/>
                       <w:r>
-                        <w:t>MIS.MDU.CCNA.CCIA</w:t>
-                      </w:r>
-                      <w:proofErr w:type="gramEnd"/>
-                      <w:r>
-                        <w:t>.</w:t>
+                        <w:t>MIS.MDU.CCNA.CCIA.</w:t>
                       </w:r>
                     </w:p>
                     <w:p>
@@ -684,7 +674,7 @@
                           <w:szCs w:val="28"/>
                           <w:lang w:eastAsia="es-EC"/>
                         </w:rPr>
-                        <w:t>07/10/2026</w:t>
+                        <w:t>11/10/2026</w:t>
                       </w:r>
                       <w:r>
                         <w:rPr>
@@ -913,10 +903,11 @@
                                   <w:calendar w:val="gregorian"/>
                                 </w:date>
                               </w:sdtPr>
+                              <w:sdtEndPr/>
                               <w:sdtContent>
                                 <w:p>
                                   <w:pPr>
-                                    <w:pStyle w:val="NoSpacing"/>
+                                    <w:pStyle w:val="Sinespaciado"/>
                                     <w:jc w:val="right"/>
                                     <w:rPr>
                                       <w:color w:val="FFFFFF" w:themeColor="background1"/>
@@ -4189,7 +4180,7 @@
               </wp:anchor>
             </w:drawing>
           </mc:Choice>
-          <mc:Fallback>
+          <mc:Fallback xmlns:w16sdtfl="http://schemas.microsoft.com/office/word/2024/wordml/sdtformatlock" xmlns:w16du="http://schemas.microsoft.com/office/word/2023/wordml/word16du" xmlns:oel="http://schemas.microsoft.com/office/2019/extlst">
             <w:pict>
               <v:group w14:anchorId="5D8D6F89" id="Grupo 2" o:spid="_x0000_s1027" style="position:absolute;left:0;text-align:left;margin-left:78.6pt;margin-top:71.4pt;width:167.95pt;height:698.4pt;z-index:-251652096;mso-position-horizontal-relative:page;mso-position-vertical-relative:page" coordsize="21336,91257" o:gfxdata="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">
                 <v:rect id="Rectángulo 3" o:spid="_x0000_s1028" style="position:absolute;width:1945;height:91257;visibility:visible;mso-wrap-style:square;v-text-anchor:middle" o:gfxdata="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" fillcolor="#1f497d [3215]" stroked="f" strokeweight="2pt"/>
@@ -4359,7 +4350,7 @@
     </w:p>
     <w:p>
       <w:pPr>
-        <w:pStyle w:val="Heading1"/>
+        <w:pStyle w:val="Ttulo1"/>
       </w:pPr>
       <w:bookmarkStart w:id="0" w:name="_Toc242251879"/>
       <w:r>
@@ -4385,6 +4376,7 @@
           <w:docPartUnique/>
         </w:docPartObj>
       </w:sdtPr>
+      <w:sdtEndPr/>
       <w:sdtContent>
         <w:p>
           <w:r>
@@ -4393,7 +4385,7 @@
         </w:p>
         <w:p>
           <w:pPr>
-            <w:pStyle w:val="TOC1"/>
+            <w:pStyle w:val="TDC1"/>
             <w:tabs>
               <w:tab w:val="right" w:leader="dot" w:pos="9020"/>
             </w:tabs>
@@ -4420,7 +4412,7 @@
           <w:hyperlink w:anchor="_Toc242251879" w:history="1">
             <w:r>
               <w:rPr>
-                <w:rStyle w:val="Hyperlink"/>
+                <w:rStyle w:val="Hipervnculo"/>
                 <w:noProof/>
               </w:rPr>
               <w:t>ESPECIFICACIÓN DE REQUERIMIENTOS DEL PARA SOA CON SOAP EN JAVA SIN BDD</w:t>
@@ -4477,7 +4469,7 @@
         </w:p>
         <w:p>
           <w:pPr>
-            <w:pStyle w:val="TOC1"/>
+            <w:pStyle w:val="TDC1"/>
             <w:tabs>
               <w:tab w:val="left" w:pos="980"/>
               <w:tab w:val="right" w:leader="dot" w:pos="9020"/>
@@ -4496,7 +4488,7 @@
           <w:hyperlink w:anchor="_Toc242251880" w:history="1">
             <w:r>
               <w:rPr>
-                <w:rStyle w:val="Hyperlink"/>
+                <w:rStyle w:val="Hipervnculo"/>
                 <w:noProof/>
               </w:rPr>
               <w:t>1.</w:t>
@@ -4516,7 +4508,7 @@
             </w:r>
             <w:r>
               <w:rPr>
-                <w:rStyle w:val="Hyperlink"/>
+                <w:rStyle w:val="Hipervnculo"/>
                 <w:noProof/>
               </w:rPr>
               <w:t>Introducción</w:t>
@@ -4573,7 +4565,7 @@
         </w:p>
         <w:p>
           <w:pPr>
-            <w:pStyle w:val="TOC1"/>
+            <w:pStyle w:val="TDC1"/>
             <w:tabs>
               <w:tab w:val="left" w:pos="980"/>
               <w:tab w:val="right" w:leader="dot" w:pos="9020"/>
@@ -4592,7 +4584,7 @@
           <w:hyperlink w:anchor="_Toc242251881" w:history="1">
             <w:r>
               <w:rPr>
-                <w:rStyle w:val="Hyperlink"/>
+                <w:rStyle w:val="Hipervnculo"/>
                 <w:noProof/>
               </w:rPr>
               <w:t>2.</w:t>
@@ -4612,7 +4604,7 @@
             </w:r>
             <w:r>
               <w:rPr>
-                <w:rStyle w:val="Hyperlink"/>
+                <w:rStyle w:val="Hipervnculo"/>
                 <w:noProof/>
               </w:rPr>
               <w:t>Propósito</w:t>
@@ -4669,7 +4661,7 @@
         </w:p>
         <w:p>
           <w:pPr>
-            <w:pStyle w:val="TOC1"/>
+            <w:pStyle w:val="TDC1"/>
             <w:tabs>
               <w:tab w:val="left" w:pos="980"/>
               <w:tab w:val="right" w:leader="dot" w:pos="9020"/>
@@ -4688,7 +4680,7 @@
           <w:hyperlink w:anchor="_Toc242251882" w:history="1">
             <w:r>
               <w:rPr>
-                <w:rStyle w:val="Hyperlink"/>
+                <w:rStyle w:val="Hipervnculo"/>
                 <w:noProof/>
               </w:rPr>
               <w:t>3.</w:t>
@@ -4708,7 +4700,7 @@
             </w:r>
             <w:r>
               <w:rPr>
-                <w:rStyle w:val="Hyperlink"/>
+                <w:rStyle w:val="Hipervnculo"/>
                 <w:noProof/>
               </w:rPr>
               <w:t>Alcance</w:t>
@@ -4765,7 +4757,7 @@
         </w:p>
         <w:p>
           <w:pPr>
-            <w:pStyle w:val="TOC1"/>
+            <w:pStyle w:val="TDC1"/>
             <w:tabs>
               <w:tab w:val="left" w:pos="980"/>
               <w:tab w:val="right" w:leader="dot" w:pos="9020"/>
@@ -4784,7 +4776,7 @@
           <w:hyperlink w:anchor="_Toc242251883" w:history="1">
             <w:r>
               <w:rPr>
-                <w:rStyle w:val="Hyperlink"/>
+                <w:rStyle w:val="Hipervnculo"/>
                 <w:noProof/>
               </w:rPr>
               <w:t>4.</w:t>
@@ -4804,7 +4796,7 @@
             </w:r>
             <w:r>
               <w:rPr>
-                <w:rStyle w:val="Hyperlink"/>
+                <w:rStyle w:val="Hipervnculo"/>
                 <w:noProof/>
               </w:rPr>
               <w:t>Definiciones, Acrónimos y Abreviaturas</w:t>
@@ -4861,7 +4853,7 @@
         </w:p>
         <w:p>
           <w:pPr>
-            <w:pStyle w:val="TOC2"/>
+            <w:pStyle w:val="TDC2"/>
             <w:tabs>
               <w:tab w:val="left" w:pos="1421"/>
               <w:tab w:val="right" w:leader="dot" w:pos="9020"/>
@@ -4880,7 +4872,7 @@
           <w:hyperlink w:anchor="_Toc242251884" w:history="1">
             <w:r>
               <w:rPr>
-                <w:rStyle w:val="Hyperlink"/>
+                <w:rStyle w:val="Hipervnculo"/>
                 <w:noProof/>
               </w:rPr>
               <w:t>4.1.</w:t>
@@ -4900,7 +4892,7 @@
             </w:r>
             <w:r>
               <w:rPr>
-                <w:rStyle w:val="Hyperlink"/>
+                <w:rStyle w:val="Hipervnculo"/>
                 <w:noProof/>
               </w:rPr>
               <w:t>Definiciones</w:t>
@@ -4957,7 +4949,7 @@
         </w:p>
         <w:p>
           <w:pPr>
-            <w:pStyle w:val="TOC2"/>
+            <w:pStyle w:val="TDC2"/>
             <w:tabs>
               <w:tab w:val="left" w:pos="1421"/>
               <w:tab w:val="right" w:leader="dot" w:pos="9020"/>
@@ -4976,7 +4968,7 @@
           <w:hyperlink w:anchor="_Toc242251885" w:history="1">
             <w:r>
               <w:rPr>
-                <w:rStyle w:val="Hyperlink"/>
+                <w:rStyle w:val="Hipervnculo"/>
                 <w:noProof/>
               </w:rPr>
               <w:t>4.2.</w:t>
@@ -4996,7 +4988,7 @@
             </w:r>
             <w:r>
               <w:rPr>
-                <w:rStyle w:val="Hyperlink"/>
+                <w:rStyle w:val="Hipervnculo"/>
                 <w:noProof/>
               </w:rPr>
               <w:t>Acrónimos y abreviaturas</w:t>
@@ -5053,7 +5045,7 @@
         </w:p>
         <w:p>
           <w:pPr>
-            <w:pStyle w:val="TOC1"/>
+            <w:pStyle w:val="TDC1"/>
             <w:tabs>
               <w:tab w:val="left" w:pos="980"/>
               <w:tab w:val="right" w:leader="dot" w:pos="9020"/>
@@ -5072,7 +5064,7 @@
           <w:hyperlink w:anchor="_Toc242251886" w:history="1">
             <w:r>
               <w:rPr>
-                <w:rStyle w:val="Hyperlink"/>
+                <w:rStyle w:val="Hipervnculo"/>
                 <w:noProof/>
               </w:rPr>
               <w:t>5.</w:t>
@@ -5092,7 +5084,7 @@
             </w:r>
             <w:r>
               <w:rPr>
-                <w:rStyle w:val="Hyperlink"/>
+                <w:rStyle w:val="Hipervnculo"/>
                 <w:noProof/>
               </w:rPr>
               <w:t>Referencias</w:t>
@@ -5149,7 +5141,7 @@
         </w:p>
         <w:p>
           <w:pPr>
-            <w:pStyle w:val="TOC1"/>
+            <w:pStyle w:val="TDC1"/>
             <w:tabs>
               <w:tab w:val="left" w:pos="980"/>
               <w:tab w:val="right" w:leader="dot" w:pos="9020"/>
@@ -5168,7 +5160,7 @@
           <w:hyperlink w:anchor="_Toc242251887" w:history="1">
             <w:r>
               <w:rPr>
-                <w:rStyle w:val="Hyperlink"/>
+                <w:rStyle w:val="Hipervnculo"/>
                 <w:noProof/>
               </w:rPr>
               <w:t>6.</w:t>
@@ -5188,7 +5180,7 @@
             </w:r>
             <w:r>
               <w:rPr>
-                <w:rStyle w:val="Hyperlink"/>
+                <w:rStyle w:val="Hipervnculo"/>
                 <w:noProof/>
               </w:rPr>
               <w:t>Visión General del Documento</w:t>
@@ -5245,7 +5237,7 @@
         </w:p>
         <w:p>
           <w:pPr>
-            <w:pStyle w:val="TOC1"/>
+            <w:pStyle w:val="TDC1"/>
             <w:tabs>
               <w:tab w:val="left" w:pos="980"/>
               <w:tab w:val="right" w:leader="dot" w:pos="9020"/>
@@ -5264,7 +5256,7 @@
           <w:hyperlink w:anchor="_Toc242251888" w:history="1">
             <w:r>
               <w:rPr>
-                <w:rStyle w:val="Hyperlink"/>
+                <w:rStyle w:val="Hipervnculo"/>
                 <w:noProof/>
               </w:rPr>
               <w:t>7.</w:t>
@@ -5284,7 +5276,7 @@
             </w:r>
             <w:r>
               <w:rPr>
-                <w:rStyle w:val="Hyperlink"/>
+                <w:rStyle w:val="Hipervnculo"/>
                 <w:noProof/>
               </w:rPr>
               <w:t>Descripción General</w:t>
@@ -5341,7 +5333,7 @@
         </w:p>
         <w:p>
           <w:pPr>
-            <w:pStyle w:val="TOC2"/>
+            <w:pStyle w:val="TDC2"/>
             <w:tabs>
               <w:tab w:val="left" w:pos="1421"/>
               <w:tab w:val="right" w:leader="dot" w:pos="9020"/>
@@ -5360,7 +5352,7 @@
           <w:hyperlink w:anchor="_Toc242251889" w:history="1">
             <w:r>
               <w:rPr>
-                <w:rStyle w:val="Hyperlink"/>
+                <w:rStyle w:val="Hipervnculo"/>
                 <w:noProof/>
               </w:rPr>
               <w:t>7.1.</w:t>
@@ -5380,7 +5372,7 @@
             </w:r>
             <w:r>
               <w:rPr>
-                <w:rStyle w:val="Hyperlink"/>
+                <w:rStyle w:val="Hipervnculo"/>
                 <w:noProof/>
               </w:rPr>
               <w:t>Perspectiva del Producto</w:t>
@@ -5437,7 +5429,7 @@
         </w:p>
         <w:p>
           <w:pPr>
-            <w:pStyle w:val="TOC2"/>
+            <w:pStyle w:val="TDC2"/>
             <w:tabs>
               <w:tab w:val="left" w:pos="1421"/>
               <w:tab w:val="right" w:leader="dot" w:pos="9020"/>
@@ -5456,7 +5448,7 @@
           <w:hyperlink w:anchor="_Toc242251890" w:history="1">
             <w:r>
               <w:rPr>
-                <w:rStyle w:val="Hyperlink"/>
+                <w:rStyle w:val="Hipervnculo"/>
                 <w:noProof/>
               </w:rPr>
               <w:t>7.2.</w:t>
@@ -5476,7 +5468,7 @@
             </w:r>
             <w:r>
               <w:rPr>
-                <w:rStyle w:val="Hyperlink"/>
+                <w:rStyle w:val="Hipervnculo"/>
                 <w:noProof/>
               </w:rPr>
               <w:t>Funciones del Producto (software)</w:t>
@@ -5533,7 +5525,7 @@
         </w:p>
         <w:p>
           <w:pPr>
-            <w:pStyle w:val="TOC2"/>
+            <w:pStyle w:val="TDC2"/>
             <w:tabs>
               <w:tab w:val="right" w:leader="dot" w:pos="9020"/>
             </w:tabs>
@@ -5551,7 +5543,7 @@
           <w:hyperlink w:anchor="_Toc242251891" w:history="1">
             <w:r>
               <w:rPr>
-                <w:rStyle w:val="Hyperlink"/>
+                <w:rStyle w:val="Hipervnculo"/>
                 <w:noProof/>
               </w:rPr>
               <w:t>7.3 Condiciones del Entorno</w:t>
@@ -5608,7 +5600,7 @@
         </w:p>
         <w:p>
           <w:pPr>
-            <w:pStyle w:val="TOC2"/>
+            <w:pStyle w:val="TDC2"/>
             <w:tabs>
               <w:tab w:val="right" w:leader="dot" w:pos="9020"/>
             </w:tabs>
@@ -5626,7 +5618,7 @@
           <w:hyperlink w:anchor="_Toc242251892" w:history="1">
             <w:r>
               <w:rPr>
-                <w:rStyle w:val="Hyperlink"/>
+                <w:rStyle w:val="Hipervnculo"/>
                 <w:noProof/>
               </w:rPr>
               <w:t>7.4 Características de los Usuarios</w:t>
@@ -5683,7 +5675,7 @@
         </w:p>
         <w:p>
           <w:pPr>
-            <w:pStyle w:val="TOC2"/>
+            <w:pStyle w:val="TDC2"/>
             <w:tabs>
               <w:tab w:val="right" w:leader="dot" w:pos="9020"/>
             </w:tabs>
@@ -5701,7 +5693,7 @@
           <w:hyperlink w:anchor="_Toc242251893" w:history="1">
             <w:r>
               <w:rPr>
-                <w:rStyle w:val="Hyperlink"/>
+                <w:rStyle w:val="Hipervnculo"/>
                 <w:noProof/>
               </w:rPr>
               <w:t>7.5 Interfaces Externas</w:t>
@@ -5758,7 +5750,7 @@
         </w:p>
         <w:p>
           <w:pPr>
-            <w:pStyle w:val="TOC2"/>
+            <w:pStyle w:val="TDC2"/>
             <w:tabs>
               <w:tab w:val="right" w:leader="dot" w:pos="9020"/>
             </w:tabs>
@@ -5776,7 +5768,7 @@
           <w:hyperlink w:anchor="_Toc242251894" w:history="1">
             <w:r>
               <w:rPr>
-                <w:rStyle w:val="Hyperlink"/>
+                <w:rStyle w:val="Hipervnculo"/>
                 <w:rFonts w:cs="Calibri"/>
                 <w:noProof/>
               </w:rPr>
@@ -5834,7 +5826,7 @@
         </w:p>
         <w:p>
           <w:pPr>
-            <w:pStyle w:val="TOC2"/>
+            <w:pStyle w:val="TDC2"/>
             <w:tabs>
               <w:tab w:val="right" w:leader="dot" w:pos="9020"/>
             </w:tabs>
@@ -5852,7 +5844,7 @@
           <w:hyperlink w:anchor="_Toc242251895" w:history="1">
             <w:r>
               <w:rPr>
-                <w:rStyle w:val="Hyperlink"/>
+                <w:rStyle w:val="Hipervnculo"/>
                 <w:noProof/>
               </w:rPr>
               <w:t>7.7 Suposiciones y Dependencias</w:t>
@@ -5909,7 +5901,7 @@
         </w:p>
         <w:p>
           <w:pPr>
-            <w:pStyle w:val="TOC1"/>
+            <w:pStyle w:val="TDC1"/>
             <w:tabs>
               <w:tab w:val="left" w:pos="980"/>
               <w:tab w:val="right" w:leader="dot" w:pos="9020"/>
@@ -5928,7 +5920,7 @@
           <w:hyperlink w:anchor="_Toc242251896" w:history="1">
             <w:r>
               <w:rPr>
-                <w:rStyle w:val="Hyperlink"/>
+                <w:rStyle w:val="Hipervnculo"/>
                 <w:noProof/>
               </w:rPr>
               <w:t>8.</w:t>
@@ -5948,7 +5940,7 @@
             </w:r>
             <w:r>
               <w:rPr>
-                <w:rStyle w:val="Hyperlink"/>
+                <w:rStyle w:val="Hipervnculo"/>
                 <w:noProof/>
               </w:rPr>
               <w:t>Especificación de Requerimientos</w:t>
@@ -6005,7 +5997,7 @@
         </w:p>
         <w:p>
           <w:pPr>
-            <w:pStyle w:val="TOC2"/>
+            <w:pStyle w:val="TDC2"/>
             <w:tabs>
               <w:tab w:val="right" w:leader="dot" w:pos="9020"/>
             </w:tabs>
@@ -6023,7 +6015,7 @@
           <w:hyperlink w:anchor="_Toc242251897" w:history="1">
             <w:r>
               <w:rPr>
-                <w:rStyle w:val="Hyperlink"/>
+                <w:rStyle w:val="Hipervnculo"/>
                 <w:noProof/>
               </w:rPr>
               <w:t>8.1 Requisitos comunes de las interfaces</w:t>
@@ -6080,7 +6072,7 @@
         </w:p>
         <w:p>
           <w:pPr>
-            <w:pStyle w:val="TOC3"/>
+            <w:pStyle w:val="TDC3"/>
             <w:tabs>
               <w:tab w:val="right" w:leader="dot" w:pos="9020"/>
             </w:tabs>
@@ -6098,7 +6090,7 @@
           <w:hyperlink w:anchor="_Toc242251898" w:history="1">
             <w:r>
               <w:rPr>
-                <w:rStyle w:val="Hyperlink"/>
+                <w:rStyle w:val="Hipervnculo"/>
                 <w:noProof/>
               </w:rPr>
               <w:t>8.1.1 Interfaces de usuario</w:t>
@@ -6155,7 +6147,7 @@
         </w:p>
         <w:p>
           <w:pPr>
-            <w:pStyle w:val="TOC3"/>
+            <w:pStyle w:val="TDC3"/>
             <w:tabs>
               <w:tab w:val="right" w:leader="dot" w:pos="9020"/>
             </w:tabs>
@@ -6173,7 +6165,7 @@
           <w:hyperlink w:anchor="_Toc242251899" w:history="1">
             <w:r>
               <w:rPr>
-                <w:rStyle w:val="Hyperlink"/>
+                <w:rStyle w:val="Hipervnculo"/>
                 <w:noProof/>
               </w:rPr>
               <w:t>8.1.2 Interfaces de hardware</w:t>
@@ -6230,7 +6222,7 @@
         </w:p>
         <w:p>
           <w:pPr>
-            <w:pStyle w:val="TOC3"/>
+            <w:pStyle w:val="TDC3"/>
             <w:tabs>
               <w:tab w:val="right" w:leader="dot" w:pos="9020"/>
             </w:tabs>
@@ -6248,7 +6240,7 @@
           <w:hyperlink w:anchor="_Toc242251900" w:history="1">
             <w:r>
               <w:rPr>
-                <w:rStyle w:val="Hyperlink"/>
+                <w:rStyle w:val="Hipervnculo"/>
                 <w:noProof/>
               </w:rPr>
               <w:t>8.1.3 Interfaces de software</w:t>
@@ -6305,7 +6297,7 @@
         </w:p>
         <w:p>
           <w:pPr>
-            <w:pStyle w:val="TOC3"/>
+            <w:pStyle w:val="TDC3"/>
             <w:tabs>
               <w:tab w:val="right" w:leader="dot" w:pos="9020"/>
             </w:tabs>
@@ -6323,7 +6315,7 @@
           <w:hyperlink w:anchor="_Toc242251901" w:history="1">
             <w:r>
               <w:rPr>
-                <w:rStyle w:val="Hyperlink"/>
+                <w:rStyle w:val="Hipervnculo"/>
                 <w:noProof/>
               </w:rPr>
               <w:t>8.1.4 Interfaces de comunicación</w:t>
@@ -6380,7 +6372,7 @@
         </w:p>
         <w:p>
           <w:pPr>
-            <w:pStyle w:val="TOC2"/>
+            <w:pStyle w:val="TDC2"/>
             <w:tabs>
               <w:tab w:val="right" w:leader="dot" w:pos="9020"/>
             </w:tabs>
@@ -6398,7 +6390,7 @@
           <w:hyperlink w:anchor="_Toc242251902" w:history="1">
             <w:r>
               <w:rPr>
-                <w:rStyle w:val="Hyperlink"/>
+                <w:rStyle w:val="Hipervnculo"/>
                 <w:noProof/>
               </w:rPr>
               <w:t>8.2 Requisitos Funcionales</w:t>
@@ -6455,7 +6447,7 @@
         </w:p>
         <w:p>
           <w:pPr>
-            <w:pStyle w:val="TOC3"/>
+            <w:pStyle w:val="TDC3"/>
             <w:tabs>
               <w:tab w:val="right" w:leader="dot" w:pos="9020"/>
             </w:tabs>
@@ -6473,7 +6465,7 @@
           <w:hyperlink w:anchor="_Toc242251903" w:history="1">
             <w:r>
               <w:rPr>
-                <w:rStyle w:val="Hyperlink"/>
+                <w:rStyle w:val="Hipervnculo"/>
                 <w:noProof/>
               </w:rPr>
               <w:t>8.2.1. Objetivo General</w:t>
@@ -6530,7 +6522,7 @@
         </w:p>
         <w:p>
           <w:pPr>
-            <w:pStyle w:val="TOC3"/>
+            <w:pStyle w:val="TDC3"/>
             <w:tabs>
               <w:tab w:val="right" w:leader="dot" w:pos="9020"/>
             </w:tabs>
@@ -6548,7 +6540,7 @@
           <w:hyperlink w:anchor="_Toc242251904" w:history="1">
             <w:r>
               <w:rPr>
-                <w:rStyle w:val="Hyperlink"/>
+                <w:rStyle w:val="Hipervnculo"/>
                 <w:noProof/>
               </w:rPr>
               <w:t>8.2.2. Objetivos Específicos</w:t>
@@ -6605,7 +6597,7 @@
         </w:p>
         <w:p>
           <w:pPr>
-            <w:pStyle w:val="TOC3"/>
+            <w:pStyle w:val="TDC3"/>
             <w:tabs>
               <w:tab w:val="right" w:leader="dot" w:pos="9020"/>
             </w:tabs>
@@ -6623,7 +6615,7 @@
           <w:hyperlink w:anchor="_Toc242251905" w:history="1">
             <w:r>
               <w:rPr>
-                <w:rStyle w:val="Hyperlink"/>
+                <w:rStyle w:val="Hipervnculo"/>
                 <w:noProof/>
               </w:rPr>
               <w:t>8.2.3. Actores</w:t>
@@ -6680,7 +6672,7 @@
         </w:p>
         <w:p>
           <w:pPr>
-            <w:pStyle w:val="TOC3"/>
+            <w:pStyle w:val="TDC3"/>
             <w:tabs>
               <w:tab w:val="right" w:leader="dot" w:pos="9020"/>
             </w:tabs>
@@ -6698,7 +6690,7 @@
           <w:hyperlink w:anchor="_Toc242251906" w:history="1">
             <w:r>
               <w:rPr>
-                <w:rStyle w:val="Hyperlink"/>
+                <w:rStyle w:val="Hipervnculo"/>
                 <w:noProof/>
               </w:rPr>
               <w:t>8.2.4. Lista de requisitos funcionales</w:t>
@@ -6755,7 +6747,7 @@
         </w:p>
         <w:p>
           <w:pPr>
-            <w:pStyle w:val="TOC3"/>
+            <w:pStyle w:val="TDC3"/>
             <w:tabs>
               <w:tab w:val="right" w:leader="dot" w:pos="9020"/>
             </w:tabs>
@@ -6773,7 +6765,7 @@
           <w:hyperlink w:anchor="_Toc242251907" w:history="1">
             <w:r>
               <w:rPr>
-                <w:rStyle w:val="Hyperlink"/>
+                <w:rStyle w:val="Hipervnculo"/>
                 <w:noProof/>
               </w:rPr>
               <w:t>8.2.5 Requisitos Funcionales</w:t>
@@ -6830,7 +6822,7 @@
         </w:p>
         <w:p>
           <w:pPr>
-            <w:pStyle w:val="TOC2"/>
+            <w:pStyle w:val="TDC2"/>
             <w:tabs>
               <w:tab w:val="right" w:leader="dot" w:pos="9020"/>
             </w:tabs>
@@ -6848,7 +6840,7 @@
           <w:hyperlink w:anchor="_Toc242251908" w:history="1">
             <w:r>
               <w:rPr>
-                <w:rStyle w:val="Hyperlink"/>
+                <w:rStyle w:val="Hipervnculo"/>
                 <w:noProof/>
               </w:rPr>
               <w:t>8.3 Requisitos No Funcionales</w:t>
@@ -6905,7 +6897,7 @@
         </w:p>
         <w:p>
           <w:pPr>
-            <w:pStyle w:val="TOC3"/>
+            <w:pStyle w:val="TDC3"/>
             <w:tabs>
               <w:tab w:val="right" w:leader="dot" w:pos="9020"/>
             </w:tabs>
@@ -6923,7 +6915,7 @@
           <w:hyperlink w:anchor="_Toc242251909" w:history="1">
             <w:r>
               <w:rPr>
-                <w:rStyle w:val="Hyperlink"/>
+                <w:rStyle w:val="Hipervnculo"/>
                 <w:noProof/>
               </w:rPr>
               <w:t>8.3.1 Objetivo General</w:t>
@@ -6980,7 +6972,7 @@
         </w:p>
         <w:p>
           <w:pPr>
-            <w:pStyle w:val="TOC2"/>
+            <w:pStyle w:val="TDC2"/>
             <w:tabs>
               <w:tab w:val="right" w:leader="dot" w:pos="9020"/>
             </w:tabs>
@@ -6998,7 +6990,7 @@
           <w:hyperlink w:anchor="_Toc242251910" w:history="1">
             <w:r>
               <w:rPr>
-                <w:rStyle w:val="Hyperlink"/>
+                <w:rStyle w:val="Hipervnculo"/>
                 <w:noProof/>
               </w:rPr>
               <w:t>8.4 Otros Requerimientos</w:t>
@@ -7055,7 +7047,7 @@
         </w:p>
         <w:p>
           <w:pPr>
-            <w:pStyle w:val="TOC3"/>
+            <w:pStyle w:val="TDC3"/>
             <w:tabs>
               <w:tab w:val="right" w:leader="dot" w:pos="9020"/>
             </w:tabs>
@@ -7073,7 +7065,7 @@
           <w:hyperlink w:anchor="_Toc242251911" w:history="1">
             <w:r>
               <w:rPr>
-                <w:rStyle w:val="Hyperlink"/>
+                <w:rStyle w:val="Hipervnculo"/>
                 <w:noProof/>
               </w:rPr>
               <w:t>8.4.1 Restricciones de Diseño</w:t>
@@ -7130,7 +7122,7 @@
         </w:p>
         <w:p>
           <w:pPr>
-            <w:pStyle w:val="TOC3"/>
+            <w:pStyle w:val="TDC3"/>
             <w:tabs>
               <w:tab w:val="right" w:leader="dot" w:pos="9020"/>
             </w:tabs>
@@ -7148,7 +7140,7 @@
           <w:hyperlink w:anchor="_Toc242251912" w:history="1">
             <w:r>
               <w:rPr>
-                <w:rStyle w:val="Hyperlink"/>
+                <w:rStyle w:val="Hipervnculo"/>
                 <w:noProof/>
               </w:rPr>
               <w:t>8.4.2 Restricciones de Hardware</w:t>
@@ -7205,7 +7197,7 @@
         </w:p>
         <w:p>
           <w:pPr>
-            <w:pStyle w:val="TOC3"/>
+            <w:pStyle w:val="TDC3"/>
             <w:tabs>
               <w:tab w:val="right" w:leader="dot" w:pos="9020"/>
             </w:tabs>
@@ -7223,7 +7215,7 @@
           <w:hyperlink w:anchor="_Toc242251913" w:history="1">
             <w:r>
               <w:rPr>
-                <w:rStyle w:val="Hyperlink"/>
+                <w:rStyle w:val="Hipervnculo"/>
                 <w:noProof/>
               </w:rPr>
               <w:t>8.4.3 Atributos de calidad</w:t>
@@ -7280,7 +7272,7 @@
         </w:p>
         <w:p>
           <w:pPr>
-            <w:pStyle w:val="TOC1"/>
+            <w:pStyle w:val="TDC1"/>
             <w:tabs>
               <w:tab w:val="right" w:leader="dot" w:pos="9020"/>
             </w:tabs>
@@ -7298,7 +7290,7 @@
           <w:hyperlink w:anchor="_Toc242251914" w:history="1">
             <w:r>
               <w:rPr>
-                <w:rStyle w:val="Hyperlink"/>
+                <w:rStyle w:val="Hipervnculo"/>
                 <w:noProof/>
               </w:rPr>
               <w:t>9. Requisitos de Rendimiento</w:t>
@@ -7355,7 +7347,7 @@
         </w:p>
         <w:p>
           <w:pPr>
-            <w:pStyle w:val="TOC2"/>
+            <w:pStyle w:val="TDC2"/>
             <w:tabs>
               <w:tab w:val="right" w:leader="dot" w:pos="9020"/>
             </w:tabs>
@@ -7373,7 +7365,7 @@
           <w:hyperlink w:anchor="_Toc242251915" w:history="1">
             <w:r>
               <w:rPr>
-                <w:rStyle w:val="Hyperlink"/>
+                <w:rStyle w:val="Hipervnculo"/>
                 <w:noProof/>
               </w:rPr>
               <w:t>9.1. Requisitos de Interfaces Externas</w:t>
@@ -7430,7 +7422,7 @@
         </w:p>
         <w:p>
           <w:pPr>
-            <w:pStyle w:val="TOC3"/>
+            <w:pStyle w:val="TDC3"/>
             <w:tabs>
               <w:tab w:val="right" w:leader="dot" w:pos="9020"/>
             </w:tabs>
@@ -7448,7 +7440,7 @@
           <w:hyperlink w:anchor="_Toc242251916" w:history="1">
             <w:r>
               <w:rPr>
-                <w:rStyle w:val="Hyperlink"/>
+                <w:rStyle w:val="Hipervnculo"/>
                 <w:noProof/>
               </w:rPr>
               <w:t>9.1.1. Interfaces de Usuario</w:t>
@@ -7505,7 +7497,7 @@
         </w:p>
         <w:p>
           <w:pPr>
-            <w:pStyle w:val="TOC3"/>
+            <w:pStyle w:val="TDC3"/>
             <w:tabs>
               <w:tab w:val="right" w:leader="dot" w:pos="9020"/>
             </w:tabs>
@@ -7523,7 +7515,7 @@
           <w:hyperlink w:anchor="_Toc242251917" w:history="1">
             <w:r>
               <w:rPr>
-                <w:rStyle w:val="Hyperlink"/>
+                <w:rStyle w:val="Hipervnculo"/>
                 <w:noProof/>
               </w:rPr>
               <w:t>9.1.2. Interfaces de Hardware</w:t>
@@ -7580,7 +7572,7 @@
         </w:p>
         <w:p>
           <w:pPr>
-            <w:pStyle w:val="TOC3"/>
+            <w:pStyle w:val="TDC3"/>
             <w:tabs>
               <w:tab w:val="right" w:leader="dot" w:pos="9020"/>
             </w:tabs>
@@ -7598,7 +7590,7 @@
           <w:hyperlink w:anchor="_Toc242251918" w:history="1">
             <w:r>
               <w:rPr>
-                <w:rStyle w:val="Hyperlink"/>
+                <w:rStyle w:val="Hipervnculo"/>
                 <w:noProof/>
               </w:rPr>
               <w:t>9.1.3. Interfaces de Software</w:t>
@@ -7655,7 +7647,7 @@
         </w:p>
         <w:p>
           <w:pPr>
-            <w:pStyle w:val="TOC3"/>
+            <w:pStyle w:val="TDC3"/>
             <w:tabs>
               <w:tab w:val="right" w:leader="dot" w:pos="9020"/>
             </w:tabs>
@@ -7673,7 +7665,7 @@
           <w:hyperlink w:anchor="_Toc242251919" w:history="1">
             <w:r>
               <w:rPr>
-                <w:rStyle w:val="Hyperlink"/>
+                <w:rStyle w:val="Hipervnculo"/>
                 <w:noProof/>
               </w:rPr>
               <w:t>9.1.4. Interfaces de Comunicación</w:t>
@@ -7756,7 +7748,7 @@
     </w:p>
     <w:p>
       <w:pPr>
-        <w:pStyle w:val="TOCHeading"/>
+        <w:pStyle w:val="TtuloTDC"/>
       </w:pPr>
       <w:r>
         <w:lastRenderedPageBreak/>
@@ -7768,7 +7760,7 @@
     </w:p>
     <w:p>
       <w:pPr>
-        <w:pStyle w:val="TableofFigures"/>
+        <w:pStyle w:val="Tabladeilustraciones"/>
         <w:tabs>
           <w:tab w:val="right" w:leader="dot" w:pos="9020"/>
         </w:tabs>
@@ -7795,7 +7787,7 @@
       <w:hyperlink w:anchor="_Toc242251965" w:history="1">
         <w:r>
           <w:rPr>
-            <w:rStyle w:val="Hyperlink"/>
+            <w:rStyle w:val="Hipervnculo"/>
             <w:noProof/>
           </w:rPr>
           <w:t>Ilustración 1. Diagrama de casos de uso del sistema</w:t>
@@ -7866,7 +7858,7 @@
     </w:p>
     <w:p>
       <w:pPr>
-        <w:pStyle w:val="TOCHeading"/>
+        <w:pStyle w:val="TtuloTDC"/>
       </w:pPr>
       <w:r>
         <w:lastRenderedPageBreak/>
@@ -7878,7 +7870,7 @@
     </w:p>
     <w:p>
       <w:pPr>
-        <w:pStyle w:val="TableofFigures"/>
+        <w:pStyle w:val="Tabladeilustraciones"/>
         <w:tabs>
           <w:tab w:val="right" w:leader="dot" w:pos="9020"/>
         </w:tabs>
@@ -7905,7 +7897,7 @@
       <w:hyperlink w:anchor="_Toc242251932" w:history="1">
         <w:r>
           <w:rPr>
-            <w:rStyle w:val="Hyperlink"/>
+            <w:rStyle w:val="Hipervnculo"/>
             <w:noProof/>
           </w:rPr>
           <w:t>Tabla 1. Definiciones</w:t>
@@ -7962,7 +7954,7 @@
     </w:p>
     <w:p>
       <w:pPr>
-        <w:pStyle w:val="TableofFigures"/>
+        <w:pStyle w:val="Tabladeilustraciones"/>
         <w:tabs>
           <w:tab w:val="right" w:leader="dot" w:pos="9020"/>
         </w:tabs>
@@ -7980,7 +7972,7 @@
       <w:hyperlink w:anchor="_Toc242251933" w:history="1">
         <w:r>
           <w:rPr>
-            <w:rStyle w:val="Hyperlink"/>
+            <w:rStyle w:val="Hipervnculo"/>
             <w:noProof/>
           </w:rPr>
           <w:t>Tabla 2. Acrónimo y abreviaturas</w:t>
@@ -8037,7 +8029,7 @@
     </w:p>
     <w:p>
       <w:pPr>
-        <w:pStyle w:val="TableofFigures"/>
+        <w:pStyle w:val="Tabladeilustraciones"/>
         <w:tabs>
           <w:tab w:val="right" w:leader="dot" w:pos="9020"/>
         </w:tabs>
@@ -8055,7 +8047,7 @@
       <w:hyperlink w:anchor="_Toc242251934" w:history="1">
         <w:r>
           <w:rPr>
-            <w:rStyle w:val="Hyperlink"/>
+            <w:rStyle w:val="Hipervnculo"/>
             <w:noProof/>
           </w:rPr>
           <w:t>Tabla 3. Referencias</w:t>
@@ -8112,7 +8104,7 @@
     </w:p>
     <w:p>
       <w:pPr>
-        <w:pStyle w:val="TableofFigures"/>
+        <w:pStyle w:val="Tabladeilustraciones"/>
         <w:tabs>
           <w:tab w:val="right" w:leader="dot" w:pos="9020"/>
         </w:tabs>
@@ -8130,7 +8122,7 @@
       <w:hyperlink w:anchor="_Toc242251935" w:history="1">
         <w:r>
           <w:rPr>
-            <w:rStyle w:val="Hyperlink"/>
+            <w:rStyle w:val="Hipervnculo"/>
             <w:noProof/>
           </w:rPr>
           <w:t>Tabla 4. Usuario final</w:t>
@@ -8187,7 +8179,7 @@
     </w:p>
     <w:p>
       <w:pPr>
-        <w:pStyle w:val="TableofFigures"/>
+        <w:pStyle w:val="Tabladeilustraciones"/>
         <w:tabs>
           <w:tab w:val="right" w:leader="dot" w:pos="9020"/>
         </w:tabs>
@@ -8205,7 +8197,7 @@
       <w:hyperlink w:anchor="_Toc242251936" w:history="1">
         <w:r>
           <w:rPr>
-            <w:rStyle w:val="Hyperlink"/>
+            <w:rStyle w:val="Hipervnculo"/>
             <w:noProof/>
           </w:rPr>
           <w:t>Tabla 8. Requisitos de interfaces de hardware</w:t>
@@ -8262,7 +8254,7 @@
     </w:p>
     <w:p>
       <w:pPr>
-        <w:pStyle w:val="TableofFigures"/>
+        <w:pStyle w:val="Tabladeilustraciones"/>
         <w:tabs>
           <w:tab w:val="right" w:leader="dot" w:pos="9020"/>
         </w:tabs>
@@ -8280,7 +8272,7 @@
       <w:hyperlink w:anchor="_Toc242251937" w:history="1">
         <w:r>
           <w:rPr>
-            <w:rStyle w:val="Hyperlink"/>
+            <w:rStyle w:val="Hipervnculo"/>
             <w:noProof/>
           </w:rPr>
           <w:t>Tabla 9.Interfaces de software</w:t>
@@ -8337,7 +8329,7 @@
     </w:p>
     <w:p>
       <w:pPr>
-        <w:pStyle w:val="TableofFigures"/>
+        <w:pStyle w:val="Tabladeilustraciones"/>
         <w:tabs>
           <w:tab w:val="right" w:leader="dot" w:pos="9020"/>
         </w:tabs>
@@ -8355,7 +8347,7 @@
       <w:hyperlink w:anchor="_Toc242251938" w:history="1">
         <w:r>
           <w:rPr>
-            <w:rStyle w:val="Hyperlink"/>
+            <w:rStyle w:val="Hipervnculo"/>
             <w:noProof/>
           </w:rPr>
           <w:t>Tabla 10. Autenticar el acceso de los clientes</w:t>
@@ -8412,7 +8404,7 @@
     </w:p>
     <w:p>
       <w:pPr>
-        <w:pStyle w:val="TableofFigures"/>
+        <w:pStyle w:val="Tabladeilustraciones"/>
         <w:tabs>
           <w:tab w:val="right" w:leader="dot" w:pos="9020"/>
         </w:tabs>
@@ -8430,7 +8422,7 @@
       <w:hyperlink w:anchor="_Toc242251939" w:history="1">
         <w:r>
           <w:rPr>
-            <w:rStyle w:val="Hyperlink"/>
+            <w:rStyle w:val="Hipervnculo"/>
             <w:noProof/>
           </w:rPr>
           <w:t>Tabla 11. Realizar conversiones</w:t>
@@ -8487,7 +8479,7 @@
     </w:p>
     <w:p>
       <w:pPr>
-        <w:pStyle w:val="TableofFigures"/>
+        <w:pStyle w:val="Tabladeilustraciones"/>
         <w:tabs>
           <w:tab w:val="right" w:leader="dot" w:pos="9020"/>
         </w:tabs>
@@ -8505,7 +8497,7 @@
       <w:hyperlink w:anchor="_Toc242251940" w:history="1">
         <w:r>
           <w:rPr>
-            <w:rStyle w:val="Hyperlink"/>
+            <w:rStyle w:val="Hipervnculo"/>
             <w:noProof/>
           </w:rPr>
           <w:t>Tabla 12. Consultar el catálogo de unidades</w:t>
@@ -8562,7 +8554,7 @@
     </w:p>
     <w:p>
       <w:pPr>
-        <w:pStyle w:val="TableofFigures"/>
+        <w:pStyle w:val="Tabladeilustraciones"/>
         <w:tabs>
           <w:tab w:val="right" w:leader="dot" w:pos="9020"/>
         </w:tabs>
@@ -8580,7 +8572,7 @@
       <w:hyperlink w:anchor="_Toc242251941" w:history="1">
         <w:r>
           <w:rPr>
-            <w:rStyle w:val="Hyperlink"/>
+            <w:rStyle w:val="Hipervnculo"/>
             <w:noProof/>
           </w:rPr>
           <w:t>Tabla 13. Respuestas Estructuradas</w:t>
@@ -8637,7 +8629,7 @@
     </w:p>
     <w:p>
       <w:pPr>
-        <w:pStyle w:val="TableofFigures"/>
+        <w:pStyle w:val="Tabladeilustraciones"/>
         <w:tabs>
           <w:tab w:val="right" w:leader="dot" w:pos="9020"/>
         </w:tabs>
@@ -8655,7 +8647,7 @@
       <w:hyperlink w:anchor="_Toc242251942" w:history="1">
         <w:r>
           <w:rPr>
-            <w:rStyle w:val="Hyperlink"/>
+            <w:rStyle w:val="Hipervnculo"/>
             <w:noProof/>
           </w:rPr>
           <w:t>Tabla 14. Actor Usuario</w:t>
@@ -8712,7 +8704,7 @@
     </w:p>
     <w:p>
       <w:pPr>
-        <w:pStyle w:val="TableofFigures"/>
+        <w:pStyle w:val="Tabladeilustraciones"/>
         <w:tabs>
           <w:tab w:val="right" w:leader="dot" w:pos="9020"/>
         </w:tabs>
@@ -8730,7 +8722,7 @@
       <w:hyperlink w:anchor="_Toc242251943" w:history="1">
         <w:r>
           <w:rPr>
-            <w:rStyle w:val="Hyperlink"/>
+            <w:rStyle w:val="Hipervnculo"/>
             <w:noProof/>
           </w:rPr>
           <w:t>Tabla 15. Actor Cliente Consola</w:t>
@@ -8787,7 +8779,7 @@
     </w:p>
     <w:p>
       <w:pPr>
-        <w:pStyle w:val="TableofFigures"/>
+        <w:pStyle w:val="Tabladeilustraciones"/>
         <w:tabs>
           <w:tab w:val="right" w:leader="dot" w:pos="9020"/>
         </w:tabs>
@@ -8805,7 +8797,7 @@
       <w:hyperlink w:anchor="_Toc242251944" w:history="1">
         <w:r>
           <w:rPr>
-            <w:rStyle w:val="Hyperlink"/>
+            <w:rStyle w:val="Hipervnculo"/>
             <w:noProof/>
           </w:rPr>
           <w:t>Tabla 16. Actor Cliente Escritorio</w:t>
@@ -8862,7 +8854,7 @@
     </w:p>
     <w:p>
       <w:pPr>
-        <w:pStyle w:val="TableofFigures"/>
+        <w:pStyle w:val="Tabladeilustraciones"/>
         <w:tabs>
           <w:tab w:val="right" w:leader="dot" w:pos="9020"/>
         </w:tabs>
@@ -8880,7 +8872,7 @@
       <w:hyperlink w:anchor="_Toc242251945" w:history="1">
         <w:r>
           <w:rPr>
-            <w:rStyle w:val="Hyperlink"/>
+            <w:rStyle w:val="Hipervnculo"/>
             <w:noProof/>
           </w:rPr>
           <w:t>Tabla 17. Actor Cliente Web</w:t>
@@ -8937,7 +8929,7 @@
     </w:p>
     <w:p>
       <w:pPr>
-        <w:pStyle w:val="TableofFigures"/>
+        <w:pStyle w:val="Tabladeilustraciones"/>
         <w:tabs>
           <w:tab w:val="right" w:leader="dot" w:pos="9020"/>
         </w:tabs>
@@ -8955,7 +8947,7 @@
       <w:hyperlink w:anchor="_Toc242251946" w:history="1">
         <w:r>
           <w:rPr>
-            <w:rStyle w:val="Hyperlink"/>
+            <w:rStyle w:val="Hipervnculo"/>
             <w:noProof/>
           </w:rPr>
           <w:t>Tabla 18. Actor Cliente Móvil Android</w:t>
@@ -9012,7 +9004,7 @@
     </w:p>
     <w:p>
       <w:pPr>
-        <w:pStyle w:val="TableofFigures"/>
+        <w:pStyle w:val="Tabladeilustraciones"/>
         <w:tabs>
           <w:tab w:val="right" w:leader="dot" w:pos="9020"/>
         </w:tabs>
@@ -9030,7 +9022,7 @@
       <w:hyperlink w:anchor="_Toc242251947" w:history="1">
         <w:r>
           <w:rPr>
-            <w:rStyle w:val="Hyperlink"/>
+            <w:rStyle w:val="Hipervnculo"/>
             <w:noProof/>
           </w:rPr>
           <w:t>Tabla 19. Lista de requisitos funcionales</w:t>
@@ -9087,7 +9079,7 @@
     </w:p>
     <w:p>
       <w:pPr>
-        <w:pStyle w:val="TableofFigures"/>
+        <w:pStyle w:val="Tabladeilustraciones"/>
         <w:tabs>
           <w:tab w:val="right" w:leader="dot" w:pos="9020"/>
         </w:tabs>
@@ -9105,7 +9097,7 @@
       <w:hyperlink w:anchor="_Toc242251948" w:history="1">
         <w:r>
           <w:rPr>
-            <w:rStyle w:val="Hyperlink"/>
+            <w:rStyle w:val="Hipervnculo"/>
             <w:noProof/>
           </w:rPr>
           <w:t>Tabla 20. Autenticar Cliente</w:t>
@@ -9162,7 +9154,7 @@
     </w:p>
     <w:p>
       <w:pPr>
-        <w:pStyle w:val="TableofFigures"/>
+        <w:pStyle w:val="Tabladeilustraciones"/>
         <w:tabs>
           <w:tab w:val="right" w:leader="dot" w:pos="9020"/>
         </w:tabs>
@@ -9180,7 +9172,7 @@
       <w:hyperlink w:anchor="_Toc242251949" w:history="1">
         <w:r>
           <w:rPr>
-            <w:rStyle w:val="Hyperlink"/>
+            <w:rStyle w:val="Hipervnculo"/>
             <w:noProof/>
           </w:rPr>
           <w:t>Tabla 21. Consultar catálogo</w:t>
@@ -9237,7 +9229,7 @@
     </w:p>
     <w:p>
       <w:pPr>
-        <w:pStyle w:val="TableofFigures"/>
+        <w:pStyle w:val="Tabladeilustraciones"/>
         <w:tabs>
           <w:tab w:val="right" w:leader="dot" w:pos="9020"/>
         </w:tabs>
@@ -9255,7 +9247,7 @@
       <w:hyperlink w:anchor="_Toc242251950" w:history="1">
         <w:r>
           <w:rPr>
-            <w:rStyle w:val="Hyperlink"/>
+            <w:rStyle w:val="Hipervnculo"/>
             <w:noProof/>
           </w:rPr>
           <w:t>Tabla 22. Consultar unidades por categoría</w:t>
@@ -9312,7 +9304,7 @@
     </w:p>
     <w:p>
       <w:pPr>
-        <w:pStyle w:val="TableofFigures"/>
+        <w:pStyle w:val="Tabladeilustraciones"/>
         <w:tabs>
           <w:tab w:val="right" w:leader="dot" w:pos="9020"/>
         </w:tabs>
@@ -9330,7 +9322,7 @@
       <w:hyperlink w:anchor="_Toc242251951" w:history="1">
         <w:r>
           <w:rPr>
-            <w:rStyle w:val="Hyperlink"/>
+            <w:rStyle w:val="Hipervnculo"/>
             <w:noProof/>
           </w:rPr>
           <w:t>Tabla 23. Convertir longitud</w:t>
@@ -9387,7 +9379,7 @@
     </w:p>
     <w:p>
       <w:pPr>
-        <w:pStyle w:val="TableofFigures"/>
+        <w:pStyle w:val="Tabladeilustraciones"/>
         <w:tabs>
           <w:tab w:val="right" w:leader="dot" w:pos="9020"/>
         </w:tabs>
@@ -9405,7 +9397,7 @@
       <w:hyperlink w:anchor="_Toc242251952" w:history="1">
         <w:r>
           <w:rPr>
-            <w:rStyle w:val="Hyperlink"/>
+            <w:rStyle w:val="Hipervnculo"/>
             <w:noProof/>
           </w:rPr>
           <w:t>Tabla 24. Convertir masa</w:t>
@@ -9462,7 +9454,7 @@
     </w:p>
     <w:p>
       <w:pPr>
-        <w:pStyle w:val="TableofFigures"/>
+        <w:pStyle w:val="Tabladeilustraciones"/>
         <w:tabs>
           <w:tab w:val="right" w:leader="dot" w:pos="9020"/>
         </w:tabs>
@@ -9480,7 +9472,7 @@
       <w:hyperlink w:anchor="_Toc242251953" w:history="1">
         <w:r>
           <w:rPr>
-            <w:rStyle w:val="Hyperlink"/>
+            <w:rStyle w:val="Hipervnculo"/>
             <w:noProof/>
           </w:rPr>
           <w:t>Tabla 25. Convertir temperatura</w:t>
@@ -9537,7 +9529,7 @@
     </w:p>
     <w:p>
       <w:pPr>
-        <w:pStyle w:val="TableofFigures"/>
+        <w:pStyle w:val="Tabladeilustraciones"/>
         <w:tabs>
           <w:tab w:val="right" w:leader="dot" w:pos="9020"/>
         </w:tabs>
@@ -9555,7 +9547,7 @@
       <w:hyperlink w:anchor="_Toc242251954" w:history="1">
         <w:r>
           <w:rPr>
-            <w:rStyle w:val="Hyperlink"/>
+            <w:rStyle w:val="Hipervnculo"/>
             <w:noProof/>
           </w:rPr>
           <w:t>Tabla 26. Validar token</w:t>
@@ -9612,7 +9604,7 @@
     </w:p>
     <w:p>
       <w:pPr>
-        <w:pStyle w:val="TableofFigures"/>
+        <w:pStyle w:val="Tabladeilustraciones"/>
         <w:tabs>
           <w:tab w:val="right" w:leader="dot" w:pos="9020"/>
         </w:tabs>
@@ -9630,7 +9622,7 @@
       <w:hyperlink w:anchor="_Toc242251955" w:history="1">
         <w:r>
           <w:rPr>
-            <w:rStyle w:val="Hyperlink"/>
+            <w:rStyle w:val="Hipervnculo"/>
             <w:noProof/>
           </w:rPr>
           <w:t>Tabla 27. Validar datos</w:t>
@@ -9687,7 +9679,7 @@
     </w:p>
     <w:p>
       <w:pPr>
-        <w:pStyle w:val="TableofFigures"/>
+        <w:pStyle w:val="Tabladeilustraciones"/>
         <w:tabs>
           <w:tab w:val="right" w:leader="dot" w:pos="9020"/>
         </w:tabs>
@@ -9705,7 +9697,7 @@
       <w:hyperlink w:anchor="_Toc242251956" w:history="1">
         <w:r>
           <w:rPr>
-            <w:rStyle w:val="Hyperlink"/>
+            <w:rStyle w:val="Hipervnculo"/>
             <w:noProof/>
           </w:rPr>
           <w:t>Tabla 28. Generar respuesta estructurada</w:t>
@@ -9762,7 +9754,7 @@
     </w:p>
     <w:p>
       <w:pPr>
-        <w:pStyle w:val="TableofFigures"/>
+        <w:pStyle w:val="Tabladeilustraciones"/>
         <w:tabs>
           <w:tab w:val="right" w:leader="dot" w:pos="9020"/>
         </w:tabs>
@@ -9780,7 +9772,7 @@
       <w:hyperlink w:anchor="_Toc242251957" w:history="1">
         <w:r>
           <w:rPr>
-            <w:rStyle w:val="Hyperlink"/>
+            <w:rStyle w:val="Hipervnculo"/>
             <w:noProof/>
           </w:rPr>
           <w:t>Tabla 29. Gestionar errores</w:t>
@@ -9837,7 +9829,7 @@
     </w:p>
     <w:p>
       <w:pPr>
-        <w:pStyle w:val="TableofFigures"/>
+        <w:pStyle w:val="Tabladeilustraciones"/>
         <w:tabs>
           <w:tab w:val="right" w:leader="dot" w:pos="9020"/>
         </w:tabs>
@@ -9855,7 +9847,7 @@
       <w:hyperlink w:anchor="_Toc242251958" w:history="1">
         <w:r>
           <w:rPr>
-            <w:rStyle w:val="Hyperlink"/>
+            <w:rStyle w:val="Hipervnculo"/>
             <w:noProof/>
           </w:rPr>
           <w:t>Tabla 30. Requerimiento no funcional Protocolo de Arquitectura (SOAP)</w:t>
@@ -9912,7 +9904,7 @@
     </w:p>
     <w:p>
       <w:pPr>
-        <w:pStyle w:val="TableofFigures"/>
+        <w:pStyle w:val="Tabladeilustraciones"/>
         <w:tabs>
           <w:tab w:val="right" w:leader="dot" w:pos="9020"/>
         </w:tabs>
@@ -9930,7 +9922,7 @@
       <w:hyperlink w:anchor="_Toc242251959" w:history="1">
         <w:r>
           <w:rPr>
-            <w:rStyle w:val="Hyperlink"/>
+            <w:rStyle w:val="Hipervnculo"/>
             <w:noProof/>
           </w:rPr>
           <w:t>Tabla 31. Requerimiento no funcional Especificación de Software.</w:t>
@@ -9987,7 +9979,7 @@
     </w:p>
     <w:p>
       <w:pPr>
-        <w:pStyle w:val="TableofFigures"/>
+        <w:pStyle w:val="Tabladeilustraciones"/>
         <w:tabs>
           <w:tab w:val="right" w:leader="dot" w:pos="9020"/>
         </w:tabs>
@@ -10005,7 +9997,7 @@
       <w:hyperlink w:anchor="_Toc242251960" w:history="1">
         <w:r>
           <w:rPr>
-            <w:rStyle w:val="Hyperlink"/>
+            <w:rStyle w:val="Hipervnculo"/>
             <w:noProof/>
           </w:rPr>
           <w:t>Tabla 32. Requerimiento no funcional Entorno de Desarrollo</w:t>
@@ -10062,7 +10054,7 @@
     </w:p>
     <w:p>
       <w:pPr>
-        <w:pStyle w:val="TableofFigures"/>
+        <w:pStyle w:val="Tabladeilustraciones"/>
         <w:tabs>
           <w:tab w:val="right" w:leader="dot" w:pos="9020"/>
         </w:tabs>
@@ -10080,7 +10072,7 @@
       <w:hyperlink w:anchor="_Toc242251961" w:history="1">
         <w:r>
           <w:rPr>
-            <w:rStyle w:val="Hyperlink"/>
+            <w:rStyle w:val="Hipervnculo"/>
             <w:noProof/>
           </w:rPr>
           <w:t>Tabla 33. Requerimiento no funcional Servidor de Aplicaciones</w:t>
@@ -10137,7 +10129,7 @@
     </w:p>
     <w:p>
       <w:pPr>
-        <w:pStyle w:val="TableofFigures"/>
+        <w:pStyle w:val="Tabladeilustraciones"/>
         <w:tabs>
           <w:tab w:val="right" w:leader="dot" w:pos="9020"/>
         </w:tabs>
@@ -10155,7 +10147,7 @@
       <w:hyperlink w:anchor="_Toc242251962" w:history="1">
         <w:r>
           <w:rPr>
-            <w:rStyle w:val="Hyperlink"/>
+            <w:rStyle w:val="Hipervnculo"/>
             <w:noProof/>
           </w:rPr>
           <w:t>Tabla 34. Requerimiento no funcional Seguridad y autorización de Token.</w:t>
@@ -10212,7 +10204,7 @@
     </w:p>
     <w:p>
       <w:pPr>
-        <w:pStyle w:val="TableofFigures"/>
+        <w:pStyle w:val="Tabladeilustraciones"/>
         <w:tabs>
           <w:tab w:val="right" w:leader="dot" w:pos="9020"/>
         </w:tabs>
@@ -10230,7 +10222,7 @@
       <w:hyperlink w:anchor="_Toc242251963" w:history="1">
         <w:r>
           <w:rPr>
-            <w:rStyle w:val="Hyperlink"/>
+            <w:rStyle w:val="Hipervnculo"/>
             <w:noProof/>
           </w:rPr>
           <w:t>Tabla 35. Requerimiento no funcional Accesibilidad.</w:t>
@@ -10287,7 +10279,7 @@
     </w:p>
     <w:p>
       <w:pPr>
-        <w:pStyle w:val="TableofFigures"/>
+        <w:pStyle w:val="Tabladeilustraciones"/>
         <w:tabs>
           <w:tab w:val="right" w:leader="dot" w:pos="9020"/>
         </w:tabs>
@@ -10305,7 +10297,7 @@
       <w:hyperlink w:anchor="_Toc242251964" w:history="1">
         <w:r>
           <w:rPr>
-            <w:rStyle w:val="Hyperlink"/>
+            <w:rStyle w:val="Hipervnculo"/>
             <w:noProof/>
           </w:rPr>
           <w:t>Tabla 36. Requerimiento no funcional Mantenimiento.</w:t>
@@ -10367,7 +10359,7 @@
     </w:p>
     <w:p>
       <w:pPr>
-        <w:pStyle w:val="TOCHeading"/>
+        <w:pStyle w:val="TtuloTDC"/>
       </w:pPr>
       <w:bookmarkStart w:id="1" w:name="_bookmark0"/>
       <w:bookmarkStart w:id="2" w:name="_Hlk241086724"/>
@@ -10410,7 +10402,7 @@
     </w:p>
     <w:p>
       <w:pPr>
-        <w:pStyle w:val="ListParagraph"/>
+        <w:pStyle w:val="Prrafodelista"/>
         <w:numPr>
           <w:ilvl w:val="0"/>
           <w:numId w:val="34"/>
@@ -10422,7 +10414,7 @@
     </w:p>
     <w:p>
       <w:pPr>
-        <w:pStyle w:val="ListParagraph"/>
+        <w:pStyle w:val="Prrafodelista"/>
         <w:numPr>
           <w:ilvl w:val="0"/>
           <w:numId w:val="34"/>
@@ -10434,7 +10426,7 @@
     </w:p>
     <w:p>
       <w:pPr>
-        <w:pStyle w:val="ListParagraph"/>
+        <w:pStyle w:val="Prrafodelista"/>
         <w:numPr>
           <w:ilvl w:val="0"/>
           <w:numId w:val="34"/>
@@ -10446,7 +10438,7 @@
     </w:p>
     <w:p>
       <w:pPr>
-        <w:pStyle w:val="ListParagraph"/>
+        <w:pStyle w:val="Prrafodelista"/>
         <w:numPr>
           <w:ilvl w:val="0"/>
           <w:numId w:val="34"/>
@@ -10463,7 +10455,7 @@
     </w:p>
     <w:p>
       <w:pPr>
-        <w:pStyle w:val="ListParagraph"/>
+        <w:pStyle w:val="Prrafodelista"/>
         <w:numPr>
           <w:ilvl w:val="0"/>
           <w:numId w:val="34"/>
@@ -10478,7 +10470,7 @@
     </w:p>
     <w:p>
       <w:pPr>
-        <w:pStyle w:val="ListParagraph"/>
+        <w:pStyle w:val="Prrafodelista"/>
         <w:numPr>
           <w:ilvl w:val="0"/>
           <w:numId w:val="34"/>
@@ -10490,7 +10482,7 @@
     </w:p>
     <w:p>
       <w:pPr>
-        <w:pStyle w:val="ListParagraph"/>
+        <w:pStyle w:val="Prrafodelista"/>
         <w:numPr>
           <w:ilvl w:val="0"/>
           <w:numId w:val="34"/>
@@ -10502,7 +10494,7 @@
     </w:p>
     <w:p>
       <w:pPr>
-        <w:pStyle w:val="ListParagraph"/>
+        <w:pStyle w:val="Prrafodelista"/>
         <w:numPr>
           <w:ilvl w:val="0"/>
           <w:numId w:val="34"/>
@@ -10529,7 +10521,7 @@
     </w:p>
     <w:p>
       <w:pPr>
-        <w:pStyle w:val="ListParagraph"/>
+        <w:pStyle w:val="Prrafodelista"/>
         <w:numPr>
           <w:ilvl w:val="0"/>
           <w:numId w:val="34"/>
@@ -10541,7 +10533,7 @@
     </w:p>
     <w:p>
       <w:pPr>
-        <w:pStyle w:val="ListParagraph"/>
+        <w:pStyle w:val="Prrafodelista"/>
         <w:numPr>
           <w:ilvl w:val="0"/>
           <w:numId w:val="34"/>
@@ -10553,14 +10545,22 @@
     </w:p>
     <w:p>
       <w:pPr>
-        <w:pStyle w:val="ListParagraph"/>
+        <w:pStyle w:val="Prrafodelista"/>
         <w:numPr>
           <w:ilvl w:val="0"/>
           <w:numId w:val="34"/>
         </w:numPr>
       </w:pPr>
       <w:r>
-        <w:t xml:space="preserve">El sistema será desarrollado con NetBeans como IDE y sin uso base de datos. La arquitectura es SOA (Service </w:t>
+        <w:t>El sistema será desarrollado con NetBeans como IDE y sin uso base de datos. La arquitectura es SOA (</w:t>
+      </w:r>
+      <w:proofErr w:type="spellStart"/>
+      <w:r>
+        <w:t>Service</w:t>
+      </w:r>
+      <w:proofErr w:type="spellEnd"/>
+      <w:r>
+        <w:t xml:space="preserve"> </w:t>
       </w:r>
       <w:proofErr w:type="spellStart"/>
       <w:r>
@@ -10600,7 +10600,7 @@
     </w:p>
     <w:p>
       <w:pPr>
-        <w:pStyle w:val="Heading1"/>
+        <w:pStyle w:val="Ttulo1"/>
         <w:numPr>
           <w:ilvl w:val="0"/>
           <w:numId w:val="20"/>
@@ -10634,7 +10634,7 @@
     </w:p>
     <w:p>
       <w:pPr>
-        <w:pStyle w:val="Heading1"/>
+        <w:pStyle w:val="Ttulo1"/>
         <w:numPr>
           <w:ilvl w:val="0"/>
           <w:numId w:val="20"/>
@@ -10713,7 +10713,7 @@
     </w:p>
     <w:p>
       <w:pPr>
-        <w:pStyle w:val="Heading1"/>
+        <w:pStyle w:val="Ttulo1"/>
         <w:numPr>
           <w:ilvl w:val="0"/>
           <w:numId w:val="20"/>
@@ -10923,7 +10923,7 @@
     </w:p>
     <w:p>
       <w:pPr>
-        <w:pStyle w:val="Heading1"/>
+        <w:pStyle w:val="Ttulo1"/>
         <w:numPr>
           <w:ilvl w:val="0"/>
           <w:numId w:val="20"/>
@@ -10940,7 +10940,7 @@
     </w:p>
     <w:p>
       <w:pPr>
-        <w:pStyle w:val="Heading2"/>
+        <w:pStyle w:val="Ttulo2"/>
         <w:numPr>
           <w:ilvl w:val="1"/>
           <w:numId w:val="20"/>
@@ -10954,7 +10954,7 @@
     </w:p>
     <w:p>
       <w:pPr>
-        <w:pStyle w:val="Caption"/>
+        <w:pStyle w:val="Descripcin"/>
       </w:pPr>
       <w:bookmarkStart w:id="13" w:name="_Toc242251932"/>
       <w:r>
@@ -10988,7 +10988,7 @@
     </w:p>
     <w:tbl>
       <w:tblPr>
-        <w:tblStyle w:val="GridTable4-Accent1"/>
+        <w:tblStyle w:val="Tablaconcuadrcula4-nfasis1"/>
         <w:tblW w:w="0" w:type="auto"/>
         <w:tblLook w:val="04A0" w:firstRow="1" w:lastRow="0" w:firstColumn="1" w:lastColumn="0" w:noHBand="0" w:noVBand="1"/>
       </w:tblPr>
@@ -11765,7 +11765,7 @@
     </w:p>
     <w:p>
       <w:pPr>
-        <w:pStyle w:val="Heading2"/>
+        <w:pStyle w:val="Ttulo2"/>
         <w:numPr>
           <w:ilvl w:val="1"/>
           <w:numId w:val="20"/>
@@ -11780,7 +11780,7 @@
     </w:p>
     <w:p>
       <w:pPr>
-        <w:pStyle w:val="Caption"/>
+        <w:pStyle w:val="Descripcin"/>
       </w:pPr>
       <w:bookmarkStart w:id="24" w:name="_Toc242251933"/>
       <w:r>
@@ -11817,7 +11817,7 @@
     </w:p>
     <w:tbl>
       <w:tblPr>
-        <w:tblStyle w:val="GridTable4-Accent1"/>
+        <w:tblStyle w:val="Tablaconcuadrcula4-nfasis1"/>
         <w:tblW w:w="5000" w:type="pct"/>
         <w:tblLayout w:type="fixed"/>
         <w:tblLook w:val="04A0" w:firstRow="1" w:lastRow="0" w:firstColumn="1" w:lastColumn="0" w:noHBand="0" w:noVBand="1"/>
@@ -11923,7 +11923,21 @@
               <w:rPr>
                 <w:rFonts w:cs="Calibri"/>
               </w:rPr>
-              <w:t xml:space="preserve">Arquitectura Orientada a Servicios (Service-Oriented </w:t>
+              <w:t>Arquitectura Orientada a Servicios (</w:t>
+            </w:r>
+            <w:proofErr w:type="spellStart"/>
+            <w:r>
+              <w:rPr>
+                <w:rFonts w:cs="Calibri"/>
+              </w:rPr>
+              <w:t>Service-Oriented</w:t>
+            </w:r>
+            <w:proofErr w:type="spellEnd"/>
+            <w:r>
+              <w:rPr>
+                <w:rFonts w:cs="Calibri"/>
+              </w:rPr>
+              <w:t xml:space="preserve"> </w:t>
             </w:r>
             <w:proofErr w:type="spellStart"/>
             <w:r>
@@ -12169,7 +12183,21 @@
               <w:rPr>
                 <w:rFonts w:cs="Calibri"/>
               </w:rPr>
-              <w:t xml:space="preserve"> State Transfer). </w:t>
+              <w:t xml:space="preserve"> </w:t>
+            </w:r>
+            <w:proofErr w:type="spellStart"/>
+            <w:r>
+              <w:rPr>
+                <w:rFonts w:cs="Calibri"/>
+              </w:rPr>
+              <w:t>State</w:t>
+            </w:r>
+            <w:proofErr w:type="spellEnd"/>
+            <w:r>
+              <w:rPr>
+                <w:rFonts w:cs="Calibri"/>
+              </w:rPr>
+              <w:t xml:space="preserve"> Transfer). </w:t>
             </w:r>
           </w:p>
         </w:tc>
@@ -12583,15 +12611,10 @@
         </w:tc>
       </w:tr>
     </w:tbl>
+    <w:p/>
     <w:p>
       <w:pPr>
-        <w:pStyle w:val="Heading1"/>
-        <w:ind w:left="360"/>
-      </w:pPr>
-    </w:p>
-    <w:p>
-      <w:pPr>
-        <w:pStyle w:val="Heading1"/>
+        <w:pStyle w:val="Ttulo1"/>
         <w:numPr>
           <w:ilvl w:val="0"/>
           <w:numId w:val="20"/>
@@ -12605,7 +12628,7 @@
     </w:p>
     <w:p>
       <w:pPr>
-        <w:pStyle w:val="Caption"/>
+        <w:pStyle w:val="Descripcin"/>
       </w:pPr>
       <w:bookmarkStart w:id="28" w:name="_Toc242251934"/>
       <w:r>
@@ -12639,7 +12662,7 @@
     </w:p>
     <w:tbl>
       <w:tblPr>
-        <w:tblStyle w:val="GridTable4-Accent1"/>
+        <w:tblStyle w:val="Tablaconcuadrcula4-nfasis1"/>
         <w:tblW w:w="5000" w:type="pct"/>
         <w:tblLayout w:type="fixed"/>
         <w:tblLook w:val="04A0" w:firstRow="1" w:lastRow="0" w:firstColumn="1" w:lastColumn="0" w:noHBand="0" w:noVBand="1"/>
@@ -12827,7 +12850,7 @@
             <w:hyperlink r:id="rId12">
               <w:r>
                 <w:rPr>
-                  <w:rStyle w:val="Hyperlink"/>
+                  <w:rStyle w:val="Hipervnculo"/>
                   <w:rFonts w:asciiTheme="minorHAnsi" w:hAnsiTheme="minorHAnsi" w:cstheme="minorHAnsi"/>
                 </w:rPr>
                 <w:t>http://www.qualitatis.org</w:t>
@@ -12876,16 +12899,12 @@
       </w:tr>
     </w:tbl>
     <w:p>
-      <w:pPr>
-        <w:pStyle w:val="Heading1"/>
-        <w:ind w:left="360"/>
-      </w:pPr>
       <w:bookmarkStart w:id="29" w:name="_bookmark6"/>
       <w:bookmarkEnd w:id="29"/>
     </w:p>
     <w:p>
       <w:pPr>
-        <w:pStyle w:val="Heading1"/>
+        <w:pStyle w:val="Ttulo1"/>
         <w:numPr>
           <w:ilvl w:val="0"/>
           <w:numId w:val="20"/>
@@ -12942,7 +12961,7 @@
     </w:p>
     <w:p>
       <w:pPr>
-        <w:pStyle w:val="Heading1"/>
+        <w:pStyle w:val="Ttulo1"/>
         <w:numPr>
           <w:ilvl w:val="0"/>
           <w:numId w:val="20"/>
@@ -12980,7 +12999,7 @@
     </w:p>
     <w:p>
       <w:pPr>
-        <w:pStyle w:val="Heading2"/>
+        <w:pStyle w:val="Ttulo2"/>
         <w:numPr>
           <w:ilvl w:val="1"/>
           <w:numId w:val="20"/>
@@ -13009,7 +13028,7 @@
     </w:p>
     <w:p>
       <w:pPr>
-        <w:pStyle w:val="Heading2"/>
+        <w:pStyle w:val="Ttulo2"/>
         <w:numPr>
           <w:ilvl w:val="1"/>
           <w:numId w:val="20"/>
@@ -13049,7 +13068,7 @@
     </w:p>
     <w:p>
       <w:pPr>
-        <w:pStyle w:val="ListParagraph"/>
+        <w:pStyle w:val="Prrafodelista"/>
         <w:numPr>
           <w:ilvl w:val="0"/>
           <w:numId w:val="40"/>
@@ -13068,7 +13087,7 @@
     </w:p>
     <w:p>
       <w:pPr>
-        <w:pStyle w:val="ListParagraph"/>
+        <w:pStyle w:val="Prrafodelista"/>
         <w:numPr>
           <w:ilvl w:val="0"/>
           <w:numId w:val="40"/>
@@ -13087,7 +13106,7 @@
     </w:p>
     <w:p>
       <w:pPr>
-        <w:pStyle w:val="ListParagraph"/>
+        <w:pStyle w:val="Prrafodelista"/>
         <w:numPr>
           <w:ilvl w:val="0"/>
           <w:numId w:val="40"/>
@@ -13106,7 +13125,7 @@
     </w:p>
     <w:p>
       <w:pPr>
-        <w:pStyle w:val="ListParagraph"/>
+        <w:pStyle w:val="Prrafodelista"/>
         <w:numPr>
           <w:ilvl w:val="0"/>
           <w:numId w:val="40"/>
@@ -13125,7 +13144,7 @@
     </w:p>
     <w:p>
       <w:pPr>
-        <w:pStyle w:val="ListParagraph"/>
+        <w:pStyle w:val="Prrafodelista"/>
         <w:numPr>
           <w:ilvl w:val="0"/>
           <w:numId w:val="40"/>
@@ -13144,7 +13163,7 @@
     </w:p>
     <w:p>
       <w:pPr>
-        <w:pStyle w:val="ListParagraph"/>
+        <w:pStyle w:val="Prrafodelista"/>
         <w:numPr>
           <w:ilvl w:val="0"/>
           <w:numId w:val="40"/>
@@ -13163,7 +13182,7 @@
     </w:p>
     <w:p>
       <w:pPr>
-        <w:pStyle w:val="ListParagraph"/>
+        <w:pStyle w:val="Prrafodelista"/>
         <w:numPr>
           <w:ilvl w:val="0"/>
           <w:numId w:val="40"/>
@@ -13182,7 +13201,7 @@
     </w:p>
     <w:p>
       <w:pPr>
-        <w:pStyle w:val="ListParagraph"/>
+        <w:pStyle w:val="Prrafodelista"/>
         <w:numPr>
           <w:ilvl w:val="0"/>
           <w:numId w:val="40"/>
@@ -13201,7 +13220,7 @@
     </w:p>
     <w:p>
       <w:pPr>
-        <w:pStyle w:val="ListParagraph"/>
+        <w:pStyle w:val="Prrafodelista"/>
         <w:numPr>
           <w:ilvl w:val="0"/>
           <w:numId w:val="40"/>
@@ -13226,7 +13245,7 @@
     </w:p>
     <w:p>
       <w:pPr>
-        <w:pStyle w:val="Caption"/>
+        <w:pStyle w:val="Descripcin"/>
       </w:pPr>
       <w:bookmarkStart w:id="36" w:name="_Toc242251965"/>
       <w:r>
@@ -13320,7 +13339,7 @@
     <w:bookmarkStart w:id="37" w:name="_Toc242251891"/>
     <w:p>
       <w:pPr>
-        <w:pStyle w:val="Heading2"/>
+        <w:pStyle w:val="Ttulo2"/>
         <w:spacing w:before="0" w:after="0"/>
       </w:pPr>
       <w:r>
@@ -13395,7 +13414,7 @@
               </wp:anchor>
             </w:drawing>
           </mc:Choice>
-          <mc:Fallback>
+          <mc:Fallback xmlns:w16sdtfl="http://schemas.microsoft.com/office/word/2024/wordml/sdtformatlock" xmlns:w16du="http://schemas.microsoft.com/office/word/2023/wordml/word16du" xmlns:oel="http://schemas.microsoft.com/office/2019/extlst">
             <w:pict>
               <v:rect w14:anchorId="6C311DD8" id="Rectangle 1979" o:spid="_x0000_s1026" style="position:absolute;margin-left:113.45pt;margin-top:12.85pt;width:3.85pt;height:1.4pt;z-index:-251658240;visibility:visible;mso-wrap-style:square;mso-width-percent:0;mso-height-percent:0;mso-wrap-distance-left:9pt;mso-wrap-distance-top:0;mso-wrap-distance-right:9pt;mso-wrap-distance-bottom:0;mso-position-horizontal:absolute;mso-position-horizontal-relative:page;mso-position-vertical:absolute;mso-position-vertical-relative:text;mso-width-percent:0;mso-height-percent:0;mso-width-relative:page;mso-height-relative:page;v-text-anchor:top" o:gfxdata="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" fillcolor="black" stroked="f">
                 <w10:wrap anchorx="page"/>
@@ -13430,7 +13449,7 @@
     </w:p>
     <w:p>
       <w:pPr>
-        <w:pStyle w:val="Heading2"/>
+        <w:pStyle w:val="Ttulo2"/>
         <w:spacing w:before="0" w:after="0"/>
       </w:pPr>
       <w:bookmarkStart w:id="39" w:name="_bookmark11"/>
@@ -13460,7 +13479,7 @@
     </w:p>
     <w:p>
       <w:pPr>
-        <w:pStyle w:val="Caption"/>
+        <w:pStyle w:val="Descripcin"/>
         <w:spacing w:before="0" w:after="0"/>
       </w:pPr>
       <w:bookmarkStart w:id="41" w:name="_Toc242251935"/>
@@ -13498,7 +13517,7 @@
     </w:p>
     <w:tbl>
       <w:tblPr>
-        <w:tblStyle w:val="GridTable4-Accent1"/>
+        <w:tblStyle w:val="Tablaconcuadrcula4-nfasis1"/>
         <w:tblW w:w="9133" w:type="dxa"/>
         <w:tblLook w:val="04A0" w:firstRow="1" w:lastRow="0" w:firstColumn="1" w:lastColumn="0" w:noHBand="0" w:noVBand="1"/>
       </w:tblPr>
@@ -13627,15 +13646,12 @@
       </w:tr>
     </w:tbl>
     <w:p>
-      <w:pPr>
-        <w:pStyle w:val="Heading2"/>
-      </w:pPr>
       <w:bookmarkStart w:id="42" w:name="_bookmark12"/>
       <w:bookmarkEnd w:id="42"/>
     </w:p>
     <w:p>
       <w:pPr>
-        <w:pStyle w:val="Heading2"/>
+        <w:pStyle w:val="Ttulo2"/>
         <w:spacing w:before="0" w:after="0"/>
       </w:pPr>
       <w:bookmarkStart w:id="43" w:name="_Toc242251893"/>
@@ -13662,7 +13678,7 @@
     </w:p>
     <w:p>
       <w:pPr>
-        <w:pStyle w:val="Heading2"/>
+        <w:pStyle w:val="Ttulo2"/>
         <w:spacing w:before="0" w:after="0"/>
         <w:rPr>
           <w:rFonts w:cs="Calibri"/>
@@ -13688,7 +13704,7 @@
     </w:p>
     <w:p>
       <w:pPr>
-        <w:pStyle w:val="ListParagraph"/>
+        <w:pStyle w:val="Prrafodelista"/>
         <w:numPr>
           <w:ilvl w:val="0"/>
           <w:numId w:val="41"/>
@@ -13696,20 +13712,12 @@
         <w:spacing w:before="0" w:after="0"/>
       </w:pPr>
       <w:r>
-        <w:t xml:space="preserve">Hardware: los equipos para el servidor y los clientes deben contar con especificaciones básicas, por </w:t>
-      </w:r>
-      <w:proofErr w:type="gramStart"/>
-      <w:r>
-        <w:t>ejemplo</w:t>
-      </w:r>
-      <w:proofErr w:type="gramEnd"/>
-      <w:r>
-        <w:t xml:space="preserve"> procesador Intel i3-10100, 4 GB de RAM y tarjeta de red funcional.</w:t>
+        <w:t>Hardware: los equipos para el servidor y los clientes deben contar con especificaciones básicas, por ejemplo procesador Intel i3-10100, 4 GB de RAM y tarjeta de red funcional.</w:t>
       </w:r>
     </w:p>
     <w:p>
       <w:pPr>
-        <w:pStyle w:val="ListParagraph"/>
+        <w:pStyle w:val="Prrafodelista"/>
         <w:numPr>
           <w:ilvl w:val="0"/>
           <w:numId w:val="41"/>
@@ -13722,7 +13730,7 @@
     </w:p>
     <w:p>
       <w:pPr>
-        <w:pStyle w:val="ListParagraph"/>
+        <w:pStyle w:val="Prrafodelista"/>
         <w:numPr>
           <w:ilvl w:val="0"/>
           <w:numId w:val="41"/>
@@ -13735,7 +13743,7 @@
     </w:p>
     <w:p>
       <w:pPr>
-        <w:pStyle w:val="ListParagraph"/>
+        <w:pStyle w:val="Prrafodelista"/>
         <w:numPr>
           <w:ilvl w:val="0"/>
           <w:numId w:val="41"/>
@@ -13748,7 +13756,7 @@
     </w:p>
     <w:p>
       <w:pPr>
-        <w:pStyle w:val="ListParagraph"/>
+        <w:pStyle w:val="Prrafodelista"/>
         <w:numPr>
           <w:ilvl w:val="0"/>
           <w:numId w:val="41"/>
@@ -13761,7 +13769,7 @@
     </w:p>
     <w:p>
       <w:pPr>
-        <w:pStyle w:val="ListParagraph"/>
+        <w:pStyle w:val="Prrafodelista"/>
         <w:numPr>
           <w:ilvl w:val="0"/>
           <w:numId w:val="41"/>
@@ -13774,7 +13782,7 @@
     </w:p>
     <w:p>
       <w:pPr>
-        <w:pStyle w:val="ListParagraph"/>
+        <w:pStyle w:val="Prrafodelista"/>
         <w:numPr>
           <w:ilvl w:val="0"/>
           <w:numId w:val="41"/>
@@ -13787,7 +13795,7 @@
     </w:p>
     <w:p>
       <w:pPr>
-        <w:pStyle w:val="ListParagraph"/>
+        <w:pStyle w:val="Prrafodelista"/>
         <w:numPr>
           <w:ilvl w:val="0"/>
           <w:numId w:val="41"/>
@@ -13800,7 +13808,7 @@
     </w:p>
     <w:p>
       <w:pPr>
-        <w:pStyle w:val="ListParagraph"/>
+        <w:pStyle w:val="Prrafodelista"/>
         <w:numPr>
           <w:ilvl w:val="0"/>
           <w:numId w:val="41"/>
@@ -13826,7 +13834,7 @@
     </w:p>
     <w:p>
       <w:pPr>
-        <w:pStyle w:val="Heading2"/>
+        <w:pStyle w:val="Ttulo2"/>
         <w:spacing w:before="0" w:after="0"/>
       </w:pPr>
       <w:bookmarkStart w:id="46" w:name="_bookmark14"/>
@@ -13905,7 +13913,7 @@
     </w:p>
     <w:p>
       <w:pPr>
-        <w:pStyle w:val="Heading1"/>
+        <w:pStyle w:val="Ttulo1"/>
         <w:numPr>
           <w:ilvl w:val="0"/>
           <w:numId w:val="20"/>
@@ -13920,7 +13928,7 @@
     </w:p>
     <w:p>
       <w:pPr>
-        <w:pStyle w:val="Heading2"/>
+        <w:pStyle w:val="Ttulo2"/>
       </w:pPr>
       <w:bookmarkStart w:id="49" w:name="_bookmark16"/>
       <w:bookmarkStart w:id="50" w:name="_Toc242251897"/>
@@ -13935,7 +13943,7 @@
     </w:p>
     <w:p>
       <w:pPr>
-        <w:pStyle w:val="Heading3"/>
+        <w:pStyle w:val="Ttulo3"/>
       </w:pPr>
       <w:bookmarkStart w:id="51" w:name="_Toc242251898"/>
       <w:r>
@@ -13956,7 +13964,7 @@
     </w:p>
     <w:p>
       <w:pPr>
-        <w:pStyle w:val="Heading3"/>
+        <w:pStyle w:val="Ttulo3"/>
       </w:pPr>
       <w:bookmarkStart w:id="52" w:name="_Toc242251899"/>
       <w:r>
@@ -13969,7 +13977,7 @@
     </w:p>
     <w:p>
       <w:pPr>
-        <w:pStyle w:val="Caption"/>
+        <w:pStyle w:val="Descripcin"/>
       </w:pPr>
       <w:bookmarkStart w:id="53" w:name="_Toc242251936"/>
       <w:r>
@@ -14003,7 +14011,7 @@
     </w:p>
     <w:tbl>
       <w:tblPr>
-        <w:tblStyle w:val="GridTable4-Accent1"/>
+        <w:tblStyle w:val="Tablaconcuadrcula4-nfasis1"/>
         <w:tblW w:w="0" w:type="auto"/>
         <w:tblLook w:val="04A0" w:firstRow="1" w:lastRow="0" w:firstColumn="1" w:lastColumn="0" w:noHBand="0" w:noVBand="1"/>
       </w:tblPr>
@@ -14907,7 +14915,7 @@
     </w:tbl>
     <w:p>
       <w:pPr>
-        <w:pStyle w:val="Heading3"/>
+        <w:pStyle w:val="Ttulo3"/>
       </w:pPr>
       <w:bookmarkStart w:id="54" w:name="_Toc242251900"/>
       <w:r>
@@ -14921,7 +14929,7 @@
     </w:p>
     <w:p>
       <w:pPr>
-        <w:pStyle w:val="Caption"/>
+        <w:pStyle w:val="Descripcin"/>
       </w:pPr>
       <w:bookmarkStart w:id="55" w:name="_Toc242251937"/>
       <w:r>
@@ -14955,7 +14963,7 @@
     </w:p>
     <w:tbl>
       <w:tblPr>
-        <w:tblStyle w:val="GridTable4-Accent1"/>
+        <w:tblStyle w:val="Tablaconcuadrcula4-nfasis1"/>
         <w:tblW w:w="5000" w:type="pct"/>
         <w:tblLook w:val="04A0" w:firstRow="1" w:lastRow="0" w:firstColumn="1" w:lastColumn="0" w:noHBand="0" w:noVBand="1"/>
       </w:tblPr>
@@ -15073,7 +15081,7 @@
             <w:hyperlink r:id="rId14" w:history="1">
               <w:r>
                 <w:rPr>
-                  <w:rStyle w:val="Hyperlink"/>
+                  <w:rStyle w:val="Hipervnculo"/>
                 </w:rPr>
                 <w:t xml:space="preserve"> http://windows.microsoft.com/</w:t>
               </w:r>
@@ -15182,7 +15190,7 @@
             <w:hyperlink r:id="rId15" w:history="1">
               <w:r>
                 <w:rPr>
-                  <w:rStyle w:val="Hyperlink"/>
+                  <w:rStyle w:val="Hipervnculo"/>
                 </w:rPr>
                 <w:t xml:space="preserve"> https://www.netbeanside.com/</w:t>
               </w:r>
@@ -15260,7 +15268,15 @@
               <w:cnfStyle w:val="000000100000" w:firstRow="0" w:lastRow="0" w:firstColumn="0" w:lastColumn="0" w:oddVBand="0" w:evenVBand="0" w:oddHBand="1" w:evenHBand="0" w:firstRowFirstColumn="0" w:firstRowLastColumn="0" w:lastRowFirstColumn="0" w:lastRowLastColumn="0"/>
             </w:pPr>
             <w:r>
-              <w:t xml:space="preserve">Nombre: Power </w:t>
+              <w:t xml:space="preserve">Nombre: </w:t>
+            </w:r>
+            <w:proofErr w:type="spellStart"/>
+            <w:r>
+              <w:t>Power</w:t>
+            </w:r>
+            <w:proofErr w:type="spellEnd"/>
+            <w:r>
+              <w:t xml:space="preserve"> </w:t>
             </w:r>
             <w:proofErr w:type="spellStart"/>
             <w:r>
@@ -15512,7 +15528,7 @@
             <w:hyperlink r:id="rId17" w:history="1">
               <w:r>
                 <w:rPr>
-                  <w:rStyle w:val="Hyperlink"/>
+                  <w:rStyle w:val="Hipervnculo"/>
                 </w:rPr>
                 <w:t>https://www.payara.fish/</w:t>
               </w:r>
@@ -15569,7 +15585,7 @@
     </w:tbl>
     <w:p>
       <w:pPr>
-        <w:pStyle w:val="Heading3"/>
+        <w:pStyle w:val="Ttulo3"/>
       </w:pPr>
       <w:bookmarkStart w:id="56" w:name="_Toc242251901"/>
       <w:r>
@@ -15612,7 +15628,7 @@
     </w:p>
     <w:p>
       <w:pPr>
-        <w:pStyle w:val="ListParagraph"/>
+        <w:pStyle w:val="Prrafodelista"/>
         <w:numPr>
           <w:ilvl w:val="0"/>
           <w:numId w:val="24"/>
@@ -15641,7 +15657,7 @@
     </w:p>
     <w:p>
       <w:pPr>
-        <w:pStyle w:val="ListParagraph"/>
+        <w:pStyle w:val="Prrafodelista"/>
         <w:numPr>
           <w:ilvl w:val="0"/>
           <w:numId w:val="24"/>
@@ -15674,7 +15690,7 @@
     </w:p>
     <w:p>
       <w:pPr>
-        <w:pStyle w:val="ListParagraph"/>
+        <w:pStyle w:val="Prrafodelista"/>
         <w:numPr>
           <w:ilvl w:val="0"/>
           <w:numId w:val="24"/>
@@ -15699,7 +15715,7 @@
     </w:p>
     <w:p>
       <w:pPr>
-        <w:pStyle w:val="Heading2"/>
+        <w:pStyle w:val="Ttulo2"/>
       </w:pPr>
       <w:bookmarkStart w:id="57" w:name="_Toc242251902"/>
       <w:r>
@@ -15712,7 +15728,7 @@
     </w:p>
     <w:p>
       <w:pPr>
-        <w:pStyle w:val="Heading3"/>
+        <w:pStyle w:val="Ttulo3"/>
       </w:pPr>
       <w:bookmarkStart w:id="58" w:name="_Toc242251903"/>
       <w:r>
@@ -15730,7 +15746,7 @@
     </w:p>
     <w:p>
       <w:pPr>
-        <w:pStyle w:val="Heading3"/>
+        <w:pStyle w:val="Ttulo3"/>
       </w:pPr>
       <w:bookmarkStart w:id="59" w:name="_Toc242251904"/>
       <w:r>
@@ -15754,7 +15770,7 @@
     </w:p>
     <w:p>
       <w:pPr>
-        <w:pStyle w:val="Caption"/>
+        <w:pStyle w:val="Descripcin"/>
         <w:rPr>
           <w:rFonts w:ascii="Verdana" w:eastAsia="Droid Sans Fallback" w:hAnsi="Verdana" w:cstheme="minorHAnsi"/>
           <w:sz w:val="24"/>
@@ -15793,7 +15809,7 @@
     </w:p>
     <w:tbl>
       <w:tblPr>
-        <w:tblStyle w:val="GridTable4-Accent1"/>
+        <w:tblStyle w:val="Tablaconcuadrcula4-nfasis1"/>
         <w:tblW w:w="0" w:type="auto"/>
         <w:tblLook w:val="04A0" w:firstRow="1" w:lastRow="0" w:firstColumn="1" w:lastColumn="0" w:noHBand="0" w:noVBand="1"/>
       </w:tblPr>
@@ -15924,7 +15940,7 @@
     </w:tbl>
     <w:p>
       <w:pPr>
-        <w:pStyle w:val="Caption"/>
+        <w:pStyle w:val="Descripcin"/>
       </w:pPr>
       <w:bookmarkStart w:id="61" w:name="_Toc242251939"/>
       <w:r>
@@ -15961,7 +15977,7 @@
     </w:p>
     <w:tbl>
       <w:tblPr>
-        <w:tblStyle w:val="GridTable4-Accent1"/>
+        <w:tblStyle w:val="Tablaconcuadrcula4-nfasis1"/>
         <w:tblW w:w="0" w:type="auto"/>
         <w:tblLook w:val="04A0" w:firstRow="1" w:lastRow="0" w:firstColumn="1" w:lastColumn="0" w:noHBand="0" w:noVBand="1"/>
       </w:tblPr>
@@ -16092,7 +16108,7 @@
     </w:tbl>
     <w:p>
       <w:pPr>
-        <w:pStyle w:val="Caption"/>
+        <w:pStyle w:val="Descripcin"/>
       </w:pPr>
       <w:bookmarkStart w:id="62" w:name="_Toc242251940"/>
       <w:r>
@@ -16126,7 +16142,7 @@
     </w:p>
     <w:tbl>
       <w:tblPr>
-        <w:tblStyle w:val="GridTable4-Accent1"/>
+        <w:tblStyle w:val="Tablaconcuadrcula4-nfasis1"/>
         <w:tblW w:w="0" w:type="auto"/>
         <w:tblLook w:val="04A0" w:firstRow="1" w:lastRow="0" w:firstColumn="1" w:lastColumn="0" w:noHBand="0" w:noVBand="1"/>
       </w:tblPr>
@@ -16261,7 +16277,7 @@
     </w:tbl>
     <w:p>
       <w:pPr>
-        <w:pStyle w:val="Caption"/>
+        <w:pStyle w:val="Descripcin"/>
       </w:pPr>
       <w:bookmarkStart w:id="63" w:name="_Toc242251941"/>
       <w:r>
@@ -16298,7 +16314,7 @@
     </w:p>
     <w:tbl>
       <w:tblPr>
-        <w:tblStyle w:val="GridTable4-Accent1"/>
+        <w:tblStyle w:val="Tablaconcuadrcula4-nfasis1"/>
         <w:tblW w:w="0" w:type="auto"/>
         <w:tblLook w:val="04A0" w:firstRow="1" w:lastRow="0" w:firstColumn="1" w:lastColumn="0" w:noHBand="0" w:noVBand="1"/>
       </w:tblPr>
@@ -16430,14 +16446,10 @@
         </w:tc>
       </w:tr>
     </w:tbl>
+    <w:p/>
     <w:p>
       <w:pPr>
-        <w:pStyle w:val="Heading3"/>
-      </w:pPr>
-    </w:p>
-    <w:p>
-      <w:pPr>
-        <w:pStyle w:val="Heading3"/>
+        <w:pStyle w:val="Ttulo3"/>
       </w:pPr>
       <w:bookmarkStart w:id="64" w:name="_Toc242251905"/>
       <w:r>
@@ -16447,7 +16459,7 @@
     </w:p>
     <w:p>
       <w:pPr>
-        <w:pStyle w:val="Caption"/>
+        <w:pStyle w:val="Descripcin"/>
       </w:pPr>
       <w:bookmarkStart w:id="65" w:name="_Toc242251942"/>
       <w:r>
@@ -16481,7 +16493,7 @@
     </w:p>
     <w:tbl>
       <w:tblPr>
-        <w:tblStyle w:val="GridTable4-Accent1"/>
+        <w:tblStyle w:val="Tablaconcuadrcula4-nfasis1"/>
         <w:tblW w:w="0" w:type="auto"/>
         <w:tblLook w:val="04A0" w:firstRow="1" w:lastRow="0" w:firstColumn="1" w:lastColumn="0" w:noHBand="0" w:noVBand="1"/>
       </w:tblPr>
@@ -16659,7 +16671,7 @@
     </w:tbl>
     <w:p>
       <w:pPr>
-        <w:pStyle w:val="Caption"/>
+        <w:pStyle w:val="Descripcin"/>
       </w:pPr>
       <w:bookmarkStart w:id="66" w:name="_Toc242251943"/>
       <w:r>
@@ -16699,7 +16711,7 @@
     </w:p>
     <w:tbl>
       <w:tblPr>
-        <w:tblStyle w:val="GridTable4-Accent1"/>
+        <w:tblStyle w:val="Tablaconcuadrcula4-nfasis1"/>
         <w:tblW w:w="0" w:type="auto"/>
         <w:tblLook w:val="04A0" w:firstRow="1" w:lastRow="0" w:firstColumn="1" w:lastColumn="0" w:noHBand="0" w:noVBand="1"/>
       </w:tblPr>
@@ -16885,7 +16897,7 @@
     </w:tbl>
     <w:p>
       <w:pPr>
-        <w:pStyle w:val="Caption"/>
+        <w:pStyle w:val="Descripcin"/>
       </w:pPr>
       <w:bookmarkStart w:id="67" w:name="_Toc242251944"/>
       <w:r>
@@ -16925,7 +16937,7 @@
     </w:p>
     <w:tbl>
       <w:tblPr>
-        <w:tblStyle w:val="GridTable4-Accent1"/>
+        <w:tblStyle w:val="Tablaconcuadrcula4-nfasis1"/>
         <w:tblW w:w="0" w:type="auto"/>
         <w:tblLook w:val="04A0" w:firstRow="1" w:lastRow="0" w:firstColumn="1" w:lastColumn="0" w:noHBand="0" w:noVBand="1"/>
       </w:tblPr>
@@ -17111,7 +17123,7 @@
     </w:tbl>
     <w:p>
       <w:pPr>
-        <w:pStyle w:val="Caption"/>
+        <w:pStyle w:val="Descripcin"/>
       </w:pPr>
       <w:bookmarkStart w:id="68" w:name="_Toc242251945"/>
       <w:r>
@@ -17151,7 +17163,7 @@
     </w:p>
     <w:tbl>
       <w:tblPr>
-        <w:tblStyle w:val="GridTable4-Accent1"/>
+        <w:tblStyle w:val="Tablaconcuadrcula4-nfasis1"/>
         <w:tblW w:w="0" w:type="auto"/>
         <w:tblLook w:val="04A0" w:firstRow="1" w:lastRow="0" w:firstColumn="1" w:lastColumn="0" w:noHBand="0" w:noVBand="1"/>
       </w:tblPr>
@@ -17337,7 +17349,7 @@
     </w:tbl>
     <w:p>
       <w:pPr>
-        <w:pStyle w:val="Caption"/>
+        <w:pStyle w:val="Descripcin"/>
       </w:pPr>
       <w:bookmarkStart w:id="69" w:name="_Toc242251946"/>
       <w:r>
@@ -17377,7 +17389,7 @@
     </w:p>
     <w:tbl>
       <w:tblPr>
-        <w:tblStyle w:val="GridTable4-Accent1"/>
+        <w:tblStyle w:val="Tablaconcuadrcula4-nfasis1"/>
         <w:tblW w:w="0" w:type="auto"/>
         <w:tblLook w:val="04A0" w:firstRow="1" w:lastRow="0" w:firstColumn="1" w:lastColumn="0" w:noHBand="0" w:noVBand="1"/>
       </w:tblPr>
@@ -17561,24 +17573,10 @@
         </w:tc>
       </w:tr>
     </w:tbl>
+    <w:p/>
     <w:p>
       <w:pPr>
-        <w:pStyle w:val="Heading3"/>
-      </w:pPr>
-    </w:p>
-    <w:p>
-      <w:pPr>
-        <w:pStyle w:val="Heading3"/>
-      </w:pPr>
-    </w:p>
-    <w:p>
-      <w:pPr>
-        <w:pStyle w:val="Heading3"/>
-      </w:pPr>
-    </w:p>
-    <w:p>
-      <w:pPr>
-        <w:pStyle w:val="Heading3"/>
+        <w:pStyle w:val="Ttulo3"/>
       </w:pPr>
       <w:bookmarkStart w:id="70" w:name="_Toc242251906"/>
       <w:r>
@@ -17605,7 +17603,7 @@
     </w:p>
     <w:p>
       <w:pPr>
-        <w:pStyle w:val="Caption"/>
+        <w:pStyle w:val="Descripcin"/>
       </w:pPr>
       <w:bookmarkStart w:id="71" w:name="_Toc242251947"/>
       <w:r>
@@ -17642,7 +17640,7 @@
     </w:p>
     <w:tbl>
       <w:tblPr>
-        <w:tblStyle w:val="GridTable4-Accent1"/>
+        <w:tblStyle w:val="Tablaconcuadrcula4-nfasis1"/>
         <w:tblW w:w="5003" w:type="pct"/>
         <w:tblLook w:val="04A0" w:firstRow="1" w:lastRow="0" w:firstColumn="1" w:lastColumn="0" w:noHBand="0" w:noVBand="1"/>
       </w:tblPr>
@@ -17663,7 +17661,6 @@
           </w:tcPr>
           <w:p>
             <w:r>
-              <w:lastRenderedPageBreak/>
               <w:t>Código</w:t>
             </w:r>
           </w:p>
@@ -17719,6 +17716,7 @@
           </w:tcPr>
           <w:p>
             <w:r>
+              <w:lastRenderedPageBreak/>
               <w:t xml:space="preserve">RF – 01 </w:t>
             </w:r>
           </w:p>
@@ -18289,18 +18287,13 @@
         </w:tc>
       </w:tr>
     </w:tbl>
+    <w:p/>
     <w:p>
       <w:pPr>
-        <w:pStyle w:val="Heading3"/>
-      </w:pPr>
-    </w:p>
-    <w:p>
-      <w:pPr>
-        <w:pStyle w:val="Heading3"/>
+        <w:pStyle w:val="Ttulo3"/>
       </w:pPr>
       <w:bookmarkStart w:id="72" w:name="_Toc242251907"/>
       <w:r>
-        <w:lastRenderedPageBreak/>
         <w:t>8.2.5 Requisitos Funcionales</w:t>
       </w:r>
       <w:bookmarkEnd w:id="72"/>
@@ -18316,12 +18309,16 @@
         <w:t xml:space="preserve"> Monster</w:t>
       </w:r>
       <w:r>
-        <w:t>” se ha identificado los siguientes requerimientos funcionales.</w:t>
+        <w:t xml:space="preserve">” se ha identificado los siguientes requerimientos </w:t>
+      </w:r>
+      <w:r>
+        <w:lastRenderedPageBreak/>
+        <w:t>funcionales.</w:t>
       </w:r>
     </w:p>
     <w:p>
       <w:pPr>
-        <w:pStyle w:val="Caption"/>
+        <w:pStyle w:val="Descripcin"/>
       </w:pPr>
       <w:bookmarkStart w:id="73" w:name="_Toc242251948"/>
       <w:r>
@@ -18358,7 +18355,7 @@
     </w:p>
     <w:tbl>
       <w:tblPr>
-        <w:tblStyle w:val="GridTable4-Accent1"/>
+        <w:tblStyle w:val="Tablaconcuadrcula4-nfasis1"/>
         <w:tblW w:w="9020" w:type="dxa"/>
         <w:tblLook w:val="04A0" w:firstRow="1" w:lastRow="0" w:firstColumn="1" w:lastColumn="0" w:noHBand="0" w:noVBand="1"/>
       </w:tblPr>
@@ -18753,7 +18750,7 @@
     </w:tbl>
     <w:p>
       <w:pPr>
-        <w:pStyle w:val="Caption"/>
+        <w:pStyle w:val="Descripcin"/>
       </w:pPr>
       <w:bookmarkStart w:id="74" w:name="_Toc242251949"/>
       <w:r>
@@ -18793,7 +18790,7 @@
     </w:p>
     <w:tbl>
       <w:tblPr>
-        <w:tblStyle w:val="GridTable4-Accent1"/>
+        <w:tblStyle w:val="Tablaconcuadrcula4-nfasis1"/>
         <w:tblW w:w="9020" w:type="dxa"/>
         <w:tblLook w:val="04A0" w:firstRow="1" w:lastRow="0" w:firstColumn="1" w:lastColumn="0" w:noHBand="0" w:noVBand="1"/>
       </w:tblPr>
@@ -19204,7 +19201,7 @@
     </w:tbl>
     <w:p>
       <w:pPr>
-        <w:pStyle w:val="Caption"/>
+        <w:pStyle w:val="Descripcin"/>
       </w:pPr>
       <w:bookmarkStart w:id="75" w:name="_Toc242251950"/>
       <w:r>
@@ -19244,7 +19241,7 @@
     </w:p>
     <w:tbl>
       <w:tblPr>
-        <w:tblStyle w:val="GridTable4-Accent1"/>
+        <w:tblStyle w:val="Tablaconcuadrcula4-nfasis1"/>
         <w:tblW w:w="9020" w:type="dxa"/>
         <w:tblLook w:val="04A0" w:firstRow="1" w:lastRow="0" w:firstColumn="1" w:lastColumn="0" w:noHBand="0" w:noVBand="1"/>
       </w:tblPr>
@@ -19655,7 +19652,7 @@
     </w:tbl>
     <w:p>
       <w:pPr>
-        <w:pStyle w:val="Caption"/>
+        <w:pStyle w:val="Descripcin"/>
       </w:pPr>
       <w:bookmarkStart w:id="76" w:name="_Toc242251951"/>
       <w:r>
@@ -19695,7 +19692,7 @@
     </w:p>
     <w:tbl>
       <w:tblPr>
-        <w:tblStyle w:val="GridTable4-Accent1"/>
+        <w:tblStyle w:val="Tablaconcuadrcula4-nfasis1"/>
         <w:tblW w:w="9020" w:type="dxa"/>
         <w:tblLook w:val="04A0" w:firstRow="1" w:lastRow="0" w:firstColumn="1" w:lastColumn="0" w:noHBand="0" w:noVBand="1"/>
       </w:tblPr>
@@ -20106,7 +20103,7 @@
     </w:tbl>
     <w:p>
       <w:pPr>
-        <w:pStyle w:val="Caption"/>
+        <w:pStyle w:val="Descripcin"/>
       </w:pPr>
       <w:bookmarkStart w:id="77" w:name="_Toc242251952"/>
       <w:r>
@@ -20146,7 +20143,7 @@
     </w:p>
     <w:tbl>
       <w:tblPr>
-        <w:tblStyle w:val="GridTable4-Accent1"/>
+        <w:tblStyle w:val="Tablaconcuadrcula4-nfasis1"/>
         <w:tblW w:w="9020" w:type="dxa"/>
         <w:tblLook w:val="04A0" w:firstRow="1" w:lastRow="0" w:firstColumn="1" w:lastColumn="0" w:noHBand="0" w:noVBand="1"/>
       </w:tblPr>
@@ -20524,7 +20521,6 @@
                 <w:sz w:val="22"/>
                 <w:szCs w:val="22"/>
               </w:rPr>
-              <w:lastRenderedPageBreak/>
               <w:t>Comentarios</w:t>
             </w:r>
           </w:p>
@@ -20558,7 +20554,7 @@
     </w:tbl>
     <w:p>
       <w:pPr>
-        <w:pStyle w:val="Caption"/>
+        <w:pStyle w:val="Descripcin"/>
       </w:pPr>
       <w:bookmarkStart w:id="78" w:name="_Toc242251953"/>
       <w:r>
@@ -20598,7 +20594,7 @@
     </w:p>
     <w:tbl>
       <w:tblPr>
-        <w:tblStyle w:val="GridTable4-Accent1"/>
+        <w:tblStyle w:val="Tablaconcuadrcula4-nfasis1"/>
         <w:tblW w:w="9020" w:type="dxa"/>
         <w:tblLook w:val="04A0" w:firstRow="1" w:lastRow="0" w:firstColumn="1" w:lastColumn="0" w:noHBand="0" w:noVBand="1"/>
       </w:tblPr>
@@ -20631,6 +20627,7 @@
                 <w:sz w:val="22"/>
                 <w:szCs w:val="22"/>
               </w:rPr>
+              <w:lastRenderedPageBreak/>
               <w:t>RQF-00</w:t>
             </w:r>
             <w:r>
@@ -21009,7 +21006,7 @@
     </w:tbl>
     <w:p>
       <w:pPr>
-        <w:pStyle w:val="Caption"/>
+        <w:pStyle w:val="Descripcin"/>
       </w:pPr>
       <w:bookmarkStart w:id="79" w:name="_Toc242251954"/>
       <w:r>
@@ -21049,7 +21046,7 @@
     </w:p>
     <w:tbl>
       <w:tblPr>
-        <w:tblStyle w:val="GridTable4-Accent1"/>
+        <w:tblStyle w:val="Tablaconcuadrcula4-nfasis1"/>
         <w:tblW w:w="9020" w:type="dxa"/>
         <w:tblLook w:val="04A0" w:firstRow="1" w:lastRow="0" w:firstColumn="1" w:lastColumn="0" w:noHBand="0" w:noVBand="1"/>
       </w:tblPr>
@@ -21452,7 +21449,7 @@
     </w:tbl>
     <w:p>
       <w:pPr>
-        <w:pStyle w:val="Caption"/>
+        <w:pStyle w:val="Descripcin"/>
       </w:pPr>
       <w:bookmarkStart w:id="80" w:name="_Toc242251955"/>
       <w:r>
@@ -21492,7 +21489,7 @@
     </w:p>
     <w:tbl>
       <w:tblPr>
-        <w:tblStyle w:val="GridTable4-Accent1"/>
+        <w:tblStyle w:val="Tablaconcuadrcula4-nfasis1"/>
         <w:tblW w:w="9020" w:type="dxa"/>
         <w:tblLook w:val="04A0" w:firstRow="1" w:lastRow="0" w:firstColumn="1" w:lastColumn="0" w:noHBand="0" w:noVBand="1"/>
       </w:tblPr>
@@ -21903,7 +21900,7 @@
     </w:tbl>
     <w:p>
       <w:pPr>
-        <w:pStyle w:val="Caption"/>
+        <w:pStyle w:val="Descripcin"/>
       </w:pPr>
       <w:bookmarkStart w:id="81" w:name="_Toc242251956"/>
       <w:r>
@@ -21943,7 +21940,7 @@
     </w:p>
     <w:tbl>
       <w:tblPr>
-        <w:tblStyle w:val="GridTable4-Accent1"/>
+        <w:tblStyle w:val="Tablaconcuadrcula4-nfasis1"/>
         <w:tblW w:w="9020" w:type="dxa"/>
         <w:tblLook w:val="04A0" w:firstRow="1" w:lastRow="0" w:firstColumn="1" w:lastColumn="0" w:noHBand="0" w:noVBand="1"/>
       </w:tblPr>
@@ -22362,7 +22359,7 @@
     </w:tbl>
     <w:p>
       <w:pPr>
-        <w:pStyle w:val="Caption"/>
+        <w:pStyle w:val="Descripcin"/>
       </w:pPr>
       <w:bookmarkStart w:id="82" w:name="_Toc242251957"/>
       <w:r>
@@ -22396,7 +22393,7 @@
     </w:p>
     <w:tbl>
       <w:tblPr>
-        <w:tblStyle w:val="GridTable4-Accent1"/>
+        <w:tblStyle w:val="Tablaconcuadrcula4-nfasis1"/>
         <w:tblW w:w="9020" w:type="dxa"/>
         <w:tblLook w:val="04A0" w:firstRow="1" w:lastRow="0" w:firstColumn="1" w:lastColumn="0" w:noHBand="0" w:noVBand="1"/>
       </w:tblPr>
@@ -22675,7 +22672,6 @@
                 <w:sz w:val="22"/>
                 <w:szCs w:val="22"/>
               </w:rPr>
-              <w:lastRenderedPageBreak/>
               <w:t>Estado</w:t>
             </w:r>
           </w:p>
@@ -22814,17 +22810,14 @@
         </w:tc>
       </w:tr>
     </w:tbl>
+    <w:p/>
     <w:p>
       <w:pPr>
-        <w:pStyle w:val="Heading2"/>
-      </w:pPr>
-    </w:p>
-    <w:p>
-      <w:pPr>
-        <w:pStyle w:val="Heading2"/>
+        <w:pStyle w:val="Ttulo2"/>
       </w:pPr>
       <w:bookmarkStart w:id="83" w:name="_Toc242251908"/>
       <w:r>
+        <w:lastRenderedPageBreak/>
         <w:t xml:space="preserve">8.3 </w:t>
       </w:r>
       <w:r>
@@ -22840,7 +22833,7 @@
     </w:p>
     <w:p>
       <w:pPr>
-        <w:pStyle w:val="Heading3"/>
+        <w:pStyle w:val="Ttulo3"/>
       </w:pPr>
       <w:bookmarkStart w:id="84" w:name="_Toc58077507"/>
       <w:bookmarkStart w:id="85" w:name="_Toc242251909"/>
@@ -22866,7 +22859,7 @@
     </w:p>
     <w:p>
       <w:pPr>
-        <w:pStyle w:val="Caption"/>
+        <w:pStyle w:val="Descripcin"/>
       </w:pPr>
       <w:bookmarkStart w:id="86" w:name="_Toc242251958"/>
       <w:r>
@@ -22900,7 +22893,7 @@
     </w:p>
     <w:tbl>
       <w:tblPr>
-        <w:tblStyle w:val="GridTable4-Accent1"/>
+        <w:tblStyle w:val="Tablaconcuadrcula4-nfasis1"/>
         <w:tblW w:w="5000" w:type="pct"/>
         <w:tblLook w:val="04A0" w:firstRow="1" w:lastRow="0" w:firstColumn="1" w:lastColumn="0" w:noHBand="0" w:noVBand="1"/>
       </w:tblPr>
@@ -22919,7 +22912,7 @@
           </w:tcPr>
           <w:p>
             <w:pPr>
-              <w:pStyle w:val="Caption"/>
+              <w:pStyle w:val="Descripcin"/>
               <w:spacing w:before="0" w:after="0"/>
               <w:rPr>
                 <w:rFonts w:ascii="Arial" w:hAnsi="Arial"/>
@@ -22945,7 +22938,7 @@
           </w:tcPr>
           <w:p>
             <w:pPr>
-              <w:pStyle w:val="Caption"/>
+              <w:pStyle w:val="Descripcin"/>
               <w:spacing w:before="0" w:after="0"/>
               <w:cnfStyle w:val="100000000000" w:firstRow="1" w:lastRow="0" w:firstColumn="0" w:lastColumn="0" w:oddVBand="0" w:evenVBand="0" w:oddHBand="0" w:evenHBand="0" w:firstRowFirstColumn="0" w:firstRowLastColumn="0" w:lastRowFirstColumn="0" w:lastRowLastColumn="0"/>
               <w:rPr>
@@ -22978,7 +22971,7 @@
           </w:tcPr>
           <w:p>
             <w:pPr>
-              <w:pStyle w:val="Caption"/>
+              <w:pStyle w:val="Descripcin"/>
               <w:spacing w:before="0" w:after="0"/>
               <w:rPr>
                 <w:rFonts w:ascii="Arial" w:hAnsi="Arial"/>
@@ -23004,7 +22997,7 @@
           </w:tcPr>
           <w:p>
             <w:pPr>
-              <w:pStyle w:val="Caption"/>
+              <w:pStyle w:val="Descripcin"/>
               <w:spacing w:before="0" w:after="0"/>
               <w:cnfStyle w:val="000000100000" w:firstRow="0" w:lastRow="0" w:firstColumn="0" w:lastColumn="0" w:oddVBand="0" w:evenVBand="0" w:oddHBand="1" w:evenHBand="0" w:firstRowFirstColumn="0" w:firstRowLastColumn="0" w:lastRowFirstColumn="0" w:lastRowLastColumn="0"/>
               <w:rPr>
@@ -23031,7 +23024,7 @@
           </w:tcPr>
           <w:p>
             <w:pPr>
-              <w:pStyle w:val="Caption"/>
+              <w:pStyle w:val="Descripcin"/>
               <w:spacing w:before="0" w:after="0"/>
               <w:rPr>
                 <w:rFonts w:ascii="Arial" w:hAnsi="Arial"/>
@@ -23057,7 +23050,7 @@
           </w:tcPr>
           <w:p>
             <w:pPr>
-              <w:pStyle w:val="Caption"/>
+              <w:pStyle w:val="Descripcin"/>
               <w:spacing w:before="0" w:after="0"/>
               <w:cnfStyle w:val="000000000000" w:firstRow="0" w:lastRow="0" w:firstColumn="0" w:lastColumn="0" w:oddVBand="0" w:evenVBand="0" w:oddHBand="0" w:evenHBand="0" w:firstRowFirstColumn="0" w:firstRowLastColumn="0" w:lastRowFirstColumn="0" w:lastRowLastColumn="0"/>
               <w:rPr>
@@ -23095,7 +23088,7 @@
           </w:tcPr>
           <w:p>
             <w:pPr>
-              <w:pStyle w:val="Caption"/>
+              <w:pStyle w:val="Descripcin"/>
               <w:spacing w:before="0" w:after="0"/>
               <w:rPr>
                 <w:rFonts w:ascii="Arial" w:hAnsi="Arial"/>
@@ -23121,7 +23114,7 @@
           </w:tcPr>
           <w:p>
             <w:pPr>
-              <w:pStyle w:val="Caption"/>
+              <w:pStyle w:val="Descripcin"/>
               <w:spacing w:before="0" w:after="0"/>
               <w:cnfStyle w:val="000000100000" w:firstRow="0" w:lastRow="0" w:firstColumn="0" w:lastColumn="0" w:oddVBand="0" w:evenVBand="0" w:oddHBand="1" w:evenHBand="0" w:firstRowFirstColumn="0" w:firstRowLastColumn="0" w:lastRowFirstColumn="0" w:lastRowLastColumn="0"/>
               <w:rPr>
@@ -23151,7 +23144,7 @@
     </w:tbl>
     <w:p>
       <w:pPr>
-        <w:pStyle w:val="Caption"/>
+        <w:pStyle w:val="Descripcin"/>
       </w:pPr>
       <w:bookmarkStart w:id="87" w:name="_Toc242251959"/>
       <w:r>
@@ -23188,7 +23181,7 @@
     </w:p>
     <w:tbl>
       <w:tblPr>
-        <w:tblStyle w:val="GridTable4-Accent1"/>
+        <w:tblStyle w:val="Tablaconcuadrcula4-nfasis1"/>
         <w:tblW w:w="5000" w:type="pct"/>
         <w:tblLook w:val="04A0" w:firstRow="1" w:lastRow="0" w:firstColumn="1" w:lastColumn="0" w:noHBand="0" w:noVBand="1"/>
       </w:tblPr>
@@ -23207,7 +23200,7 @@
           </w:tcPr>
           <w:p>
             <w:pPr>
-              <w:pStyle w:val="Caption"/>
+              <w:pStyle w:val="Descripcin"/>
               <w:spacing w:before="0" w:after="0"/>
               <w:rPr>
                 <w:rFonts w:ascii="Arial" w:hAnsi="Arial"/>
@@ -23241,7 +23234,7 @@
           </w:tcPr>
           <w:p>
             <w:pPr>
-              <w:pStyle w:val="Caption"/>
+              <w:pStyle w:val="Descripcin"/>
               <w:spacing w:before="0" w:after="0"/>
               <w:cnfStyle w:val="100000000000" w:firstRow="1" w:lastRow="0" w:firstColumn="0" w:lastColumn="0" w:oddVBand="0" w:evenVBand="0" w:oddHBand="0" w:evenHBand="0" w:firstRowFirstColumn="0" w:firstRowLastColumn="0" w:lastRowFirstColumn="0" w:lastRowLastColumn="0"/>
               <w:rPr>
@@ -23274,7 +23267,7 @@
           </w:tcPr>
           <w:p>
             <w:pPr>
-              <w:pStyle w:val="Caption"/>
+              <w:pStyle w:val="Descripcin"/>
               <w:spacing w:before="0" w:after="0"/>
               <w:rPr>
                 <w:rFonts w:ascii="Arial" w:hAnsi="Arial"/>
@@ -23300,7 +23293,7 @@
           </w:tcPr>
           <w:p>
             <w:pPr>
-              <w:pStyle w:val="Caption"/>
+              <w:pStyle w:val="Descripcin"/>
               <w:spacing w:before="0" w:after="0"/>
               <w:cnfStyle w:val="000000100000" w:firstRow="0" w:lastRow="0" w:firstColumn="0" w:lastColumn="0" w:oddVBand="0" w:evenVBand="0" w:oddHBand="1" w:evenHBand="0" w:firstRowFirstColumn="0" w:firstRowLastColumn="0" w:lastRowFirstColumn="0" w:lastRowLastColumn="0"/>
               <w:rPr>
@@ -23327,7 +23320,7 @@
           </w:tcPr>
           <w:p>
             <w:pPr>
-              <w:pStyle w:val="Caption"/>
+              <w:pStyle w:val="Descripcin"/>
               <w:spacing w:before="0" w:after="0"/>
               <w:rPr>
                 <w:rFonts w:ascii="Arial" w:hAnsi="Arial"/>
@@ -23353,7 +23346,7 @@
           </w:tcPr>
           <w:p>
             <w:pPr>
-              <w:pStyle w:val="Caption"/>
+              <w:pStyle w:val="Descripcin"/>
               <w:spacing w:before="0" w:after="0"/>
               <w:cnfStyle w:val="000000000000" w:firstRow="0" w:lastRow="0" w:firstColumn="0" w:lastColumn="0" w:oddVBand="0" w:evenVBand="0" w:oddHBand="0" w:evenHBand="0" w:firstRowFirstColumn="0" w:firstRowLastColumn="0" w:lastRowFirstColumn="0" w:lastRowLastColumn="0"/>
               <w:rPr>
@@ -23391,7 +23384,7 @@
           </w:tcPr>
           <w:p>
             <w:pPr>
-              <w:pStyle w:val="Caption"/>
+              <w:pStyle w:val="Descripcin"/>
               <w:spacing w:before="0" w:after="0"/>
               <w:rPr>
                 <w:rFonts w:ascii="Arial" w:hAnsi="Arial"/>
@@ -23417,7 +23410,7 @@
           </w:tcPr>
           <w:p>
             <w:pPr>
-              <w:pStyle w:val="Caption"/>
+              <w:pStyle w:val="Descripcin"/>
               <w:spacing w:before="0" w:after="0"/>
               <w:cnfStyle w:val="000000100000" w:firstRow="0" w:lastRow="0" w:firstColumn="0" w:lastColumn="0" w:oddVBand="0" w:evenVBand="0" w:oddHBand="1" w:evenHBand="0" w:firstRowFirstColumn="0" w:firstRowLastColumn="0" w:lastRowFirstColumn="0" w:lastRowLastColumn="0"/>
               <w:rPr>
@@ -23447,7 +23440,7 @@
     </w:tbl>
     <w:p>
       <w:pPr>
-        <w:pStyle w:val="Caption"/>
+        <w:pStyle w:val="Descripcin"/>
       </w:pPr>
       <w:bookmarkStart w:id="88" w:name="_Toc242251960"/>
       <w:r>
@@ -23484,7 +23477,7 @@
     </w:p>
     <w:tbl>
       <w:tblPr>
-        <w:tblStyle w:val="GridTable4-Accent1"/>
+        <w:tblStyle w:val="Tablaconcuadrcula4-nfasis1"/>
         <w:tblW w:w="5000" w:type="pct"/>
         <w:tblLook w:val="04A0" w:firstRow="1" w:lastRow="0" w:firstColumn="1" w:lastColumn="0" w:noHBand="0" w:noVBand="1"/>
       </w:tblPr>
@@ -23503,7 +23496,7 @@
           </w:tcPr>
           <w:p>
             <w:pPr>
-              <w:pStyle w:val="Caption"/>
+              <w:pStyle w:val="Descripcin"/>
               <w:spacing w:before="0" w:after="0"/>
               <w:rPr>
                 <w:rFonts w:ascii="Arial" w:hAnsi="Arial"/>
@@ -23537,7 +23530,7 @@
           </w:tcPr>
           <w:p>
             <w:pPr>
-              <w:pStyle w:val="Caption"/>
+              <w:pStyle w:val="Descripcin"/>
               <w:spacing w:before="0" w:after="0"/>
               <w:cnfStyle w:val="100000000000" w:firstRow="1" w:lastRow="0" w:firstColumn="0" w:lastColumn="0" w:oddVBand="0" w:evenVBand="0" w:oddHBand="0" w:evenHBand="0" w:firstRowFirstColumn="0" w:firstRowLastColumn="0" w:lastRowFirstColumn="0" w:lastRowLastColumn="0"/>
               <w:rPr>
@@ -23571,7 +23564,7 @@
           </w:tcPr>
           <w:p>
             <w:pPr>
-              <w:pStyle w:val="Caption"/>
+              <w:pStyle w:val="Descripcin"/>
               <w:spacing w:before="0" w:after="0"/>
               <w:rPr>
                 <w:rFonts w:ascii="Arial" w:hAnsi="Arial"/>
@@ -23597,7 +23590,7 @@
           </w:tcPr>
           <w:p>
             <w:pPr>
-              <w:pStyle w:val="Caption"/>
+              <w:pStyle w:val="Descripcin"/>
               <w:spacing w:before="0" w:after="0"/>
               <w:cnfStyle w:val="000000100000" w:firstRow="0" w:lastRow="0" w:firstColumn="0" w:lastColumn="0" w:oddVBand="0" w:evenVBand="0" w:oddHBand="1" w:evenHBand="0" w:firstRowFirstColumn="0" w:firstRowLastColumn="0" w:lastRowFirstColumn="0" w:lastRowLastColumn="0"/>
               <w:rPr>
@@ -23626,7 +23619,7 @@
           </w:tcPr>
           <w:p>
             <w:pPr>
-              <w:pStyle w:val="Caption"/>
+              <w:pStyle w:val="Descripcin"/>
               <w:spacing w:before="0" w:after="0"/>
               <w:rPr>
                 <w:rFonts w:ascii="Arial" w:hAnsi="Arial"/>
@@ -23652,7 +23645,7 @@
           </w:tcPr>
           <w:p>
             <w:pPr>
-              <w:pStyle w:val="Caption"/>
+              <w:pStyle w:val="Descripcin"/>
               <w:spacing w:before="0" w:after="0"/>
               <w:cnfStyle w:val="000000000000" w:firstRow="0" w:lastRow="0" w:firstColumn="0" w:lastColumn="0" w:oddVBand="0" w:evenVBand="0" w:oddHBand="0" w:evenHBand="0" w:firstRowFirstColumn="0" w:firstRowLastColumn="0" w:lastRowFirstColumn="0" w:lastRowLastColumn="0"/>
               <w:rPr>
@@ -23690,7 +23683,7 @@
           </w:tcPr>
           <w:p>
             <w:pPr>
-              <w:pStyle w:val="Caption"/>
+              <w:pStyle w:val="Descripcin"/>
               <w:spacing w:before="0" w:after="0"/>
               <w:rPr>
                 <w:rFonts w:ascii="Arial" w:hAnsi="Arial"/>
@@ -23716,7 +23709,7 @@
           </w:tcPr>
           <w:p>
             <w:pPr>
-              <w:pStyle w:val="Caption"/>
+              <w:pStyle w:val="Descripcin"/>
               <w:spacing w:before="0" w:after="0"/>
               <w:cnfStyle w:val="000000100000" w:firstRow="0" w:lastRow="0" w:firstColumn="0" w:lastColumn="0" w:oddVBand="0" w:evenVBand="0" w:oddHBand="1" w:evenHBand="0" w:firstRowFirstColumn="0" w:firstRowLastColumn="0" w:lastRowFirstColumn="0" w:lastRowLastColumn="0"/>
               <w:rPr>
@@ -23746,7 +23739,7 @@
     </w:tbl>
     <w:p>
       <w:pPr>
-        <w:pStyle w:val="Caption"/>
+        <w:pStyle w:val="Descripcin"/>
       </w:pPr>
       <w:bookmarkStart w:id="89" w:name="_Toc242251961"/>
       <w:r>
@@ -23783,7 +23776,7 @@
     </w:p>
     <w:tbl>
       <w:tblPr>
-        <w:tblStyle w:val="GridTable4-Accent1"/>
+        <w:tblStyle w:val="Tablaconcuadrcula4-nfasis1"/>
         <w:tblW w:w="5000" w:type="pct"/>
         <w:tblLook w:val="04A0" w:firstRow="1" w:lastRow="0" w:firstColumn="1" w:lastColumn="0" w:noHBand="0" w:noVBand="1"/>
       </w:tblPr>
@@ -23802,7 +23795,7 @@
           </w:tcPr>
           <w:p>
             <w:pPr>
-              <w:pStyle w:val="Caption"/>
+              <w:pStyle w:val="Descripcin"/>
               <w:spacing w:before="0" w:after="0"/>
               <w:rPr>
                 <w:rFonts w:ascii="Arial" w:hAnsi="Arial"/>
@@ -23836,7 +23829,7 @@
           </w:tcPr>
           <w:p>
             <w:pPr>
-              <w:pStyle w:val="Caption"/>
+              <w:pStyle w:val="Descripcin"/>
               <w:spacing w:before="0" w:after="0"/>
               <w:cnfStyle w:val="100000000000" w:firstRow="1" w:lastRow="0" w:firstColumn="0" w:lastColumn="0" w:oddVBand="0" w:evenVBand="0" w:oddHBand="0" w:evenHBand="0" w:firstRowFirstColumn="0" w:firstRowLastColumn="0" w:lastRowFirstColumn="0" w:lastRowLastColumn="0"/>
               <w:rPr>
@@ -23869,7 +23862,7 @@
           </w:tcPr>
           <w:p>
             <w:pPr>
-              <w:pStyle w:val="Caption"/>
+              <w:pStyle w:val="Descripcin"/>
               <w:spacing w:before="0" w:after="0"/>
               <w:rPr>
                 <w:rFonts w:ascii="Arial" w:hAnsi="Arial"/>
@@ -23895,7 +23888,7 @@
           </w:tcPr>
           <w:p>
             <w:pPr>
-              <w:pStyle w:val="Caption"/>
+              <w:pStyle w:val="Descripcin"/>
               <w:spacing w:before="0" w:after="0"/>
               <w:cnfStyle w:val="000000100000" w:firstRow="0" w:lastRow="0" w:firstColumn="0" w:lastColumn="0" w:oddVBand="0" w:evenVBand="0" w:oddHBand="1" w:evenHBand="0" w:firstRowFirstColumn="0" w:firstRowLastColumn="0" w:lastRowFirstColumn="0" w:lastRowLastColumn="0"/>
             </w:pPr>
@@ -23919,7 +23912,7 @@
           </w:tcPr>
           <w:p>
             <w:pPr>
-              <w:pStyle w:val="Caption"/>
+              <w:pStyle w:val="Descripcin"/>
               <w:spacing w:before="0" w:after="0"/>
               <w:rPr>
                 <w:rFonts w:ascii="Arial" w:hAnsi="Arial"/>
@@ -23945,7 +23938,7 @@
           </w:tcPr>
           <w:p>
             <w:pPr>
-              <w:pStyle w:val="Caption"/>
+              <w:pStyle w:val="Descripcin"/>
               <w:spacing w:before="0" w:after="0"/>
               <w:cnfStyle w:val="000000000000" w:firstRow="0" w:lastRow="0" w:firstColumn="0" w:lastColumn="0" w:oddVBand="0" w:evenVBand="0" w:oddHBand="0" w:evenHBand="0" w:firstRowFirstColumn="0" w:firstRowLastColumn="0" w:lastRowFirstColumn="0" w:lastRowLastColumn="0"/>
               <w:rPr>
@@ -23983,7 +23976,7 @@
           </w:tcPr>
           <w:p>
             <w:pPr>
-              <w:pStyle w:val="Caption"/>
+              <w:pStyle w:val="Descripcin"/>
               <w:spacing w:before="0" w:after="0"/>
               <w:rPr>
                 <w:rFonts w:ascii="Arial" w:hAnsi="Arial"/>
@@ -24009,7 +24002,7 @@
           </w:tcPr>
           <w:p>
             <w:pPr>
-              <w:pStyle w:val="Caption"/>
+              <w:pStyle w:val="Descripcin"/>
               <w:spacing w:before="0" w:after="0"/>
               <w:cnfStyle w:val="000000100000" w:firstRow="0" w:lastRow="0" w:firstColumn="0" w:lastColumn="0" w:oddVBand="0" w:evenVBand="0" w:oddHBand="1" w:evenHBand="0" w:firstRowFirstColumn="0" w:firstRowLastColumn="0" w:lastRowFirstColumn="0" w:lastRowLastColumn="0"/>
               <w:rPr>
@@ -24039,7 +24032,7 @@
     </w:tbl>
     <w:p>
       <w:pPr>
-        <w:pStyle w:val="Caption"/>
+        <w:pStyle w:val="Descripcin"/>
       </w:pPr>
       <w:bookmarkStart w:id="90" w:name="_Toc242251962"/>
       <w:r>
@@ -24076,7 +24069,7 @@
     </w:p>
     <w:tbl>
       <w:tblPr>
-        <w:tblStyle w:val="GridTable4-Accent1"/>
+        <w:tblStyle w:val="Tablaconcuadrcula4-nfasis1"/>
         <w:tblW w:w="5000" w:type="pct"/>
         <w:tblLook w:val="04A0" w:firstRow="1" w:lastRow="0" w:firstColumn="1" w:lastColumn="0" w:noHBand="0" w:noVBand="1"/>
       </w:tblPr>
@@ -24095,7 +24088,7 @@
           </w:tcPr>
           <w:p>
             <w:pPr>
-              <w:pStyle w:val="Caption"/>
+              <w:pStyle w:val="Descripcin"/>
               <w:spacing w:before="0" w:after="0"/>
               <w:rPr>
                 <w:rFonts w:ascii="Arial" w:hAnsi="Arial"/>
@@ -24129,7 +24122,7 @@
           </w:tcPr>
           <w:p>
             <w:pPr>
-              <w:pStyle w:val="Caption"/>
+              <w:pStyle w:val="Descripcin"/>
               <w:spacing w:before="0" w:after="0"/>
               <w:cnfStyle w:val="100000000000" w:firstRow="1" w:lastRow="0" w:firstColumn="0" w:lastColumn="0" w:oddVBand="0" w:evenVBand="0" w:oddHBand="0" w:evenHBand="0" w:firstRowFirstColumn="0" w:firstRowLastColumn="0" w:lastRowFirstColumn="0" w:lastRowLastColumn="0"/>
               <w:rPr>
@@ -24161,7 +24154,7 @@
           </w:tcPr>
           <w:p>
             <w:pPr>
-              <w:pStyle w:val="Caption"/>
+              <w:pStyle w:val="Descripcin"/>
               <w:spacing w:before="0" w:after="0"/>
               <w:rPr>
                 <w:rFonts w:ascii="Arial" w:hAnsi="Arial"/>
@@ -24187,7 +24180,7 @@
           </w:tcPr>
           <w:p>
             <w:pPr>
-              <w:pStyle w:val="Caption"/>
+              <w:pStyle w:val="Descripcin"/>
               <w:spacing w:before="0" w:after="0"/>
               <w:cnfStyle w:val="000000100000" w:firstRow="0" w:lastRow="0" w:firstColumn="0" w:lastColumn="0" w:oddVBand="0" w:evenVBand="0" w:oddHBand="1" w:evenHBand="0" w:firstRowFirstColumn="0" w:firstRowLastColumn="0" w:lastRowFirstColumn="0" w:lastRowLastColumn="0"/>
             </w:pPr>
@@ -24211,7 +24204,7 @@
           </w:tcPr>
           <w:p>
             <w:pPr>
-              <w:pStyle w:val="Caption"/>
+              <w:pStyle w:val="Descripcin"/>
               <w:spacing w:before="0" w:after="0"/>
               <w:rPr>
                 <w:rFonts w:ascii="Arial" w:hAnsi="Arial"/>
@@ -24237,7 +24230,7 @@
           </w:tcPr>
           <w:p>
             <w:pPr>
-              <w:pStyle w:val="Caption"/>
+              <w:pStyle w:val="Descripcin"/>
               <w:spacing w:before="0" w:after="0"/>
               <w:cnfStyle w:val="000000000000" w:firstRow="0" w:lastRow="0" w:firstColumn="0" w:lastColumn="0" w:oddVBand="0" w:evenVBand="0" w:oddHBand="0" w:evenHBand="0" w:firstRowFirstColumn="0" w:firstRowLastColumn="0" w:lastRowFirstColumn="0" w:lastRowLastColumn="0"/>
               <w:rPr>
@@ -24274,7 +24267,7 @@
           </w:tcPr>
           <w:p>
             <w:pPr>
-              <w:pStyle w:val="Caption"/>
+              <w:pStyle w:val="Descripcin"/>
               <w:spacing w:before="0" w:after="0"/>
               <w:rPr>
                 <w:rFonts w:ascii="Arial" w:hAnsi="Arial"/>
@@ -24300,7 +24293,7 @@
           </w:tcPr>
           <w:p>
             <w:pPr>
-              <w:pStyle w:val="Caption"/>
+              <w:pStyle w:val="Descripcin"/>
               <w:spacing w:before="0" w:after="0"/>
               <w:cnfStyle w:val="000000100000" w:firstRow="0" w:lastRow="0" w:firstColumn="0" w:lastColumn="0" w:oddVBand="0" w:evenVBand="0" w:oddHBand="1" w:evenHBand="0" w:firstRowFirstColumn="0" w:firstRowLastColumn="0" w:lastRowFirstColumn="0" w:lastRowLastColumn="0"/>
               <w:rPr>
@@ -24329,11 +24322,10 @@
     </w:tbl>
     <w:p>
       <w:pPr>
-        <w:pStyle w:val="Caption"/>
+        <w:pStyle w:val="Descripcin"/>
       </w:pPr>
       <w:bookmarkStart w:id="91" w:name="_Toc242251963"/>
       <w:r>
-        <w:lastRenderedPageBreak/>
         <w:t xml:space="preserve">Tabla </w:t>
       </w:r>
       <w:r>
@@ -24367,7 +24359,7 @@
     </w:p>
     <w:tbl>
       <w:tblPr>
-        <w:tblStyle w:val="GridTable4-Accent1"/>
+        <w:tblStyle w:val="Tablaconcuadrcula4-nfasis1"/>
         <w:tblpPr w:leftFromText="141" w:rightFromText="141" w:vertAnchor="text" w:horzAnchor="margin" w:tblpXSpec="center" w:tblpY="128"/>
         <w:tblW w:w="5000" w:type="pct"/>
         <w:tblLook w:val="04A0" w:firstRow="1" w:lastRow="0" w:firstColumn="1" w:lastColumn="0" w:noHBand="0" w:noVBand="1"/>
@@ -24438,7 +24430,7 @@
           </w:tcPr>
           <w:p>
             <w:pPr>
-              <w:pStyle w:val="Caption"/>
+              <w:pStyle w:val="Descripcin"/>
               <w:spacing w:before="0" w:after="0"/>
               <w:rPr>
                 <w:rFonts w:ascii="Arial" w:hAnsi="Arial"/>
@@ -24464,7 +24456,7 @@
           </w:tcPr>
           <w:p>
             <w:pPr>
-              <w:pStyle w:val="Caption"/>
+              <w:pStyle w:val="Descripcin"/>
               <w:spacing w:before="0" w:after="0"/>
               <w:cnfStyle w:val="000000100000" w:firstRow="0" w:lastRow="0" w:firstColumn="0" w:lastColumn="0" w:oddVBand="0" w:evenVBand="0" w:oddHBand="1" w:evenHBand="0" w:firstRowFirstColumn="0" w:firstRowLastColumn="0" w:lastRowFirstColumn="0" w:lastRowLastColumn="0"/>
               <w:rPr>
@@ -24493,7 +24485,7 @@
           </w:tcPr>
           <w:p>
             <w:pPr>
-              <w:pStyle w:val="Caption"/>
+              <w:pStyle w:val="Descripcin"/>
               <w:spacing w:before="0" w:after="0"/>
               <w:rPr>
                 <w:rFonts w:ascii="Arial" w:hAnsi="Arial"/>
@@ -24509,6 +24501,7 @@
                 <w:iCs w:val="0"/>
                 <w:color w:val="365F91" w:themeColor="accent1" w:themeShade="BF"/>
               </w:rPr>
+              <w:lastRenderedPageBreak/>
               <w:t>Importancia</w:t>
             </w:r>
           </w:p>
@@ -24519,7 +24512,7 @@
           </w:tcPr>
           <w:p>
             <w:pPr>
-              <w:pStyle w:val="Caption"/>
+              <w:pStyle w:val="Descripcin"/>
               <w:spacing w:before="0" w:after="0"/>
               <w:cnfStyle w:val="000000000000" w:firstRow="0" w:lastRow="0" w:firstColumn="0" w:lastColumn="0" w:oddVBand="0" w:evenVBand="0" w:oddHBand="0" w:evenHBand="0" w:firstRowFirstColumn="0" w:firstRowLastColumn="0" w:lastRowFirstColumn="0" w:lastRowLastColumn="0"/>
               <w:rPr>
@@ -24556,7 +24549,7 @@
           </w:tcPr>
           <w:p>
             <w:pPr>
-              <w:pStyle w:val="Caption"/>
+              <w:pStyle w:val="Descripcin"/>
               <w:spacing w:before="0" w:after="0"/>
               <w:rPr>
                 <w:rFonts w:ascii="Arial" w:hAnsi="Arial"/>
@@ -24582,7 +24575,7 @@
           </w:tcPr>
           <w:p>
             <w:pPr>
-              <w:pStyle w:val="Caption"/>
+              <w:pStyle w:val="Descripcin"/>
               <w:spacing w:before="0" w:after="0"/>
               <w:cnfStyle w:val="000000100000" w:firstRow="0" w:lastRow="0" w:firstColumn="0" w:lastColumn="0" w:oddVBand="0" w:evenVBand="0" w:oddHBand="1" w:evenHBand="0" w:firstRowFirstColumn="0" w:firstRowLastColumn="0" w:lastRowFirstColumn="0" w:lastRowLastColumn="0"/>
               <w:rPr>
@@ -24611,7 +24604,7 @@
     </w:tbl>
     <w:p>
       <w:pPr>
-        <w:pStyle w:val="Caption"/>
+        <w:pStyle w:val="Descripcin"/>
       </w:pPr>
       <w:bookmarkStart w:id="92" w:name="_Toc242251964"/>
       <w:r>
@@ -24648,7 +24641,7 @@
     </w:p>
     <w:tbl>
       <w:tblPr>
-        <w:tblStyle w:val="GridTable4-Accent1"/>
+        <w:tblStyle w:val="Tablaconcuadrcula4-nfasis1"/>
         <w:tblpPr w:leftFromText="141" w:rightFromText="141" w:vertAnchor="text" w:horzAnchor="margin" w:tblpXSpec="center" w:tblpY="128"/>
         <w:tblW w:w="5000" w:type="pct"/>
         <w:tblLook w:val="04A0" w:firstRow="1" w:lastRow="0" w:firstColumn="1" w:lastColumn="0" w:noHBand="0" w:noVBand="1"/>
@@ -24713,7 +24706,7 @@
           </w:tcPr>
           <w:p>
             <w:pPr>
-              <w:pStyle w:val="Caption"/>
+              <w:pStyle w:val="Descripcin"/>
               <w:spacing w:before="0" w:after="0"/>
               <w:rPr>
                 <w:rFonts w:ascii="Arial" w:hAnsi="Arial"/>
@@ -24739,7 +24732,7 @@
           </w:tcPr>
           <w:p>
             <w:pPr>
-              <w:pStyle w:val="Caption"/>
+              <w:pStyle w:val="Descripcin"/>
               <w:spacing w:before="0" w:after="0"/>
               <w:cnfStyle w:val="000000100000" w:firstRow="0" w:lastRow="0" w:firstColumn="0" w:lastColumn="0" w:oddVBand="0" w:evenVBand="0" w:oddHBand="1" w:evenHBand="0" w:firstRowFirstColumn="0" w:firstRowLastColumn="0" w:lastRowFirstColumn="0" w:lastRowLastColumn="0"/>
               <w:rPr>
@@ -24767,7 +24760,7 @@
           </w:tcPr>
           <w:p>
             <w:pPr>
-              <w:pStyle w:val="Caption"/>
+              <w:pStyle w:val="Descripcin"/>
               <w:spacing w:before="0" w:after="0"/>
               <w:rPr>
                 <w:rFonts w:ascii="Arial" w:hAnsi="Arial"/>
@@ -24793,7 +24786,7 @@
           </w:tcPr>
           <w:p>
             <w:pPr>
-              <w:pStyle w:val="Caption"/>
+              <w:pStyle w:val="Descripcin"/>
               <w:spacing w:before="0" w:after="0"/>
               <w:cnfStyle w:val="000000000000" w:firstRow="0" w:lastRow="0" w:firstColumn="0" w:lastColumn="0" w:oddVBand="0" w:evenVBand="0" w:oddHBand="0" w:evenHBand="0" w:firstRowFirstColumn="0" w:firstRowLastColumn="0" w:lastRowFirstColumn="0" w:lastRowLastColumn="0"/>
               <w:rPr>
@@ -24830,7 +24823,7 @@
           </w:tcPr>
           <w:p>
             <w:pPr>
-              <w:pStyle w:val="Caption"/>
+              <w:pStyle w:val="Descripcin"/>
               <w:spacing w:before="0" w:after="0"/>
               <w:rPr>
                 <w:rFonts w:ascii="Arial" w:hAnsi="Arial"/>
@@ -24856,7 +24849,7 @@
           </w:tcPr>
           <w:p>
             <w:pPr>
-              <w:pStyle w:val="Caption"/>
+              <w:pStyle w:val="Descripcin"/>
               <w:spacing w:before="0" w:after="0"/>
               <w:cnfStyle w:val="000000100000" w:firstRow="0" w:lastRow="0" w:firstColumn="0" w:lastColumn="0" w:oddVBand="0" w:evenVBand="0" w:oddHBand="1" w:evenHBand="0" w:firstRowFirstColumn="0" w:firstRowLastColumn="0" w:lastRowFirstColumn="0" w:lastRowLastColumn="0"/>
               <w:rPr>
@@ -24885,13 +24878,13 @@
     </w:tbl>
     <w:p>
       <w:pPr>
-        <w:pStyle w:val="Caption"/>
+        <w:pStyle w:val="Descripcin"/>
         <w:spacing w:before="0" w:after="0"/>
       </w:pPr>
     </w:p>
     <w:p>
       <w:pPr>
-        <w:pStyle w:val="ListParagraph"/>
+        <w:pStyle w:val="Prrafodelista"/>
         <w:ind w:left="720"/>
         <w:rPr>
           <w:b/>
@@ -24994,7 +24987,7 @@
     </w:p>
     <w:p>
       <w:pPr>
-        <w:pStyle w:val="Heading2"/>
+        <w:pStyle w:val="Ttulo2"/>
       </w:pPr>
       <w:bookmarkStart w:id="93" w:name="_Toc242251910"/>
       <w:r>
@@ -25007,7 +25000,7 @@
     </w:p>
     <w:p>
       <w:pPr>
-        <w:pStyle w:val="Heading3"/>
+        <w:pStyle w:val="Ttulo3"/>
       </w:pPr>
       <w:bookmarkStart w:id="94" w:name="_Toc242251911"/>
       <w:r>
@@ -25051,7 +25044,7 @@
     </w:p>
     <w:p>
       <w:pPr>
-        <w:pStyle w:val="Heading3"/>
+        <w:pStyle w:val="Ttulo3"/>
       </w:pPr>
       <w:bookmarkStart w:id="96" w:name="_2xcytpi" w:colFirst="0" w:colLast="0"/>
       <w:bookmarkStart w:id="97" w:name="_Toc58077511"/>
@@ -25106,13 +25099,12 @@
         </w:rPr>
       </w:pPr>
       <w:r>
-        <w:lastRenderedPageBreak/>
         <w:t>• Sistema operativo Windows 11, Linux o Android.</w:t>
       </w:r>
     </w:p>
     <w:p>
       <w:pPr>
-        <w:pStyle w:val="Heading3"/>
+        <w:pStyle w:val="Ttulo3"/>
       </w:pPr>
       <w:bookmarkStart w:id="99" w:name="_Toc58077512"/>
       <w:bookmarkStart w:id="100" w:name="_Toc242251913"/>
@@ -25130,7 +25122,7 @@
     </w:p>
     <w:p>
       <w:pPr>
-        <w:pStyle w:val="ListParagraph"/>
+        <w:pStyle w:val="Prrafodelista"/>
         <w:numPr>
           <w:ilvl w:val="0"/>
           <w:numId w:val="43"/>
@@ -25158,7 +25150,7 @@
     </w:p>
     <w:p>
       <w:pPr>
-        <w:pStyle w:val="ListParagraph"/>
+        <w:pStyle w:val="Prrafodelista"/>
         <w:numPr>
           <w:ilvl w:val="0"/>
           <w:numId w:val="43"/>
@@ -25172,6 +25164,7 @@
           <w:b/>
           <w:bCs/>
         </w:rPr>
+        <w:lastRenderedPageBreak/>
         <w:t>Portabilidad. -</w:t>
       </w:r>
       <w:r>
@@ -25186,7 +25179,7 @@
     </w:p>
     <w:p>
       <w:pPr>
-        <w:pStyle w:val="ListParagraph"/>
+        <w:pStyle w:val="Prrafodelista"/>
         <w:numPr>
           <w:ilvl w:val="0"/>
           <w:numId w:val="43"/>
@@ -25215,7 +25208,7 @@
     </w:p>
     <w:p>
       <w:pPr>
-        <w:pStyle w:val="ListParagraph"/>
+        <w:pStyle w:val="Prrafodelista"/>
         <w:numPr>
           <w:ilvl w:val="0"/>
           <w:numId w:val="43"/>
@@ -25240,7 +25233,7 @@
     </w:p>
     <w:p>
       <w:pPr>
-        <w:pStyle w:val="Heading1"/>
+        <w:pStyle w:val="Ttulo1"/>
       </w:pPr>
       <w:bookmarkStart w:id="101" w:name="_Toc23846806"/>
       <w:bookmarkStart w:id="102" w:name="_Toc58077513"/>
@@ -25257,7 +25250,7 @@
     </w:p>
     <w:p>
       <w:pPr>
-        <w:pStyle w:val="Heading2"/>
+        <w:pStyle w:val="Ttulo2"/>
       </w:pPr>
       <w:bookmarkStart w:id="104" w:name="_Toc23846807"/>
       <w:bookmarkStart w:id="105" w:name="_Toc58077514"/>
@@ -25271,7 +25264,7 @@
     </w:p>
     <w:p>
       <w:pPr>
-        <w:pStyle w:val="Heading3"/>
+        <w:pStyle w:val="Ttulo3"/>
       </w:pPr>
       <w:bookmarkStart w:id="107" w:name="_Toc58077515"/>
       <w:bookmarkStart w:id="108" w:name="_Toc242251916"/>
@@ -25304,7 +25297,7 @@
     </w:p>
     <w:p>
       <w:pPr>
-        <w:pStyle w:val="ListParagraph"/>
+        <w:pStyle w:val="Prrafodelista"/>
         <w:numPr>
           <w:ilvl w:val="0"/>
           <w:numId w:val="39"/>
@@ -25325,7 +25318,7 @@
     </w:p>
     <w:p>
       <w:pPr>
-        <w:pStyle w:val="ListParagraph"/>
+        <w:pStyle w:val="Prrafodelista"/>
         <w:numPr>
           <w:ilvl w:val="1"/>
           <w:numId w:val="39"/>
@@ -25344,7 +25337,7 @@
     </w:p>
     <w:p>
       <w:pPr>
-        <w:pStyle w:val="ListParagraph"/>
+        <w:pStyle w:val="Prrafodelista"/>
         <w:numPr>
           <w:ilvl w:val="1"/>
           <w:numId w:val="39"/>
@@ -25363,7 +25356,7 @@
     </w:p>
     <w:p>
       <w:pPr>
-        <w:pStyle w:val="ListParagraph"/>
+        <w:pStyle w:val="Prrafodelista"/>
         <w:numPr>
           <w:ilvl w:val="1"/>
           <w:numId w:val="39"/>
@@ -25382,7 +25375,7 @@
     </w:p>
     <w:p>
       <w:pPr>
-        <w:pStyle w:val="ListParagraph"/>
+        <w:pStyle w:val="Prrafodelista"/>
         <w:numPr>
           <w:ilvl w:val="1"/>
           <w:numId w:val="39"/>
@@ -25401,7 +25394,7 @@
     </w:p>
     <w:p>
       <w:pPr>
-        <w:pStyle w:val="ListParagraph"/>
+        <w:pStyle w:val="Prrafodelista"/>
         <w:numPr>
           <w:ilvl w:val="0"/>
           <w:numId w:val="39"/>
@@ -25422,7 +25415,7 @@
     </w:p>
     <w:p>
       <w:pPr>
-        <w:pStyle w:val="ListParagraph"/>
+        <w:pStyle w:val="Prrafodelista"/>
         <w:numPr>
           <w:ilvl w:val="1"/>
           <w:numId w:val="39"/>
@@ -25453,7 +25446,7 @@
     </w:p>
     <w:p>
       <w:pPr>
-        <w:pStyle w:val="Heading3"/>
+        <w:pStyle w:val="Ttulo3"/>
       </w:pPr>
       <w:bookmarkStart w:id="110" w:name="_Toc242251917"/>
       <w:r>
@@ -25526,7 +25519,7 @@
     </w:p>
     <w:p>
       <w:pPr>
-        <w:pStyle w:val="Heading3"/>
+        <w:pStyle w:val="Ttulo3"/>
       </w:pPr>
       <w:bookmarkStart w:id="111" w:name="_Toc58077517"/>
       <w:bookmarkStart w:id="112" w:name="_Toc242251918"/>
@@ -25538,7 +25531,7 @@
     </w:p>
     <w:p>
       <w:pPr>
-        <w:pStyle w:val="ListParagraph"/>
+        <w:pStyle w:val="Prrafodelista"/>
         <w:numPr>
           <w:ilvl w:val="0"/>
           <w:numId w:val="31"/>
@@ -25550,7 +25543,7 @@
     </w:p>
     <w:p>
       <w:pPr>
-        <w:pStyle w:val="ListParagraph"/>
+        <w:pStyle w:val="Prrafodelista"/>
         <w:numPr>
           <w:ilvl w:val="0"/>
           <w:numId w:val="31"/>
@@ -25562,7 +25555,7 @@
     </w:p>
     <w:p>
       <w:pPr>
-        <w:pStyle w:val="Heading3"/>
+        <w:pStyle w:val="Ttulo3"/>
       </w:pPr>
       <w:bookmarkStart w:id="113" w:name="_Toc58077518"/>
       <w:bookmarkStart w:id="114" w:name="_Toc242251919"/>
@@ -25602,18 +25595,17 @@
     <w:p/>
     <w:p>
       <w:pPr>
-        <w:pStyle w:val="TOCHeading"/>
+        <w:pStyle w:val="TtuloTDC"/>
       </w:pPr>
       <w:bookmarkStart w:id="116" w:name="_Toc58077520"/>
       <w:r>
-        <w:lastRenderedPageBreak/>
         <w:t>RECOMENDACIONES</w:t>
       </w:r>
       <w:bookmarkEnd w:id="116"/>
     </w:p>
     <w:p>
       <w:pPr>
-        <w:pStyle w:val="ListParagraph"/>
+        <w:pStyle w:val="Prrafodelista"/>
         <w:numPr>
           <w:ilvl w:val="0"/>
           <w:numId w:val="33"/>
@@ -25625,13 +25617,14 @@
     </w:p>
     <w:p>
       <w:pPr>
-        <w:pStyle w:val="ListParagraph"/>
+        <w:pStyle w:val="Prrafodelista"/>
         <w:numPr>
           <w:ilvl w:val="0"/>
           <w:numId w:val="33"/>
         </w:numPr>
       </w:pPr>
       <w:r>
+        <w:lastRenderedPageBreak/>
         <w:t>Controlar el versionamiento del archivo WSDL: cualquier cambio en los parámetros del servidor exige actualizar el código de los cuatro clientes para evitar fallos de comunicación.</w:t>
       </w:r>
       <w:r>
@@ -25640,7 +25633,7 @@
     </w:p>
     <w:p>
       <w:pPr>
-        <w:pStyle w:val="TOCHeading"/>
+        <w:pStyle w:val="TtuloTDC"/>
       </w:pPr>
       <w:bookmarkStart w:id="117" w:name="_Toc58077521"/>
       <w:r>
@@ -25650,7 +25643,7 @@
     </w:p>
     <w:p>
       <w:pPr>
-        <w:pStyle w:val="ListParagraph"/>
+        <w:pStyle w:val="Prrafodelista"/>
         <w:numPr>
           <w:ilvl w:val="0"/>
           <w:numId w:val="32"/>
@@ -25662,7 +25655,7 @@
     </w:p>
     <w:p>
       <w:pPr>
-        <w:pStyle w:val="ListParagraph"/>
+        <w:pStyle w:val="Prrafodelista"/>
         <w:numPr>
           <w:ilvl w:val="0"/>
           <w:numId w:val="32"/>
@@ -25674,7 +25667,7 @@
     </w:p>
     <w:p>
       <w:pPr>
-        <w:pStyle w:val="ListParagraph"/>
+        <w:pStyle w:val="Prrafodelista"/>
         <w:numPr>
           <w:ilvl w:val="0"/>
           <w:numId w:val="32"/>
@@ -25688,7 +25681,7 @@
     <w:bookmarkEnd w:id="118"/>
     <w:p>
       <w:pPr>
-        <w:pStyle w:val="TOCHeading"/>
+        <w:pStyle w:val="TtuloTDC"/>
         <w:rPr>
           <w:rFonts w:cstheme="minorHAnsi"/>
         </w:rPr>
@@ -25713,7 +25706,7 @@
 </file>
 
 <file path=word/endnotes.xml><?xml version="1.0" encoding="utf-8"?>
-<w:endnotes xmlns:wpc="http://schemas.microsoft.com/office/word/2010/wordprocessingCanvas" xmlns:cx="http://schemas.microsoft.com/office/drawing/2014/chartex" xmlns:cx1="http://schemas.microsoft.com/office/drawing/2015/9/8/chartex" xmlns:cx2="http://schemas.microsoft.com/office/drawing/2015/10/21/chartex" xmlns:cx3="http://schemas.microsoft.com/office/drawing/2016/5/9/chartex" xmlns:cx4="http://schemas.microsoft.com/office/drawing/2016/5/10/chartex" xmlns:cx5="http://schemas.microsoft.com/office/drawing/2016/5/11/chartex" xmlns:cx6="http://schemas.microsoft.com/office/drawing/2016/5/12/chartex" xmlns:cx7="http://schemas.microsoft.com/office/drawing/2016/5/13/chartex" xmlns:cx8="http://schemas.microsoft.com/office/drawing/2016/5/14/chartex" xmlns:mc="http://schemas.openxmlformats.org/markup-compatibility/2006" xmlns:aink="http://schemas.microsoft.com/office/drawing/2016/ink" xmlns:am3d="http://schemas.microsoft.com/office/drawing/2017/model3d" xmlns:o="urn:schemas-microsoft-com:office:office" xmlns:oel="http://schemas.microsoft.com/office/2019/extlst" xmlns:r="http://schemas.openxmlformats.org/officeDocument/2006/relationships" xmlns:m="http://schemas.openxmlformats.org/officeDocument/2006/math" xmlns:v="urn:schemas-microsoft-com:vml" xmlns:wp14="http://schemas.microsoft.com/office/word/2010/wordprocessingDrawing" xmlns:wp="http://schemas.openxmlformats.org/drawingml/2006/wordprocessingDrawing" xmlns:w10="urn:schemas-microsoft-com:office:word" xmlns:w="http://schemas.openxmlformats.org/wordprocessingml/2006/main" xmlns:w14="http://schemas.microsoft.com/office/word/2010/wordml" xmlns:w15="http://schemas.microsoft.com/office/word/2012/wordml" xmlns:w16cex="http://schemas.microsoft.com/office/word/2018/wordml/cex" xmlns:w16cid="http://schemas.microsoft.com/office/word/2016/wordml/cid" xmlns:w16="http://schemas.microsoft.com/office/word/2018/wordml" xmlns:w16du="http://schemas.microsoft.com/office/word/2023/wordml/word16du" xmlns:w16sdtdh="http://schemas.microsoft.com/office/word/2020/wordml/sdtdatahash" xmlns:w16sdtfl="http://schemas.microsoft.com/office/word/2024/wordml/sdtformatlock" xmlns:w16se="http://schemas.microsoft.com/office/word/2015/wordml/symex" xmlns:wpg="http://schemas.microsoft.com/office/word/2010/wordprocessingGroup" xmlns:wpi="http://schemas.microsoft.com/office/word/2010/wordprocessingInk" xmlns:wne="http://schemas.microsoft.com/office/word/2006/wordml" xmlns:wps="http://schemas.microsoft.com/office/word/2010/wordprocessingShape" mc:Ignorable="w14 w15 w16se w16cid w16 w16cex w16sdtdh w16sdtfl w16du wp14">
+<w:endnotes xmlns:wpc="http://schemas.microsoft.com/office/word/2010/wordprocessingCanvas" xmlns:cx="http://schemas.microsoft.com/office/drawing/2014/chartex" xmlns:cx1="http://schemas.microsoft.com/office/drawing/2015/9/8/chartex" xmlns:cx2="http://schemas.microsoft.com/office/drawing/2015/10/21/chartex" xmlns:cx3="http://schemas.microsoft.com/office/drawing/2016/5/9/chartex" xmlns:cx4="http://schemas.microsoft.com/office/drawing/2016/5/10/chartex" xmlns:cx5="http://schemas.microsoft.com/office/drawing/2016/5/11/chartex" xmlns:cx6="http://schemas.microsoft.com/office/drawing/2016/5/12/chartex" xmlns:cx7="http://schemas.microsoft.com/office/drawing/2016/5/13/chartex" xmlns:cx8="http://schemas.microsoft.com/office/drawing/2016/5/14/chartex" xmlns:mc="http://schemas.openxmlformats.org/markup-compatibility/2006" xmlns:aink="http://schemas.microsoft.com/office/drawing/2016/ink" xmlns:am3d="http://schemas.microsoft.com/office/drawing/2017/model3d" xmlns:o="urn:schemas-microsoft-com:office:office" xmlns:r="http://schemas.openxmlformats.org/officeDocument/2006/relationships" xmlns:m="http://schemas.openxmlformats.org/officeDocument/2006/math" xmlns:v="urn:schemas-microsoft-com:vml" xmlns:wp14="http://schemas.microsoft.com/office/word/2010/wordprocessingDrawing" xmlns:wp="http://schemas.openxmlformats.org/drawingml/2006/wordprocessingDrawing" xmlns:w10="urn:schemas-microsoft-com:office:word" xmlns:w="http://schemas.openxmlformats.org/wordprocessingml/2006/main" xmlns:w14="http://schemas.microsoft.com/office/word/2010/wordml" xmlns:w15="http://schemas.microsoft.com/office/word/2012/wordml" xmlns:w16cex="http://schemas.microsoft.com/office/word/2018/wordml/cex" xmlns:w16cid="http://schemas.microsoft.com/office/word/2016/wordml/cid" xmlns:w16="http://schemas.microsoft.com/office/word/2018/wordml" xmlns:w16sdtdh="http://schemas.microsoft.com/office/word/2020/wordml/sdtdatahash" xmlns:w16se="http://schemas.microsoft.com/office/word/2015/wordml/symex" xmlns:wpg="http://schemas.microsoft.com/office/word/2010/wordprocessingGroup" xmlns:wpi="http://schemas.microsoft.com/office/word/2010/wordprocessingInk" xmlns:wne="http://schemas.microsoft.com/office/word/2006/wordml" xmlns:wps="http://schemas.microsoft.com/office/word/2010/wordprocessingShape" mc:Ignorable="w14 w15 w16se w16cid w16 w16cex w16sdtdh wp14">
   <w:endnote w:type="separator" w:id="-1">
     <w:p>
       <w:r>
@@ -25739,7 +25732,7 @@
 </file>
 
 <file path=word/footer1.xml><?xml version="1.0" encoding="utf-8"?>
-<w:ftr xmlns:wpc="http://schemas.microsoft.com/office/word/2010/wordprocessingCanvas" xmlns:cx="http://schemas.microsoft.com/office/drawing/2014/chartex" xmlns:cx1="http://schemas.microsoft.com/office/drawing/2015/9/8/chartex" xmlns:cx2="http://schemas.microsoft.com/office/drawing/2015/10/21/chartex" xmlns:cx3="http://schemas.microsoft.com/office/drawing/2016/5/9/chartex" xmlns:cx4="http://schemas.microsoft.com/office/drawing/2016/5/10/chartex" xmlns:cx5="http://schemas.microsoft.com/office/drawing/2016/5/11/chartex" xmlns:cx6="http://schemas.microsoft.com/office/drawing/2016/5/12/chartex" xmlns:cx7="http://schemas.microsoft.com/office/drawing/2016/5/13/chartex" xmlns:cx8="http://schemas.microsoft.com/office/drawing/2016/5/14/chartex" xmlns:mc="http://schemas.openxmlformats.org/markup-compatibility/2006" xmlns:aink="http://schemas.microsoft.com/office/drawing/2016/ink" xmlns:am3d="http://schemas.microsoft.com/office/drawing/2017/model3d" xmlns:o="urn:schemas-microsoft-com:office:office" xmlns:oel="http://schemas.microsoft.com/office/2019/extlst" xmlns:r="http://schemas.openxmlformats.org/officeDocument/2006/relationships" xmlns:m="http://schemas.openxmlformats.org/officeDocument/2006/math" xmlns:v="urn:schemas-microsoft-com:vml" xmlns:wp14="http://schemas.microsoft.com/office/word/2010/wordprocessingDrawing" xmlns:wp="http://schemas.openxmlformats.org/drawingml/2006/wordprocessingDrawing" xmlns:w10="urn:schemas-microsoft-com:office:word" xmlns:w="http://schemas.openxmlformats.org/wordprocessingml/2006/main" xmlns:w14="http://schemas.microsoft.com/office/word/2010/wordml" xmlns:w15="http://schemas.microsoft.com/office/word/2012/wordml" xmlns:w16cex="http://schemas.microsoft.com/office/word/2018/wordml/cex" xmlns:w16cid="http://schemas.microsoft.com/office/word/2016/wordml/cid" xmlns:w16="http://schemas.microsoft.com/office/word/2018/wordml" xmlns:w16du="http://schemas.microsoft.com/office/word/2023/wordml/word16du" xmlns:w16sdtdh="http://schemas.microsoft.com/office/word/2020/wordml/sdtdatahash" xmlns:w16sdtfl="http://schemas.microsoft.com/office/word/2024/wordml/sdtformatlock" xmlns:w16se="http://schemas.microsoft.com/office/word/2015/wordml/symex" xmlns:wpg="http://schemas.microsoft.com/office/word/2010/wordprocessingGroup" xmlns:wpi="http://schemas.microsoft.com/office/word/2010/wordprocessingInk" xmlns:wne="http://schemas.microsoft.com/office/word/2006/wordml" xmlns:wps="http://schemas.microsoft.com/office/word/2010/wordprocessingShape" mc:Ignorable="w14 w15 w16se w16cid w16 w16cex w16sdtdh w16sdtfl w16du wp14">
+<w:ftr xmlns:wpc="http://schemas.microsoft.com/office/word/2010/wordprocessingCanvas" xmlns:cx="http://schemas.microsoft.com/office/drawing/2014/chartex" xmlns:cx1="http://schemas.microsoft.com/office/drawing/2015/9/8/chartex" xmlns:cx2="http://schemas.microsoft.com/office/drawing/2015/10/21/chartex" xmlns:cx3="http://schemas.microsoft.com/office/drawing/2016/5/9/chartex" xmlns:cx4="http://schemas.microsoft.com/office/drawing/2016/5/10/chartex" xmlns:cx5="http://schemas.microsoft.com/office/drawing/2016/5/11/chartex" xmlns:cx6="http://schemas.microsoft.com/office/drawing/2016/5/12/chartex" xmlns:cx7="http://schemas.microsoft.com/office/drawing/2016/5/13/chartex" xmlns:cx8="http://schemas.microsoft.com/office/drawing/2016/5/14/chartex" xmlns:mc="http://schemas.openxmlformats.org/markup-compatibility/2006" xmlns:aink="http://schemas.microsoft.com/office/drawing/2016/ink" xmlns:am3d="http://schemas.microsoft.com/office/drawing/2017/model3d" xmlns:o="urn:schemas-microsoft-com:office:office" xmlns:r="http://schemas.openxmlformats.org/officeDocument/2006/relationships" xmlns:m="http://schemas.openxmlformats.org/officeDocument/2006/math" xmlns:v="urn:schemas-microsoft-com:vml" xmlns:wp14="http://schemas.microsoft.com/office/word/2010/wordprocessingDrawing" xmlns:wp="http://schemas.openxmlformats.org/drawingml/2006/wordprocessingDrawing" xmlns:w10="urn:schemas-microsoft-com:office:word" xmlns:w="http://schemas.openxmlformats.org/wordprocessingml/2006/main" xmlns:w14="http://schemas.microsoft.com/office/word/2010/wordml" xmlns:w15="http://schemas.microsoft.com/office/word/2012/wordml" xmlns:w16cex="http://schemas.microsoft.com/office/word/2018/wordml/cex" xmlns:w16cid="http://schemas.microsoft.com/office/word/2016/wordml/cid" xmlns:w16="http://schemas.microsoft.com/office/word/2018/wordml" xmlns:w16sdtdh="http://schemas.microsoft.com/office/word/2020/wordml/sdtdatahash" xmlns:w16se="http://schemas.microsoft.com/office/word/2015/wordml/symex" xmlns:wpg="http://schemas.microsoft.com/office/word/2010/wordprocessingGroup" xmlns:wpi="http://schemas.microsoft.com/office/word/2010/wordprocessingInk" xmlns:wne="http://schemas.microsoft.com/office/word/2006/wordml" xmlns:wps="http://schemas.microsoft.com/office/word/2010/wordprocessingShape" mc:Ignorable="w14 w15 w16se w16cid w16 w16cex w16sdtdh wp14">
   <w:sdt>
     <w:sdtPr>
       <w:id w:val="910883225"/>
@@ -25748,10 +25741,11 @@
         <w:docPartUnique/>
       </w:docPartObj>
     </w:sdtPr>
+    <w:sdtEndPr/>
     <w:sdtContent>
       <w:p>
         <w:pPr>
-          <w:pStyle w:val="Footer"/>
+          <w:pStyle w:val="Piedepgina"/>
           <w:jc w:val="right"/>
         </w:pPr>
         <w:r>
@@ -25777,24 +25771,24 @@
   </w:sdt>
   <w:p>
     <w:pPr>
-      <w:pStyle w:val="Footer"/>
+      <w:pStyle w:val="Piedepgina"/>
     </w:pPr>
   </w:p>
 </w:ftr>
 </file>
 
 <file path=word/footer2.xml><?xml version="1.0" encoding="utf-8"?>
-<w:ftr xmlns:wpc="http://schemas.microsoft.com/office/word/2010/wordprocessingCanvas" xmlns:cx="http://schemas.microsoft.com/office/drawing/2014/chartex" xmlns:cx1="http://schemas.microsoft.com/office/drawing/2015/9/8/chartex" xmlns:cx2="http://schemas.microsoft.com/office/drawing/2015/10/21/chartex" xmlns:cx3="http://schemas.microsoft.com/office/drawing/2016/5/9/chartex" xmlns:cx4="http://schemas.microsoft.com/office/drawing/2016/5/10/chartex" xmlns:cx5="http://schemas.microsoft.com/office/drawing/2016/5/11/chartex" xmlns:cx6="http://schemas.microsoft.com/office/drawing/2016/5/12/chartex" xmlns:cx7="http://schemas.microsoft.com/office/drawing/2016/5/13/chartex" xmlns:cx8="http://schemas.microsoft.com/office/drawing/2016/5/14/chartex" xmlns:mc="http://schemas.openxmlformats.org/markup-compatibility/2006" xmlns:aink="http://schemas.microsoft.com/office/drawing/2016/ink" xmlns:am3d="http://schemas.microsoft.com/office/drawing/2017/model3d" xmlns:o="urn:schemas-microsoft-com:office:office" xmlns:oel="http://schemas.microsoft.com/office/2019/extlst" xmlns:r="http://schemas.openxmlformats.org/officeDocument/2006/relationships" xmlns:m="http://schemas.openxmlformats.org/officeDocument/2006/math" xmlns:v="urn:schemas-microsoft-com:vml" xmlns:wp14="http://schemas.microsoft.com/office/word/2010/wordprocessingDrawing" xmlns:wp="http://schemas.openxmlformats.org/drawingml/2006/wordprocessingDrawing" xmlns:w10="urn:schemas-microsoft-com:office:word" xmlns:w="http://schemas.openxmlformats.org/wordprocessingml/2006/main" xmlns:w14="http://schemas.microsoft.com/office/word/2010/wordml" xmlns:w15="http://schemas.microsoft.com/office/word/2012/wordml" xmlns:w16cex="http://schemas.microsoft.com/office/word/2018/wordml/cex" xmlns:w16cid="http://schemas.microsoft.com/office/word/2016/wordml/cid" xmlns:w16="http://schemas.microsoft.com/office/word/2018/wordml" xmlns:w16du="http://schemas.microsoft.com/office/word/2023/wordml/word16du" xmlns:w16sdtdh="http://schemas.microsoft.com/office/word/2020/wordml/sdtdatahash" xmlns:w16sdtfl="http://schemas.microsoft.com/office/word/2024/wordml/sdtformatlock" xmlns:w16se="http://schemas.microsoft.com/office/word/2015/wordml/symex" xmlns:wpg="http://schemas.microsoft.com/office/word/2010/wordprocessingGroup" xmlns:wpi="http://schemas.microsoft.com/office/word/2010/wordprocessingInk" xmlns:wne="http://schemas.microsoft.com/office/word/2006/wordml" xmlns:wps="http://schemas.microsoft.com/office/word/2010/wordprocessingShape" mc:Ignorable="w14 w15 w16se w16cid w16 w16cex w16sdtdh w16sdtfl w16du wp14">
+<w:ftr xmlns:wpc="http://schemas.microsoft.com/office/word/2010/wordprocessingCanvas" xmlns:cx="http://schemas.microsoft.com/office/drawing/2014/chartex" xmlns:cx1="http://schemas.microsoft.com/office/drawing/2015/9/8/chartex" xmlns:cx2="http://schemas.microsoft.com/office/drawing/2015/10/21/chartex" xmlns:cx3="http://schemas.microsoft.com/office/drawing/2016/5/9/chartex" xmlns:cx4="http://schemas.microsoft.com/office/drawing/2016/5/10/chartex" xmlns:cx5="http://schemas.microsoft.com/office/drawing/2016/5/11/chartex" xmlns:cx6="http://schemas.microsoft.com/office/drawing/2016/5/12/chartex" xmlns:cx7="http://schemas.microsoft.com/office/drawing/2016/5/13/chartex" xmlns:cx8="http://schemas.microsoft.com/office/drawing/2016/5/14/chartex" xmlns:mc="http://schemas.openxmlformats.org/markup-compatibility/2006" xmlns:aink="http://schemas.microsoft.com/office/drawing/2016/ink" xmlns:am3d="http://schemas.microsoft.com/office/drawing/2017/model3d" xmlns:o="urn:schemas-microsoft-com:office:office" xmlns:r="http://schemas.openxmlformats.org/officeDocument/2006/relationships" xmlns:m="http://schemas.openxmlformats.org/officeDocument/2006/math" xmlns:v="urn:schemas-microsoft-com:vml" xmlns:wp14="http://schemas.microsoft.com/office/word/2010/wordprocessingDrawing" xmlns:wp="http://schemas.openxmlformats.org/drawingml/2006/wordprocessingDrawing" xmlns:w10="urn:schemas-microsoft-com:office:word" xmlns:w="http://schemas.openxmlformats.org/wordprocessingml/2006/main" xmlns:w14="http://schemas.microsoft.com/office/word/2010/wordml" xmlns:w15="http://schemas.microsoft.com/office/word/2012/wordml" xmlns:w16cex="http://schemas.microsoft.com/office/word/2018/wordml/cex" xmlns:w16cid="http://schemas.microsoft.com/office/word/2016/wordml/cid" xmlns:w16="http://schemas.microsoft.com/office/word/2018/wordml" xmlns:w16sdtdh="http://schemas.microsoft.com/office/word/2020/wordml/sdtdatahash" xmlns:w16se="http://schemas.microsoft.com/office/word/2015/wordml/symex" xmlns:wpg="http://schemas.microsoft.com/office/word/2010/wordprocessingGroup" xmlns:wpi="http://schemas.microsoft.com/office/word/2010/wordprocessingInk" xmlns:wne="http://schemas.microsoft.com/office/word/2006/wordml" xmlns:wps="http://schemas.microsoft.com/office/word/2010/wordprocessingShape" mc:Ignorable="w14 w15 w16se w16cid w16 w16cex w16sdtdh wp14">
   <w:p>
     <w:pPr>
-      <w:pStyle w:val="Footer"/>
+      <w:pStyle w:val="Piedepgina"/>
     </w:pPr>
   </w:p>
 </w:ftr>
 </file>
 
 <file path=word/footnotes.xml><?xml version="1.0" encoding="utf-8"?>
-<w:footnotes xmlns:wpc="http://schemas.microsoft.com/office/word/2010/wordprocessingCanvas" xmlns:cx="http://schemas.microsoft.com/office/drawing/2014/chartex" xmlns:cx1="http://schemas.microsoft.com/office/drawing/2015/9/8/chartex" xmlns:cx2="http://schemas.microsoft.com/office/drawing/2015/10/21/chartex" xmlns:cx3="http://schemas.microsoft.com/office/drawing/2016/5/9/chartex" xmlns:cx4="http://schemas.microsoft.com/office/drawing/2016/5/10/chartex" xmlns:cx5="http://schemas.microsoft.com/office/drawing/2016/5/11/chartex" xmlns:cx6="http://schemas.microsoft.com/office/drawing/2016/5/12/chartex" xmlns:cx7="http://schemas.microsoft.com/office/drawing/2016/5/13/chartex" xmlns:cx8="http://schemas.microsoft.com/office/drawing/2016/5/14/chartex" xmlns:mc="http://schemas.openxmlformats.org/markup-compatibility/2006" xmlns:aink="http://schemas.microsoft.com/office/drawing/2016/ink" xmlns:am3d="http://schemas.microsoft.com/office/drawing/2017/model3d" xmlns:o="urn:schemas-microsoft-com:office:office" xmlns:oel="http://schemas.microsoft.com/office/2019/extlst" xmlns:r="http://schemas.openxmlformats.org/officeDocument/2006/relationships" xmlns:m="http://schemas.openxmlformats.org/officeDocument/2006/math" xmlns:v="urn:schemas-microsoft-com:vml" xmlns:wp14="http://schemas.microsoft.com/office/word/2010/wordprocessingDrawing" xmlns:wp="http://schemas.openxmlformats.org/drawingml/2006/wordprocessingDrawing" xmlns:w10="urn:schemas-microsoft-com:office:word" xmlns:w="http://schemas.openxmlformats.org/wordprocessingml/2006/main" xmlns:w14="http://schemas.microsoft.com/office/word/2010/wordml" xmlns:w15="http://schemas.microsoft.com/office/word/2012/wordml" xmlns:w16cex="http://schemas.microsoft.com/office/word/2018/wordml/cex" xmlns:w16cid="http://schemas.microsoft.com/office/word/2016/wordml/cid" xmlns:w16="http://schemas.microsoft.com/office/word/2018/wordml" xmlns:w16du="http://schemas.microsoft.com/office/word/2023/wordml/word16du" xmlns:w16sdtdh="http://schemas.microsoft.com/office/word/2020/wordml/sdtdatahash" xmlns:w16sdtfl="http://schemas.microsoft.com/office/word/2024/wordml/sdtformatlock" xmlns:w16se="http://schemas.microsoft.com/office/word/2015/wordml/symex" xmlns:wpg="http://schemas.microsoft.com/office/word/2010/wordprocessingGroup" xmlns:wpi="http://schemas.microsoft.com/office/word/2010/wordprocessingInk" xmlns:wne="http://schemas.microsoft.com/office/word/2006/wordml" xmlns:wps="http://schemas.microsoft.com/office/word/2010/wordprocessingShape" mc:Ignorable="w14 w15 w16se w16cid w16 w16cex w16sdtdh w16sdtfl w16du wp14">
+<w:footnotes xmlns:wpc="http://schemas.microsoft.com/office/word/2010/wordprocessingCanvas" xmlns:cx="http://schemas.microsoft.com/office/drawing/2014/chartex" xmlns:cx1="http://schemas.microsoft.com/office/drawing/2015/9/8/chartex" xmlns:cx2="http://schemas.microsoft.com/office/drawing/2015/10/21/chartex" xmlns:cx3="http://schemas.microsoft.com/office/drawing/2016/5/9/chartex" xmlns:cx4="http://schemas.microsoft.com/office/drawing/2016/5/10/chartex" xmlns:cx5="http://schemas.microsoft.com/office/drawing/2016/5/11/chartex" xmlns:cx6="http://schemas.microsoft.com/office/drawing/2016/5/12/chartex" xmlns:cx7="http://schemas.microsoft.com/office/drawing/2016/5/13/chartex" xmlns:cx8="http://schemas.microsoft.com/office/drawing/2016/5/14/chartex" xmlns:mc="http://schemas.openxmlformats.org/markup-compatibility/2006" xmlns:aink="http://schemas.microsoft.com/office/drawing/2016/ink" xmlns:am3d="http://schemas.microsoft.com/office/drawing/2017/model3d" xmlns:o="urn:schemas-microsoft-com:office:office" xmlns:r="http://schemas.openxmlformats.org/officeDocument/2006/relationships" xmlns:m="http://schemas.openxmlformats.org/officeDocument/2006/math" xmlns:v="urn:schemas-microsoft-com:vml" xmlns:wp14="http://schemas.microsoft.com/office/word/2010/wordprocessingDrawing" xmlns:wp="http://schemas.openxmlformats.org/drawingml/2006/wordprocessingDrawing" xmlns:w10="urn:schemas-microsoft-com:office:word" xmlns:w="http://schemas.openxmlformats.org/wordprocessingml/2006/main" xmlns:w14="http://schemas.microsoft.com/office/word/2010/wordml" xmlns:w15="http://schemas.microsoft.com/office/word/2012/wordml" xmlns:w16cex="http://schemas.microsoft.com/office/word/2018/wordml/cex" xmlns:w16cid="http://schemas.microsoft.com/office/word/2016/wordml/cid" xmlns:w16="http://schemas.microsoft.com/office/word/2018/wordml" xmlns:w16sdtdh="http://schemas.microsoft.com/office/word/2020/wordml/sdtdatahash" xmlns:w16se="http://schemas.microsoft.com/office/word/2015/wordml/symex" xmlns:wpg="http://schemas.microsoft.com/office/word/2010/wordprocessingGroup" xmlns:wpi="http://schemas.microsoft.com/office/word/2010/wordprocessingInk" xmlns:wne="http://schemas.microsoft.com/office/word/2006/wordml" xmlns:wps="http://schemas.microsoft.com/office/word/2010/wordprocessingShape" mc:Ignorable="w14 w15 w16se w16cid w16 w16cex w16sdtdh wp14">
   <w:footnote w:type="separator" w:id="-1">
     <w:p>
       <w:r>
@@ -25820,17 +25814,17 @@
 </file>
 
 <file path=word/header1.xml><?xml version="1.0" encoding="utf-8"?>
-<w:hdr xmlns:wpc="http://schemas.microsoft.com/office/word/2010/wordprocessingCanvas" xmlns:cx="http://schemas.microsoft.com/office/drawing/2014/chartex" xmlns:cx1="http://schemas.microsoft.com/office/drawing/2015/9/8/chartex" xmlns:cx2="http://schemas.microsoft.com/office/drawing/2015/10/21/chartex" xmlns:cx3="http://schemas.microsoft.com/office/drawing/2016/5/9/chartex" xmlns:cx4="http://schemas.microsoft.com/office/drawing/2016/5/10/chartex" xmlns:cx5="http://schemas.microsoft.com/office/drawing/2016/5/11/chartex" xmlns:cx6="http://schemas.microsoft.com/office/drawing/2016/5/12/chartex" xmlns:cx7="http://schemas.microsoft.com/office/drawing/2016/5/13/chartex" xmlns:cx8="http://schemas.microsoft.com/office/drawing/2016/5/14/chartex" xmlns:mc="http://schemas.openxmlformats.org/markup-compatibility/2006" xmlns:aink="http://schemas.microsoft.com/office/drawing/2016/ink" xmlns:am3d="http://schemas.microsoft.com/office/drawing/2017/model3d" xmlns:o="urn:schemas-microsoft-com:office:office" xmlns:oel="http://schemas.microsoft.com/office/2019/extlst" xmlns:r="http://schemas.openxmlformats.org/officeDocument/2006/relationships" xmlns:m="http://schemas.openxmlformats.org/officeDocument/2006/math" xmlns:v="urn:schemas-microsoft-com:vml" xmlns:wp14="http://schemas.microsoft.com/office/word/2010/wordprocessingDrawing" xmlns:wp="http://schemas.openxmlformats.org/drawingml/2006/wordprocessingDrawing" xmlns:w10="urn:schemas-microsoft-com:office:word" xmlns:w="http://schemas.openxmlformats.org/wordprocessingml/2006/main" xmlns:w14="http://schemas.microsoft.com/office/word/2010/wordml" xmlns:w15="http://schemas.microsoft.com/office/word/2012/wordml" xmlns:w16cex="http://schemas.microsoft.com/office/word/2018/wordml/cex" xmlns:w16cid="http://schemas.microsoft.com/office/word/2016/wordml/cid" xmlns:w16="http://schemas.microsoft.com/office/word/2018/wordml" xmlns:w16du="http://schemas.microsoft.com/office/word/2023/wordml/word16du" xmlns:w16sdtdh="http://schemas.microsoft.com/office/word/2020/wordml/sdtdatahash" xmlns:w16sdtfl="http://schemas.microsoft.com/office/word/2024/wordml/sdtformatlock" xmlns:w16se="http://schemas.microsoft.com/office/word/2015/wordml/symex" xmlns:wpg="http://schemas.microsoft.com/office/word/2010/wordprocessingGroup" xmlns:wpi="http://schemas.microsoft.com/office/word/2010/wordprocessingInk" xmlns:wne="http://schemas.microsoft.com/office/word/2006/wordml" xmlns:wps="http://schemas.microsoft.com/office/word/2010/wordprocessingShape" mc:Ignorable="w14 w15 w16se w16cid w16 w16cex w16sdtdh w16sdtfl w16du wp14">
+<w:hdr xmlns:wpc="http://schemas.microsoft.com/office/word/2010/wordprocessingCanvas" xmlns:cx="http://schemas.microsoft.com/office/drawing/2014/chartex" xmlns:cx1="http://schemas.microsoft.com/office/drawing/2015/9/8/chartex" xmlns:cx2="http://schemas.microsoft.com/office/drawing/2015/10/21/chartex" xmlns:cx3="http://schemas.microsoft.com/office/drawing/2016/5/9/chartex" xmlns:cx4="http://schemas.microsoft.com/office/drawing/2016/5/10/chartex" xmlns:cx5="http://schemas.microsoft.com/office/drawing/2016/5/11/chartex" xmlns:cx6="http://schemas.microsoft.com/office/drawing/2016/5/12/chartex" xmlns:cx7="http://schemas.microsoft.com/office/drawing/2016/5/13/chartex" xmlns:cx8="http://schemas.microsoft.com/office/drawing/2016/5/14/chartex" xmlns:mc="http://schemas.openxmlformats.org/markup-compatibility/2006" xmlns:aink="http://schemas.microsoft.com/office/drawing/2016/ink" xmlns:am3d="http://schemas.microsoft.com/office/drawing/2017/model3d" xmlns:o="urn:schemas-microsoft-com:office:office" xmlns:r="http://schemas.openxmlformats.org/officeDocument/2006/relationships" xmlns:m="http://schemas.openxmlformats.org/officeDocument/2006/math" xmlns:v="urn:schemas-microsoft-com:vml" xmlns:wp14="http://schemas.microsoft.com/office/word/2010/wordprocessingDrawing" xmlns:wp="http://schemas.openxmlformats.org/drawingml/2006/wordprocessingDrawing" xmlns:w10="urn:schemas-microsoft-com:office:word" xmlns:w="http://schemas.openxmlformats.org/wordprocessingml/2006/main" xmlns:w14="http://schemas.microsoft.com/office/word/2010/wordml" xmlns:w15="http://schemas.microsoft.com/office/word/2012/wordml" xmlns:w16cex="http://schemas.microsoft.com/office/word/2018/wordml/cex" xmlns:w16cid="http://schemas.microsoft.com/office/word/2016/wordml/cid" xmlns:w16="http://schemas.microsoft.com/office/word/2018/wordml" xmlns:w16sdtdh="http://schemas.microsoft.com/office/word/2020/wordml/sdtdatahash" xmlns:w16se="http://schemas.microsoft.com/office/word/2015/wordml/symex" xmlns:wpg="http://schemas.microsoft.com/office/word/2010/wordprocessingGroup" xmlns:wpi="http://schemas.microsoft.com/office/word/2010/wordprocessingInk" xmlns:wne="http://schemas.microsoft.com/office/word/2006/wordml" xmlns:wps="http://schemas.microsoft.com/office/word/2010/wordprocessingShape" mc:Ignorable="w14 w15 w16se w16cid w16 w16cex w16sdtdh wp14">
   <w:p>
     <w:pPr>
-      <w:pStyle w:val="Header"/>
+      <w:pStyle w:val="Encabezado"/>
     </w:pPr>
   </w:p>
 </w:hdr>
 </file>
 
 <file path=word/numbering.xml><?xml version="1.0" encoding="utf-8"?>
-<w:numbering xmlns:wpc="http://schemas.microsoft.com/office/word/2010/wordprocessingCanvas" xmlns:cx="http://schemas.microsoft.com/office/drawing/2014/chartex" xmlns:cx1="http://schemas.microsoft.com/office/drawing/2015/9/8/chartex" xmlns:cx2="http://schemas.microsoft.com/office/drawing/2015/10/21/chartex" xmlns:cx3="http://schemas.microsoft.com/office/drawing/2016/5/9/chartex" xmlns:cx4="http://schemas.microsoft.com/office/drawing/2016/5/10/chartex" xmlns:cx5="http://schemas.microsoft.com/office/drawing/2016/5/11/chartex" xmlns:cx6="http://schemas.microsoft.com/office/drawing/2016/5/12/chartex" xmlns:cx7="http://schemas.microsoft.com/office/drawing/2016/5/13/chartex" xmlns:cx8="http://schemas.microsoft.com/office/drawing/2016/5/14/chartex" xmlns:mc="http://schemas.openxmlformats.org/markup-compatibility/2006" xmlns:aink="http://schemas.microsoft.com/office/drawing/2016/ink" xmlns:am3d="http://schemas.microsoft.com/office/drawing/2017/model3d" xmlns:o="urn:schemas-microsoft-com:office:office" xmlns:oel="http://schemas.microsoft.com/office/2019/extlst" xmlns:r="http://schemas.openxmlformats.org/officeDocument/2006/relationships" xmlns:m="http://schemas.openxmlformats.org/officeDocument/2006/math" xmlns:v="urn:schemas-microsoft-com:vml" xmlns:wp14="http://schemas.microsoft.com/office/word/2010/wordprocessingDrawing" xmlns:wp="http://schemas.openxmlformats.org/drawingml/2006/wordprocessingDrawing" xmlns:w10="urn:schemas-microsoft-com:office:word" xmlns:w="http://schemas.openxmlformats.org/wordprocessingml/2006/main" xmlns:w14="http://schemas.microsoft.com/office/word/2010/wordml" xmlns:w15="http://schemas.microsoft.com/office/word/2012/wordml" xmlns:w16cex="http://schemas.microsoft.com/office/word/2018/wordml/cex" xmlns:w16cid="http://schemas.microsoft.com/office/word/2016/wordml/cid" xmlns:w16="http://schemas.microsoft.com/office/word/2018/wordml" xmlns:w16du="http://schemas.microsoft.com/office/word/2023/wordml/word16du" xmlns:w16sdtdh="http://schemas.microsoft.com/office/word/2020/wordml/sdtdatahash" xmlns:w16sdtfl="http://schemas.microsoft.com/office/word/2024/wordml/sdtformatlock" xmlns:w16se="http://schemas.microsoft.com/office/word/2015/wordml/symex" xmlns:wpg="http://schemas.microsoft.com/office/word/2010/wordprocessingGroup" xmlns:wpi="http://schemas.microsoft.com/office/word/2010/wordprocessingInk" xmlns:wne="http://schemas.microsoft.com/office/word/2006/wordml" xmlns:wps="http://schemas.microsoft.com/office/word/2010/wordprocessingShape" mc:Ignorable="w14 w15 w16se w16cid w16 w16cex w16sdtdh w16sdtfl w16du wp14">
+<w:numbering xmlns:wpc="http://schemas.microsoft.com/office/word/2010/wordprocessingCanvas" xmlns:cx="http://schemas.microsoft.com/office/drawing/2014/chartex" xmlns:cx1="http://schemas.microsoft.com/office/drawing/2015/9/8/chartex" xmlns:cx2="http://schemas.microsoft.com/office/drawing/2015/10/21/chartex" xmlns:cx3="http://schemas.microsoft.com/office/drawing/2016/5/9/chartex" xmlns:cx4="http://schemas.microsoft.com/office/drawing/2016/5/10/chartex" xmlns:cx5="http://schemas.microsoft.com/office/drawing/2016/5/11/chartex" xmlns:cx6="http://schemas.microsoft.com/office/drawing/2016/5/12/chartex" xmlns:cx7="http://schemas.microsoft.com/office/drawing/2016/5/13/chartex" xmlns:cx8="http://schemas.microsoft.com/office/drawing/2016/5/14/chartex" xmlns:mc="http://schemas.openxmlformats.org/markup-compatibility/2006" xmlns:aink="http://schemas.microsoft.com/office/drawing/2016/ink" xmlns:am3d="http://schemas.microsoft.com/office/drawing/2017/model3d" xmlns:o="urn:schemas-microsoft-com:office:office" xmlns:r="http://schemas.openxmlformats.org/officeDocument/2006/relationships" xmlns:m="http://schemas.openxmlformats.org/officeDocument/2006/math" xmlns:v="urn:schemas-microsoft-com:vml" xmlns:wp14="http://schemas.microsoft.com/office/word/2010/wordprocessingDrawing" xmlns:wp="http://schemas.openxmlformats.org/drawingml/2006/wordprocessingDrawing" xmlns:w10="urn:schemas-microsoft-com:office:word" xmlns:w="http://schemas.openxmlformats.org/wordprocessingml/2006/main" xmlns:w14="http://schemas.microsoft.com/office/word/2010/wordml" xmlns:w15="http://schemas.microsoft.com/office/word/2012/wordml" xmlns:w16cex="http://schemas.microsoft.com/office/word/2018/wordml/cex" xmlns:w16cid="http://schemas.microsoft.com/office/word/2016/wordml/cid" xmlns:w16="http://schemas.microsoft.com/office/word/2018/wordml" xmlns:w16sdtdh="http://schemas.microsoft.com/office/word/2020/wordml/sdtdatahash" xmlns:w16se="http://schemas.microsoft.com/office/word/2015/wordml/symex" xmlns:wpg="http://schemas.microsoft.com/office/word/2010/wordprocessingGroup" xmlns:wpi="http://schemas.microsoft.com/office/word/2010/wordprocessingInk" xmlns:wne="http://schemas.microsoft.com/office/word/2006/wordml" xmlns:wps="http://schemas.microsoft.com/office/word/2010/wordprocessingShape" mc:Ignorable="w14 w15 w16se w16cid w16 w16cex w16sdtdh wp14">
   <w:abstractNum w:abstractNumId="0" w15:restartNumberingAfterBreak="0">
     <w:nsid w:val="023F627C"/>
     <w:multiLevelType w:val="hybridMultilevel"/>
@@ -30745,133 +30739,133 @@
       </w:rPr>
     </w:lvl>
   </w:abstractNum>
-  <w:num w:numId="1" w16cid:durableId="1142036420">
+  <w:num w:numId="1">
     <w:abstractNumId w:val="42"/>
   </w:num>
-  <w:num w:numId="2" w16cid:durableId="113523368">
+  <w:num w:numId="2">
     <w:abstractNumId w:val="18"/>
   </w:num>
-  <w:num w:numId="3" w16cid:durableId="1102841671">
+  <w:num w:numId="3">
     <w:abstractNumId w:val="34"/>
   </w:num>
-  <w:num w:numId="4" w16cid:durableId="1849976461">
+  <w:num w:numId="4">
     <w:abstractNumId w:val="39"/>
   </w:num>
-  <w:num w:numId="5" w16cid:durableId="798572646">
+  <w:num w:numId="5">
     <w:abstractNumId w:val="40"/>
   </w:num>
-  <w:num w:numId="6" w16cid:durableId="758021848">
+  <w:num w:numId="6">
     <w:abstractNumId w:val="41"/>
   </w:num>
-  <w:num w:numId="7" w16cid:durableId="616789369">
+  <w:num w:numId="7">
     <w:abstractNumId w:val="10"/>
   </w:num>
-  <w:num w:numId="8" w16cid:durableId="499153116">
+  <w:num w:numId="8">
     <w:abstractNumId w:val="17"/>
   </w:num>
-  <w:num w:numId="9" w16cid:durableId="118770678">
+  <w:num w:numId="9">
     <w:abstractNumId w:val="30"/>
   </w:num>
-  <w:num w:numId="10" w16cid:durableId="1755586200">
+  <w:num w:numId="10">
     <w:abstractNumId w:val="36"/>
   </w:num>
-  <w:num w:numId="11" w16cid:durableId="1790657531">
+  <w:num w:numId="11">
     <w:abstractNumId w:val="38"/>
   </w:num>
-  <w:num w:numId="12" w16cid:durableId="1909459400">
+  <w:num w:numId="12">
     <w:abstractNumId w:val="9"/>
   </w:num>
-  <w:num w:numId="13" w16cid:durableId="2036878062">
+  <w:num w:numId="13">
     <w:abstractNumId w:val="20"/>
   </w:num>
-  <w:num w:numId="14" w16cid:durableId="1691179750">
+  <w:num w:numId="14">
     <w:abstractNumId w:val="14"/>
   </w:num>
-  <w:num w:numId="15" w16cid:durableId="1964729449">
+  <w:num w:numId="15">
     <w:abstractNumId w:val="11"/>
   </w:num>
-  <w:num w:numId="16" w16cid:durableId="730006628">
+  <w:num w:numId="16">
     <w:abstractNumId w:val="3"/>
   </w:num>
-  <w:num w:numId="17" w16cid:durableId="584458885">
+  <w:num w:numId="17">
     <w:abstractNumId w:val="33"/>
   </w:num>
-  <w:num w:numId="18" w16cid:durableId="1544444022">
+  <w:num w:numId="18">
     <w:abstractNumId w:val="27"/>
   </w:num>
-  <w:num w:numId="19" w16cid:durableId="2091267523">
+  <w:num w:numId="19">
     <w:abstractNumId w:val="12"/>
   </w:num>
-  <w:num w:numId="20" w16cid:durableId="869800038">
+  <w:num w:numId="20">
     <w:abstractNumId w:val="19"/>
   </w:num>
-  <w:num w:numId="21" w16cid:durableId="1278220507">
+  <w:num w:numId="21">
     <w:abstractNumId w:val="2"/>
   </w:num>
-  <w:num w:numId="22" w16cid:durableId="749621586">
+  <w:num w:numId="22">
     <w:abstractNumId w:val="21"/>
   </w:num>
-  <w:num w:numId="23" w16cid:durableId="1253126489">
+  <w:num w:numId="23">
     <w:abstractNumId w:val="35"/>
   </w:num>
-  <w:num w:numId="24" w16cid:durableId="1534229339">
+  <w:num w:numId="24">
     <w:abstractNumId w:val="6"/>
   </w:num>
-  <w:num w:numId="25" w16cid:durableId="1587379830">
+  <w:num w:numId="25">
     <w:abstractNumId w:val="4"/>
   </w:num>
-  <w:num w:numId="26" w16cid:durableId="611979092">
+  <w:num w:numId="26">
     <w:abstractNumId w:val="1"/>
   </w:num>
-  <w:num w:numId="27" w16cid:durableId="77673060">
+  <w:num w:numId="27">
     <w:abstractNumId w:val="31"/>
   </w:num>
-  <w:num w:numId="28" w16cid:durableId="99450352">
+  <w:num w:numId="28">
     <w:abstractNumId w:val="28"/>
   </w:num>
-  <w:num w:numId="29" w16cid:durableId="1451900012">
+  <w:num w:numId="29">
     <w:abstractNumId w:val="15"/>
   </w:num>
-  <w:num w:numId="30" w16cid:durableId="1074937792">
+  <w:num w:numId="30">
     <w:abstractNumId w:val="26"/>
   </w:num>
-  <w:num w:numId="31" w16cid:durableId="115296847">
+  <w:num w:numId="31">
     <w:abstractNumId w:val="25"/>
   </w:num>
-  <w:num w:numId="32" w16cid:durableId="1253589121">
+  <w:num w:numId="32">
     <w:abstractNumId w:val="32"/>
   </w:num>
-  <w:num w:numId="33" w16cid:durableId="1564487679">
+  <w:num w:numId="33">
     <w:abstractNumId w:val="8"/>
   </w:num>
-  <w:num w:numId="34" w16cid:durableId="430205366">
+  <w:num w:numId="34">
     <w:abstractNumId w:val="29"/>
   </w:num>
-  <w:num w:numId="35" w16cid:durableId="774520576">
+  <w:num w:numId="35">
     <w:abstractNumId w:val="0"/>
   </w:num>
-  <w:num w:numId="36" w16cid:durableId="1007710684">
+  <w:num w:numId="36">
     <w:abstractNumId w:val="13"/>
   </w:num>
-  <w:num w:numId="37" w16cid:durableId="1195074438">
+  <w:num w:numId="37">
     <w:abstractNumId w:val="7"/>
   </w:num>
-  <w:num w:numId="38" w16cid:durableId="1643385891">
+  <w:num w:numId="38">
     <w:abstractNumId w:val="22"/>
   </w:num>
-  <w:num w:numId="39" w16cid:durableId="155920719">
+  <w:num w:numId="39">
     <w:abstractNumId w:val="5"/>
   </w:num>
-  <w:num w:numId="40" w16cid:durableId="1024864031">
+  <w:num w:numId="40">
     <w:abstractNumId w:val="37"/>
   </w:num>
-  <w:num w:numId="41" w16cid:durableId="1183394659">
+  <w:num w:numId="41">
     <w:abstractNumId w:val="24"/>
   </w:num>
-  <w:num w:numId="42" w16cid:durableId="1615135381">
+  <w:num w:numId="42">
     <w:abstractNumId w:val="23"/>
   </w:num>
-  <w:num w:numId="43" w16cid:durableId="1504589708">
+  <w:num w:numId="43">
     <w:abstractNumId w:val="16"/>
   </w:num>
   <w:numIdMacAtCleanup w:val="15"/>
@@ -30879,7 +30873,7 @@
 </file>
 
 <file path=word/styles.xml><?xml version="1.0" encoding="utf-8"?>
-<w:styles xmlns:mc="http://schemas.openxmlformats.org/markup-compatibility/2006" xmlns:r="http://schemas.openxmlformats.org/officeDocument/2006/relationships" xmlns:w="http://schemas.openxmlformats.org/wordprocessingml/2006/main" xmlns:w14="http://schemas.microsoft.com/office/word/2010/wordml" xmlns:w15="http://schemas.microsoft.com/office/word/2012/wordml" xmlns:w16cex="http://schemas.microsoft.com/office/word/2018/wordml/cex" xmlns:w16cid="http://schemas.microsoft.com/office/word/2016/wordml/cid" xmlns:w16="http://schemas.microsoft.com/office/word/2018/wordml" xmlns:w16du="http://schemas.microsoft.com/office/word/2023/wordml/word16du" xmlns:w16sdtdh="http://schemas.microsoft.com/office/word/2020/wordml/sdtdatahash" xmlns:w16sdtfl="http://schemas.microsoft.com/office/word/2024/wordml/sdtformatlock" xmlns:w16se="http://schemas.microsoft.com/office/word/2015/wordml/symex" mc:Ignorable="w14 w15 w16se w16cid w16 w16cex w16sdtdh w16sdtfl w16du">
+<w:styles xmlns:mc="http://schemas.openxmlformats.org/markup-compatibility/2006" xmlns:r="http://schemas.openxmlformats.org/officeDocument/2006/relationships" xmlns:w="http://schemas.openxmlformats.org/wordprocessingml/2006/main" xmlns:w14="http://schemas.microsoft.com/office/word/2010/wordml" xmlns:w15="http://schemas.microsoft.com/office/word/2012/wordml" xmlns:w16cex="http://schemas.microsoft.com/office/word/2018/wordml/cex" xmlns:w16cid="http://schemas.microsoft.com/office/word/2016/wordml/cid" xmlns:w16="http://schemas.microsoft.com/office/word/2018/wordml" xmlns:w16sdtdh="http://schemas.microsoft.com/office/word/2020/wordml/sdtdatahash" xmlns:w16se="http://schemas.microsoft.com/office/word/2015/wordml/symex" mc:Ignorable="w14 w15 w16se w16cid w16 w16cex w16sdtdh">
   <w:docDefaults>
     <w:rPrDefault>
       <w:rPr>
@@ -31289,10 +31283,10 @@
       <w:lang w:val="es-ES"/>
     </w:rPr>
   </w:style>
-  <w:style w:type="paragraph" w:styleId="Heading1">
+  <w:style w:type="paragraph" w:styleId="Ttulo1">
     <w:name w:val="heading 1"/>
     <w:basedOn w:val="Normal"/>
-    <w:link w:val="Heading1Char"/>
+    <w:link w:val="Ttulo1Car"/>
     <w:uiPriority w:val="9"/>
     <w:qFormat/>
     <w:rsid w:val="00EB7050"/>
@@ -31308,7 +31302,7 @@
       <w:szCs w:val="32"/>
     </w:rPr>
   </w:style>
-  <w:style w:type="paragraph" w:styleId="Heading2">
+  <w:style w:type="paragraph" w:styleId="Ttulo2">
     <w:name w:val="heading 2"/>
     <w:basedOn w:val="Normal"/>
     <w:uiPriority w:val="9"/>
@@ -31325,10 +31319,10 @@
       <w:szCs w:val="24"/>
     </w:rPr>
   </w:style>
-  <w:style w:type="paragraph" w:styleId="Heading3">
+  <w:style w:type="paragraph" w:styleId="Ttulo3">
     <w:name w:val="heading 3"/>
     <w:basedOn w:val="Normal"/>
-    <w:link w:val="Heading3Char"/>
+    <w:link w:val="Ttulo3Car"/>
     <w:uiPriority w:val="9"/>
     <w:unhideWhenUsed/>
     <w:qFormat/>
@@ -31342,11 +31336,11 @@
       <w:szCs w:val="24"/>
     </w:rPr>
   </w:style>
-  <w:style w:type="paragraph" w:styleId="Heading4">
+  <w:style w:type="paragraph" w:styleId="Ttulo4">
     <w:name w:val="heading 4"/>
     <w:basedOn w:val="Normal"/>
     <w:next w:val="Normal"/>
-    <w:link w:val="Heading4Char"/>
+    <w:link w:val="Ttulo4Car"/>
     <w:unhideWhenUsed/>
     <w:qFormat/>
     <w:rsid w:val="003B410B"/>
@@ -31365,13 +31359,13 @@
       <w:iCs/>
     </w:rPr>
   </w:style>
-  <w:style w:type="character" w:default="1" w:styleId="DefaultParagraphFont">
+  <w:style w:type="character" w:default="1" w:styleId="Fuentedeprrafopredeter">
     <w:name w:val="Default Paragraph Font"/>
     <w:uiPriority w:val="1"/>
     <w:semiHidden/>
     <w:unhideWhenUsed/>
   </w:style>
-  <w:style w:type="table" w:default="1" w:styleId="TableNormal">
+  <w:style w:type="table" w:default="1" w:styleId="Tablanormal">
     <w:name w:val="Normal Table"/>
     <w:uiPriority w:val="99"/>
     <w:semiHidden/>
@@ -31386,7 +31380,7 @@
       </w:tblCellMar>
     </w:tblPr>
   </w:style>
-  <w:style w:type="numbering" w:default="1" w:styleId="NoList">
+  <w:style w:type="numbering" w:default="1" w:styleId="Sinlista">
     <w:name w:val="No List"/>
     <w:uiPriority w:val="99"/>
     <w:semiHidden/>
@@ -31408,7 +31402,7 @@
       </w:tblCellMar>
     </w:tblPr>
   </w:style>
-  <w:style w:type="paragraph" w:styleId="TOC1">
+  <w:style w:type="paragraph" w:styleId="TDC1">
     <w:name w:val="toc 1"/>
     <w:basedOn w:val="Normal"/>
     <w:uiPriority w:val="39"/>
@@ -31418,7 +31412,7 @@
       <w:ind w:left="980" w:hanging="441"/>
     </w:pPr>
   </w:style>
-  <w:style w:type="paragraph" w:styleId="TOC2">
+  <w:style w:type="paragraph" w:styleId="TDC2">
     <w:name w:val="toc 2"/>
     <w:basedOn w:val="Normal"/>
     <w:uiPriority w:val="39"/>
@@ -31428,7 +31422,7 @@
       <w:ind w:left="540"/>
     </w:pPr>
   </w:style>
-  <w:style w:type="paragraph" w:styleId="TOC3">
+  <w:style w:type="paragraph" w:styleId="TDC3">
     <w:name w:val="toc 3"/>
     <w:basedOn w:val="Normal"/>
     <w:uiPriority w:val="39"/>
@@ -31438,7 +31432,7 @@
       <w:ind w:left="1421" w:hanging="661"/>
     </w:pPr>
   </w:style>
-  <w:style w:type="paragraph" w:styleId="TOC4">
+  <w:style w:type="paragraph" w:styleId="TDC4">
     <w:name w:val="toc 4"/>
     <w:basedOn w:val="Normal"/>
     <w:uiPriority w:val="39"/>
@@ -31452,7 +31446,7 @@
       <w:bCs/>
     </w:rPr>
   </w:style>
-  <w:style w:type="paragraph" w:styleId="TOC5">
+  <w:style w:type="paragraph" w:styleId="TDC5">
     <w:name w:val="toc 5"/>
     <w:basedOn w:val="Normal"/>
     <w:uiPriority w:val="39"/>
@@ -31465,7 +31459,7 @@
       <w:i/>
     </w:rPr>
   </w:style>
-  <w:style w:type="paragraph" w:styleId="BodyText">
+  <w:style w:type="paragraph" w:styleId="Textoindependiente">
     <w:name w:val="Body Text"/>
     <w:basedOn w:val="Normal"/>
     <w:uiPriority w:val="1"/>
@@ -31474,7 +31468,7 @@
       <w:i/>
     </w:rPr>
   </w:style>
-  <w:style w:type="paragraph" w:styleId="Title">
+  <w:style w:type="paragraph" w:styleId="Ttulo">
     <w:name w:val="Title"/>
     <w:basedOn w:val="Normal"/>
     <w:uiPriority w:val="10"/>
@@ -31492,7 +31486,7 @@
       <w:szCs w:val="44"/>
     </w:rPr>
   </w:style>
-  <w:style w:type="paragraph" w:styleId="ListParagraph">
+  <w:style w:type="paragraph" w:styleId="Prrafodelista">
     <w:name w:val="List Paragraph"/>
     <w:basedOn w:val="Normal"/>
     <w:uiPriority w:val="34"/>
@@ -31507,9 +31501,9 @@
     <w:uiPriority w:val="1"/>
     <w:qFormat/>
   </w:style>
-  <w:style w:type="table" w:styleId="TableGrid">
+  <w:style w:type="table" w:styleId="Tablaconcuadrcula">
     <w:name w:val="Table Grid"/>
-    <w:basedOn w:val="TableNormal"/>
+    <w:basedOn w:val="Tablanormal"/>
     <w:uiPriority w:val="39"/>
     <w:rsid w:val="00C56009"/>
     <w:tblPr>
@@ -31523,7 +31517,7 @@
       </w:tblBorders>
     </w:tblPr>
   </w:style>
-  <w:style w:type="paragraph" w:styleId="Caption">
+  <w:style w:type="paragraph" w:styleId="Descripcin">
     <w:name w:val="caption"/>
     <w:basedOn w:val="Normal"/>
     <w:next w:val="Normal"/>
@@ -31542,10 +31536,10 @@
       <w:szCs w:val="18"/>
     </w:rPr>
   </w:style>
-  <w:style w:type="character" w:customStyle="1" w:styleId="Heading1Char">
-    <w:name w:val="Heading 1 Char"/>
-    <w:basedOn w:val="DefaultParagraphFont"/>
-    <w:link w:val="Heading1"/>
+  <w:style w:type="character" w:customStyle="1" w:styleId="Ttulo1Car">
+    <w:name w:val="Título 1 Car"/>
+    <w:basedOn w:val="Fuentedeprrafopredeter"/>
+    <w:link w:val="Ttulo1"/>
     <w:uiPriority w:val="9"/>
     <w:rsid w:val="00EB7050"/>
     <w:rPr>
@@ -31574,7 +31568,7 @@
       <w:lang w:eastAsia="es-ES"/>
     </w:rPr>
   </w:style>
-  <w:style w:type="character" w:styleId="Hyperlink">
+  <w:style w:type="character" w:styleId="Hipervnculo">
     <w:name w:val="Hyperlink"/>
     <w:uiPriority w:val="99"/>
     <w:rsid w:val="00EA5020"/>
@@ -31587,9 +31581,9 @@
     <w:name w:val="st"/>
     <w:rsid w:val="00EA5020"/>
   </w:style>
-  <w:style w:type="paragraph" w:styleId="TOCHeading">
+  <w:style w:type="paragraph" w:styleId="TtuloTDC">
     <w:name w:val="TOC Heading"/>
-    <w:basedOn w:val="Heading1"/>
+    <w:basedOn w:val="Ttulo1"/>
     <w:next w:val="Normal"/>
     <w:uiPriority w:val="39"/>
     <w:unhideWhenUsed/>
@@ -31611,7 +31605,7 @@
       <w:lang w:val="es-MX" w:eastAsia="es-MX"/>
     </w:rPr>
   </w:style>
-  <w:style w:type="paragraph" w:styleId="NoSpacing">
+  <w:style w:type="paragraph" w:styleId="Sinespaciado">
     <w:name w:val="No Spacing"/>
     <w:uiPriority w:val="1"/>
     <w:qFormat/>
@@ -31621,10 +31615,10 @@
       <w:lang w:val="es-ES"/>
     </w:rPr>
   </w:style>
-  <w:style w:type="character" w:customStyle="1" w:styleId="Heading4Char">
-    <w:name w:val="Heading 4 Char"/>
-    <w:basedOn w:val="DefaultParagraphFont"/>
-    <w:link w:val="Heading4"/>
+  <w:style w:type="character" w:customStyle="1" w:styleId="Ttulo4Car">
+    <w:name w:val="Título 4 Car"/>
+    <w:basedOn w:val="Fuentedeprrafopredeter"/>
+    <w:link w:val="Ttulo4"/>
     <w:rsid w:val="003B410B"/>
     <w:rPr>
       <w:rFonts w:asciiTheme="majorHAnsi" w:eastAsiaTheme="majorEastAsia" w:hAnsiTheme="majorHAnsi" w:cstheme="majorBidi"/>
@@ -31634,10 +31628,10 @@
       <w:lang w:val="es-ES"/>
     </w:rPr>
   </w:style>
-  <w:style w:type="character" w:customStyle="1" w:styleId="Heading3Char">
-    <w:name w:val="Heading 3 Char"/>
-    <w:basedOn w:val="DefaultParagraphFont"/>
-    <w:link w:val="Heading3"/>
+  <w:style w:type="character" w:customStyle="1" w:styleId="Ttulo3Car">
+    <w:name w:val="Título 3 Car"/>
+    <w:basedOn w:val="Fuentedeprrafopredeter"/>
+    <w:link w:val="Ttulo3"/>
     <w:uiPriority w:val="9"/>
     <w:rsid w:val="004D293B"/>
     <w:rPr>
@@ -31648,7 +31642,7 @@
       <w:lang w:val="es-ES"/>
     </w:rPr>
   </w:style>
-  <w:style w:type="paragraph" w:styleId="TableofFigures">
+  <w:style w:type="paragraph" w:styleId="Tabladeilustraciones">
     <w:name w:val="table of figures"/>
     <w:basedOn w:val="Normal"/>
     <w:next w:val="Normal"/>
@@ -31658,23 +31652,23 @@
   </w:style>
   <w:style w:type="character" w:customStyle="1" w:styleId="normaltextrun">
     <w:name w:val="normaltextrun"/>
-    <w:basedOn w:val="DefaultParagraphFont"/>
+    <w:basedOn w:val="Fuentedeprrafopredeter"/>
     <w:rsid w:val="00EB1C2A"/>
   </w:style>
   <w:style w:type="character" w:customStyle="1" w:styleId="scxw173366235">
     <w:name w:val="scxw173366235"/>
-    <w:basedOn w:val="DefaultParagraphFont"/>
+    <w:basedOn w:val="Fuentedeprrafopredeter"/>
     <w:rsid w:val="00EB1C2A"/>
   </w:style>
   <w:style w:type="character" w:customStyle="1" w:styleId="eop">
     <w:name w:val="eop"/>
-    <w:basedOn w:val="DefaultParagraphFont"/>
+    <w:basedOn w:val="Fuentedeprrafopredeter"/>
     <w:rsid w:val="00EB1C2A"/>
   </w:style>
-  <w:style w:type="paragraph" w:styleId="Header">
+  <w:style w:type="paragraph" w:styleId="Encabezado">
     <w:name w:val="header"/>
     <w:basedOn w:val="Normal"/>
-    <w:link w:val="HeaderChar"/>
+    <w:link w:val="EncabezadoCar"/>
     <w:uiPriority w:val="99"/>
     <w:unhideWhenUsed/>
     <w:rsid w:val="00C02C11"/>
@@ -31685,10 +31679,10 @@
       </w:tabs>
     </w:pPr>
   </w:style>
-  <w:style w:type="character" w:customStyle="1" w:styleId="HeaderChar">
-    <w:name w:val="Header Char"/>
-    <w:basedOn w:val="DefaultParagraphFont"/>
-    <w:link w:val="Header"/>
+  <w:style w:type="character" w:customStyle="1" w:styleId="EncabezadoCar">
+    <w:name w:val="Encabezado Car"/>
+    <w:basedOn w:val="Fuentedeprrafopredeter"/>
+    <w:link w:val="Encabezado"/>
     <w:uiPriority w:val="99"/>
     <w:rsid w:val="00C02C11"/>
     <w:rPr>
@@ -31696,10 +31690,10 @@
       <w:lang w:val="es-ES"/>
     </w:rPr>
   </w:style>
-  <w:style w:type="paragraph" w:styleId="Footer">
+  <w:style w:type="paragraph" w:styleId="Piedepgina">
     <w:name w:val="footer"/>
     <w:basedOn w:val="Normal"/>
-    <w:link w:val="FooterChar"/>
+    <w:link w:val="PiedepginaCar"/>
     <w:uiPriority w:val="99"/>
     <w:unhideWhenUsed/>
     <w:rsid w:val="00C02C11"/>
@@ -31710,10 +31704,10 @@
       </w:tabs>
     </w:pPr>
   </w:style>
-  <w:style w:type="character" w:customStyle="1" w:styleId="FooterChar">
-    <w:name w:val="Footer Char"/>
-    <w:basedOn w:val="DefaultParagraphFont"/>
-    <w:link w:val="Footer"/>
+  <w:style w:type="character" w:customStyle="1" w:styleId="PiedepginaCar">
+    <w:name w:val="Pie de página Car"/>
+    <w:basedOn w:val="Fuentedeprrafopredeter"/>
+    <w:link w:val="Piedepgina"/>
     <w:uiPriority w:val="99"/>
     <w:rsid w:val="00C02C11"/>
     <w:rPr>
@@ -31721,10 +31715,10 @@
       <w:lang w:val="es-ES"/>
     </w:rPr>
   </w:style>
-  <w:style w:type="paragraph" w:styleId="EndnoteText">
+  <w:style w:type="paragraph" w:styleId="Textonotaalfinal">
     <w:name w:val="endnote text"/>
     <w:basedOn w:val="Normal"/>
-    <w:link w:val="EndnoteTextChar"/>
+    <w:link w:val="TextonotaalfinalCar"/>
     <w:uiPriority w:val="99"/>
     <w:semiHidden/>
     <w:unhideWhenUsed/>
@@ -31734,10 +31728,10 @@
       <w:szCs w:val="20"/>
     </w:rPr>
   </w:style>
-  <w:style w:type="character" w:customStyle="1" w:styleId="EndnoteTextChar">
-    <w:name w:val="Endnote Text Char"/>
-    <w:basedOn w:val="DefaultParagraphFont"/>
-    <w:link w:val="EndnoteText"/>
+  <w:style w:type="character" w:customStyle="1" w:styleId="TextonotaalfinalCar">
+    <w:name w:val="Texto nota al final Car"/>
+    <w:basedOn w:val="Fuentedeprrafopredeter"/>
+    <w:link w:val="Textonotaalfinal"/>
     <w:uiPriority w:val="99"/>
     <w:semiHidden/>
     <w:rsid w:val="00C555D6"/>
@@ -31748,9 +31742,9 @@
       <w:lang w:val="es-ES"/>
     </w:rPr>
   </w:style>
-  <w:style w:type="character" w:styleId="EndnoteReference">
+  <w:style w:type="character" w:styleId="Refdenotaalfinal">
     <w:name w:val="endnote reference"/>
-    <w:basedOn w:val="DefaultParagraphFont"/>
+    <w:basedOn w:val="Fuentedeprrafopredeter"/>
     <w:uiPriority w:val="99"/>
     <w:semiHidden/>
     <w:unhideWhenUsed/>
@@ -31759,10 +31753,10 @@
       <w:vertAlign w:val="superscript"/>
     </w:rPr>
   </w:style>
-  <w:style w:type="paragraph" w:styleId="FootnoteText">
+  <w:style w:type="paragraph" w:styleId="Textonotapie">
     <w:name w:val="footnote text"/>
     <w:basedOn w:val="Normal"/>
-    <w:link w:val="FootnoteTextChar"/>
+    <w:link w:val="TextonotapieCar"/>
     <w:uiPriority w:val="99"/>
     <w:semiHidden/>
     <w:unhideWhenUsed/>
@@ -31772,10 +31766,10 @@
       <w:szCs w:val="20"/>
     </w:rPr>
   </w:style>
-  <w:style w:type="character" w:customStyle="1" w:styleId="FootnoteTextChar">
-    <w:name w:val="Footnote Text Char"/>
-    <w:basedOn w:val="DefaultParagraphFont"/>
-    <w:link w:val="FootnoteText"/>
+  <w:style w:type="character" w:customStyle="1" w:styleId="TextonotapieCar">
+    <w:name w:val="Texto nota pie Car"/>
+    <w:basedOn w:val="Fuentedeprrafopredeter"/>
+    <w:link w:val="Textonotapie"/>
     <w:uiPriority w:val="99"/>
     <w:semiHidden/>
     <w:rsid w:val="00C555D6"/>
@@ -31786,9 +31780,9 @@
       <w:lang w:val="es-ES"/>
     </w:rPr>
   </w:style>
-  <w:style w:type="character" w:styleId="FootnoteReference">
+  <w:style w:type="character" w:styleId="Refdenotaalpie">
     <w:name w:val="footnote reference"/>
-    <w:basedOn w:val="DefaultParagraphFont"/>
+    <w:basedOn w:val="Fuentedeprrafopredeter"/>
     <w:uiPriority w:val="99"/>
     <w:semiHidden/>
     <w:unhideWhenUsed/>
@@ -31797,9 +31791,9 @@
       <w:vertAlign w:val="superscript"/>
     </w:rPr>
   </w:style>
-  <w:style w:type="table" w:styleId="GridTable4-Accent4">
+  <w:style w:type="table" w:styleId="Tablaconcuadrcula4-nfasis4">
     <w:name w:val="Grid Table 4 Accent 4"/>
-    <w:basedOn w:val="TableNormal"/>
+    <w:basedOn w:val="Tablanormal"/>
     <w:uiPriority w:val="49"/>
     <w:rsid w:val="00E31EB6"/>
     <w:tblPr>
@@ -31870,9 +31864,9 @@
       </w:tcPr>
     </w:tblStylePr>
   </w:style>
-  <w:style w:type="table" w:styleId="GridTable1Light-Accent4">
+  <w:style w:type="table" w:styleId="Tablaconcuadrcula1clara-nfasis4">
     <w:name w:val="Grid Table 1 Light Accent 4"/>
-    <w:basedOn w:val="TableNormal"/>
+    <w:basedOn w:val="Tablanormal"/>
     <w:uiPriority w:val="46"/>
     <w:rsid w:val="00694E7A"/>
     <w:tblPr>
@@ -31924,7 +31918,7 @@
       </w:rPr>
     </w:tblStylePr>
   </w:style>
-  <w:style w:type="paragraph" w:styleId="TOC6">
+  <w:style w:type="paragraph" w:styleId="TDC6">
     <w:name w:val="toc 6"/>
     <w:basedOn w:val="Normal"/>
     <w:next w:val="Normal"/>
@@ -31944,7 +31938,7 @@
       <w:lang w:val="es-US" w:eastAsia="es-US"/>
     </w:rPr>
   </w:style>
-  <w:style w:type="paragraph" w:styleId="TOC7">
+  <w:style w:type="paragraph" w:styleId="TDC7">
     <w:name w:val="toc 7"/>
     <w:basedOn w:val="Normal"/>
     <w:next w:val="Normal"/>
@@ -31964,7 +31958,7 @@
       <w:lang w:val="es-US" w:eastAsia="es-US"/>
     </w:rPr>
   </w:style>
-  <w:style w:type="paragraph" w:styleId="TOC8">
+  <w:style w:type="paragraph" w:styleId="TDC8">
     <w:name w:val="toc 8"/>
     <w:basedOn w:val="Normal"/>
     <w:next w:val="Normal"/>
@@ -31984,7 +31978,7 @@
       <w:lang w:val="es-US" w:eastAsia="es-US"/>
     </w:rPr>
   </w:style>
-  <w:style w:type="paragraph" w:styleId="TOC9">
+  <w:style w:type="paragraph" w:styleId="TDC9">
     <w:name w:val="toc 9"/>
     <w:basedOn w:val="Normal"/>
     <w:next w:val="Normal"/>
@@ -32006,7 +32000,7 @@
   </w:style>
   <w:style w:type="character" w:customStyle="1" w:styleId="Mencinsinresolver1">
     <w:name w:val="Mención sin resolver1"/>
-    <w:basedOn w:val="DefaultParagraphFont"/>
+    <w:basedOn w:val="Fuentedeprrafopredeter"/>
     <w:uiPriority w:val="99"/>
     <w:semiHidden/>
     <w:unhideWhenUsed/>
@@ -32016,9 +32010,9 @@
       <w:shd w:val="clear" w:color="auto" w:fill="E1DFDD"/>
     </w:rPr>
   </w:style>
-  <w:style w:type="table" w:styleId="GridTable5Dark-Accent4">
+  <w:style w:type="table" w:styleId="Tablaconcuadrcula5oscura-nfasis4">
     <w:name w:val="Grid Table 5 Dark Accent 4"/>
-    <w:basedOn w:val="TableNormal"/>
+    <w:basedOn w:val="Tablanormal"/>
     <w:uiPriority w:val="50"/>
     <w:rsid w:val="00D47161"/>
     <w:tblPr>
@@ -32119,9 +32113,9 @@
       </w:tcPr>
     </w:tblStylePr>
   </w:style>
-  <w:style w:type="table" w:styleId="PlainTable3">
+  <w:style w:type="table" w:styleId="Tablanormal3">
     <w:name w:val="Plain Table 3"/>
-    <w:basedOn w:val="TableNormal"/>
+    <w:basedOn w:val="Tablanormal"/>
     <w:uiPriority w:val="43"/>
     <w:rsid w:val="00F43C26"/>
     <w:tblPr>
@@ -32209,9 +32203,9 @@
       </w:tcPr>
     </w:tblStylePr>
   </w:style>
-  <w:style w:type="table" w:styleId="ListTable7Colorful-Accent4">
+  <w:style w:type="table" w:styleId="Tabladelista7concolores-nfasis4">
     <w:name w:val="List Table 7 Colorful Accent 4"/>
-    <w:basedOn w:val="TableNormal"/>
+    <w:basedOn w:val="Tablanormal"/>
     <w:uiPriority w:val="52"/>
     <w:rsid w:val="004D144F"/>
     <w:rPr>
@@ -32329,9 +32323,9 @@
       </w:tcPr>
     </w:tblStylePr>
   </w:style>
-  <w:style w:type="table" w:styleId="ListTable3-Accent4">
+  <w:style w:type="table" w:styleId="Tabladelista3-nfasis4">
     <w:name w:val="List Table 3 Accent 4"/>
-    <w:basedOn w:val="TableNormal"/>
+    <w:basedOn w:val="Tablanormal"/>
     <w:uiPriority w:val="48"/>
     <w:rsid w:val="004D144F"/>
     <w:tblPr>
@@ -32450,9 +32444,9 @@
       </w:tcPr>
     </w:tblStylePr>
   </w:style>
-  <w:style w:type="table" w:styleId="GridTable6Colorful-Accent4">
+  <w:style w:type="table" w:styleId="Tablaconcuadrcula6concolores-nfasis4">
     <w:name w:val="Grid Table 6 Colorful Accent 4"/>
-    <w:basedOn w:val="TableNormal"/>
+    <w:basedOn w:val="Tablanormal"/>
     <w:uiPriority w:val="51"/>
     <w:rsid w:val="004D144F"/>
     <w:rPr>
@@ -32534,9 +32528,9 @@
       <w:lang w:val="es-EC" w:eastAsia="zh-CN" w:bidi="hi-IN"/>
     </w:rPr>
   </w:style>
-  <w:style w:type="table" w:styleId="MediumGrid3-Accent1">
+  <w:style w:type="table" w:styleId="Cuadrculamedia3-nfasis1">
     <w:name w:val="Medium Grid 3 Accent 1"/>
-    <w:basedOn w:val="TableNormal"/>
+    <w:basedOn w:val="Tablanormal"/>
     <w:uiPriority w:val="69"/>
     <w:unhideWhenUsed/>
     <w:rsid w:val="00624EF3"/>
@@ -32678,9 +32672,9 @@
       </w:tcPr>
     </w:tblStylePr>
   </w:style>
-  <w:style w:type="table" w:styleId="GridTable7Colorful-Accent4">
+  <w:style w:type="table" w:styleId="Tablaconcuadrcula7concolores-nfasis4">
     <w:name w:val="Grid Table 7 Colorful Accent 4"/>
-    <w:basedOn w:val="TableNormal"/>
+    <w:basedOn w:val="Tablanormal"/>
     <w:uiPriority w:val="52"/>
     <w:rsid w:val="002603FE"/>
     <w:rPr>
@@ -32814,9 +32808,9 @@
       </w:tcPr>
     </w:tblStylePr>
   </w:style>
-  <w:style w:type="character" w:styleId="UnresolvedMention">
+  <w:style w:type="character" w:styleId="Mencinsinresolver">
     <w:name w:val="Unresolved Mention"/>
-    <w:basedOn w:val="DefaultParagraphFont"/>
+    <w:basedOn w:val="Fuentedeprrafopredeter"/>
     <w:uiPriority w:val="99"/>
     <w:semiHidden/>
     <w:unhideWhenUsed/>
@@ -32838,9 +32832,9 @@
       <w:szCs w:val="24"/>
     </w:rPr>
   </w:style>
-  <w:style w:type="table" w:styleId="GridTable4-Accent1">
+  <w:style w:type="table" w:styleId="Tablaconcuadrcula4-nfasis1">
     <w:name w:val="Grid Table 4 Accent 1"/>
-    <w:basedOn w:val="TableNormal"/>
+    <w:basedOn w:val="Tablanormal"/>
     <w:uiPriority w:val="49"/>
     <w:rsid w:val="00F50CD1"/>
     <w:tblPr>

</xml_diff>

<commit_message>
Actualiza documentación TI1.1 SOAP Java
</commit_message>
<xml_diff>
--- a/TI.1.1. PAO202651_SOAP_JAVA_SINBDD_NRC36884_GR03/01. UML/01 ERS/ERS_SOAP_JAVA_SINBDD_GR03.docx
+++ b/TI.1.1. PAO202651_SOAP_JAVA_SINBDD_NRC36884_GR03/01. UML/01 ERS/ERS_SOAP_JAVA_SINBDD_GR03.docx
@@ -1,6 +1,6 @@
 
 <file path=word/document.xml><?xml version="1.0" encoding="utf-8"?>
-<w:document xmlns:wpc="http://schemas.microsoft.com/office/word/2010/wordprocessingCanvas" xmlns:cx="http://schemas.microsoft.com/office/drawing/2014/chartex" xmlns:cx1="http://schemas.microsoft.com/office/drawing/2015/9/8/chartex" xmlns:cx2="http://schemas.microsoft.com/office/drawing/2015/10/21/chartex" xmlns:cx3="http://schemas.microsoft.com/office/drawing/2016/5/9/chartex" xmlns:cx4="http://schemas.microsoft.com/office/drawing/2016/5/10/chartex" xmlns:cx5="http://schemas.microsoft.com/office/drawing/2016/5/11/chartex" xmlns:cx6="http://schemas.microsoft.com/office/drawing/2016/5/12/chartex" xmlns:cx7="http://schemas.microsoft.com/office/drawing/2016/5/13/chartex" xmlns:cx8="http://schemas.microsoft.com/office/drawing/2016/5/14/chartex" xmlns:mc="http://schemas.openxmlformats.org/markup-compatibility/2006" xmlns:aink="http://schemas.microsoft.com/office/drawing/2016/ink" xmlns:am3d="http://schemas.microsoft.com/office/drawing/2017/model3d" xmlns:o="urn:schemas-microsoft-com:office:office" xmlns:r="http://schemas.openxmlformats.org/officeDocument/2006/relationships" xmlns:m="http://schemas.openxmlformats.org/officeDocument/2006/math" xmlns:v="urn:schemas-microsoft-com:vml" xmlns:wp14="http://schemas.microsoft.com/office/word/2010/wordprocessingDrawing" xmlns:wp="http://schemas.openxmlformats.org/drawingml/2006/wordprocessingDrawing" xmlns:w10="urn:schemas-microsoft-com:office:word" xmlns:w="http://schemas.openxmlformats.org/wordprocessingml/2006/main" xmlns:w14="http://schemas.microsoft.com/office/word/2010/wordml" xmlns:w15="http://schemas.microsoft.com/office/word/2012/wordml" xmlns:w16cex="http://schemas.microsoft.com/office/word/2018/wordml/cex" xmlns:w16cid="http://schemas.microsoft.com/office/word/2016/wordml/cid" xmlns:w16="http://schemas.microsoft.com/office/word/2018/wordml" xmlns:w16sdtdh="http://schemas.microsoft.com/office/word/2020/wordml/sdtdatahash" xmlns:w16se="http://schemas.microsoft.com/office/word/2015/wordml/symex" xmlns:wpg="http://schemas.microsoft.com/office/word/2010/wordprocessingGroup" xmlns:wpi="http://schemas.microsoft.com/office/word/2010/wordprocessingInk" xmlns:wne="http://schemas.microsoft.com/office/word/2006/wordml" xmlns:wps="http://schemas.microsoft.com/office/word/2010/wordprocessingShape" mc:Ignorable="w14 w15 w16se w16cid w16 w16cex w16sdtdh wp14">
+<w:document xmlns:wpc="http://schemas.microsoft.com/office/word/2010/wordprocessingCanvas" xmlns:cx="http://schemas.microsoft.com/office/drawing/2014/chartex" xmlns:cx1="http://schemas.microsoft.com/office/drawing/2015/9/8/chartex" xmlns:cx2="http://schemas.microsoft.com/office/drawing/2015/10/21/chartex" xmlns:cx3="http://schemas.microsoft.com/office/drawing/2016/5/9/chartex" xmlns:cx4="http://schemas.microsoft.com/office/drawing/2016/5/10/chartex" xmlns:cx5="http://schemas.microsoft.com/office/drawing/2016/5/11/chartex" xmlns:cx6="http://schemas.microsoft.com/office/drawing/2016/5/12/chartex" xmlns:cx7="http://schemas.microsoft.com/office/drawing/2016/5/13/chartex" xmlns:cx8="http://schemas.microsoft.com/office/drawing/2016/5/14/chartex" xmlns:mc="http://schemas.openxmlformats.org/markup-compatibility/2006" xmlns:aink="http://schemas.microsoft.com/office/drawing/2016/ink" xmlns:am3d="http://schemas.microsoft.com/office/drawing/2017/model3d" xmlns:o="urn:schemas-microsoft-com:office:office" xmlns:oel="http://schemas.microsoft.com/office/2019/extlst" xmlns:r="http://schemas.openxmlformats.org/officeDocument/2006/relationships" xmlns:m="http://schemas.openxmlformats.org/officeDocument/2006/math" xmlns:v="urn:schemas-microsoft-com:vml" xmlns:wp14="http://schemas.microsoft.com/office/word/2010/wordprocessingDrawing" xmlns:wp="http://schemas.openxmlformats.org/drawingml/2006/wordprocessingDrawing" xmlns:w10="urn:schemas-microsoft-com:office:word" xmlns:w="http://schemas.openxmlformats.org/wordprocessingml/2006/main" xmlns:w14="http://schemas.microsoft.com/office/word/2010/wordml" xmlns:w15="http://schemas.microsoft.com/office/word/2012/wordml" xmlns:w16cex="http://schemas.microsoft.com/office/word/2018/wordml/cex" xmlns:w16cid="http://schemas.microsoft.com/office/word/2016/wordml/cid" xmlns:w16="http://schemas.microsoft.com/office/word/2018/wordml" xmlns:w16sdtdh="http://schemas.microsoft.com/office/word/2020/wordml/sdtdatahash" xmlns:w16se="http://schemas.microsoft.com/office/word/2015/wordml/symex" xmlns:wpg="http://schemas.microsoft.com/office/word/2010/wordprocessingGroup" xmlns:wpi="http://schemas.microsoft.com/office/word/2010/wordprocessingInk" xmlns:wne="http://schemas.microsoft.com/office/word/2006/wordml" xmlns:wps="http://schemas.microsoft.com/office/word/2010/wordprocessingShape" mc:Ignorable="w14 w15 w16se w16cid w16 w16cex w16sdtdh wp14">
   <w:body>
     <w:p>
       <w:pPr>
@@ -352,7 +352,7 @@
                                 <w:szCs w:val="28"/>
                                 <w:lang w:eastAsia="es-EC"/>
                               </w:rPr>
-                              <w:t>11/10/2026</w:t>
+                              <w:t>26/10/2026</w:t>
                             </w:r>
                             <w:r>
                               <w:rPr>
@@ -388,7 +388,7 @@
           </mc:Choice>
           <mc:Fallback>
             <w:pict>
-              <v:rect w14:anchorId="2648791E" id="Rectángulo 1" o:spid="_x0000_s1026" style="position:absolute;left:0;text-align:left;margin-left:13.35pt;margin-top:208.1pt;width:416.25pt;height:441.6pt;z-index:251665408;visibility:visible;mso-wrap-style:square;mso-width-percent:0;mso-height-percent:0;mso-wrap-distance-left:9pt;mso-wrap-distance-top:0;mso-wrap-distance-right:9pt;mso-wrap-distance-bottom:0;mso-position-horizontal:absolute;mso-position-horizontal-relative:margin;mso-position-vertical:absolute;mso-position-vertical-relative:text;mso-width-percent:0;mso-height-percent:0;mso-width-relative:page;mso-height-relative:margin;v-text-anchor:middle" o:gfxdata="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" filled="f" stroked="f" strokeweight="2pt">
+              <v:rect w14:anchorId="2648791E" id="Rectángulo 1" o:spid="_x0000_s1026" style="position:absolute;left:0;text-align:left;margin-left:13.35pt;margin-top:208.1pt;width:416.25pt;height:441.6pt;z-index:251665408;visibility:visible;mso-wrap-style:square;mso-width-percent:0;mso-height-percent:0;mso-wrap-distance-left:9pt;mso-wrap-distance-top:0;mso-wrap-distance-right:9pt;mso-wrap-distance-bottom:0;mso-position-horizontal:absolute;mso-position-horizontal-relative:margin;mso-position-vertical:absolute;mso-position-vertical-relative:text;mso-width-percent:0;mso-height-percent:0;mso-width-relative:page;mso-height-relative:margin;v-text-anchor:middle" o:gfxdata="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" filled="f" stroked="f" strokeweight="2pt">
                 <v:textbox>
                   <w:txbxContent>
                     <w:p>
@@ -674,7 +674,7 @@
                           <w:szCs w:val="28"/>
                           <w:lang w:eastAsia="es-EC"/>
                         </w:rPr>
-                        <w:t>11/10/2026</w:t>
+                        <w:t>26/10/2026</w:t>
                       </w:r>
                       <w:r>
                         <w:rPr>
@@ -903,7 +903,6 @@
                                   <w:calendar w:val="gregorian"/>
                                 </w:date>
                               </w:sdtPr>
-                              <w:sdtEndPr/>
                               <w:sdtContent>
                                 <w:p>
                                   <w:pPr>
@@ -4180,7 +4179,7 @@
               </wp:anchor>
             </w:drawing>
           </mc:Choice>
-          <mc:Fallback xmlns:w16sdtfl="http://schemas.microsoft.com/office/word/2024/wordml/sdtformatlock" xmlns:w16du="http://schemas.microsoft.com/office/word/2023/wordml/word16du" xmlns:oel="http://schemas.microsoft.com/office/2019/extlst">
+          <mc:Fallback>
             <w:pict>
               <v:group w14:anchorId="5D8D6F89" id="Grupo 2" o:spid="_x0000_s1027" style="position:absolute;left:0;text-align:left;margin-left:78.6pt;margin-top:71.4pt;width:167.95pt;height:698.4pt;z-index:-251652096;mso-position-horizontal-relative:page;mso-position-vertical-relative:page" coordsize="21336,91257" o:gfxdata="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">
                 <v:rect id="Rectángulo 3" o:spid="_x0000_s1028" style="position:absolute;width:1945;height:91257;visibility:visible;mso-wrap-style:square;v-text-anchor:middle" o:gfxdata="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" fillcolor="#1f497d [3215]" stroked="f" strokeweight="2pt"/>
@@ -4220,7 +4219,7 @@
                         <w:sdtContent>
                           <w:p>
                             <w:pPr>
-                              <w:pStyle w:val="NoSpacing"/>
+                              <w:pStyle w:val="Sinespaciado"/>
                               <w:jc w:val="right"/>
                               <w:rPr>
                                 <w:color w:val="FFFFFF" w:themeColor="background1"/>
@@ -4376,7 +4375,6 @@
           <w:docPartUnique/>
         </w:docPartObj>
       </w:sdtPr>
-      <w:sdtEndPr/>
       <w:sdtContent>
         <w:p>
           <w:r>
@@ -13414,7 +13412,7 @@
               </wp:anchor>
             </w:drawing>
           </mc:Choice>
-          <mc:Fallback xmlns:w16sdtfl="http://schemas.microsoft.com/office/word/2024/wordml/sdtformatlock" xmlns:w16du="http://schemas.microsoft.com/office/word/2023/wordml/word16du" xmlns:oel="http://schemas.microsoft.com/office/2019/extlst">
+          <mc:Fallback xmlns:w16du="http://schemas.microsoft.com/office/word/2023/wordml/word16du" xmlns:w16sdtfl="http://schemas.microsoft.com/office/word/2024/wordml/sdtformatlock">
             <w:pict>
               <v:rect w14:anchorId="6C311DD8" id="Rectangle 1979" o:spid="_x0000_s1026" style="position:absolute;margin-left:113.45pt;margin-top:12.85pt;width:3.85pt;height:1.4pt;z-index:-251658240;visibility:visible;mso-wrap-style:square;mso-width-percent:0;mso-height-percent:0;mso-wrap-distance-left:9pt;mso-wrap-distance-top:0;mso-wrap-distance-right:9pt;mso-wrap-distance-bottom:0;mso-position-horizontal:absolute;mso-position-horizontal-relative:page;mso-position-vertical:absolute;mso-position-vertical-relative:text;mso-width-percent:0;mso-height-percent:0;mso-width-relative:page;mso-height-relative:page;v-text-anchor:top" o:gfxdata="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" fillcolor="black" stroked="f">
                 <w10:wrap anchorx="page"/>
@@ -25706,7 +25704,7 @@
 </file>
 
 <file path=word/endnotes.xml><?xml version="1.0" encoding="utf-8"?>
-<w:endnotes xmlns:wpc="http://schemas.microsoft.com/office/word/2010/wordprocessingCanvas" xmlns:cx="http://schemas.microsoft.com/office/drawing/2014/chartex" xmlns:cx1="http://schemas.microsoft.com/office/drawing/2015/9/8/chartex" xmlns:cx2="http://schemas.microsoft.com/office/drawing/2015/10/21/chartex" xmlns:cx3="http://schemas.microsoft.com/office/drawing/2016/5/9/chartex" xmlns:cx4="http://schemas.microsoft.com/office/drawing/2016/5/10/chartex" xmlns:cx5="http://schemas.microsoft.com/office/drawing/2016/5/11/chartex" xmlns:cx6="http://schemas.microsoft.com/office/drawing/2016/5/12/chartex" xmlns:cx7="http://schemas.microsoft.com/office/drawing/2016/5/13/chartex" xmlns:cx8="http://schemas.microsoft.com/office/drawing/2016/5/14/chartex" xmlns:mc="http://schemas.openxmlformats.org/markup-compatibility/2006" xmlns:aink="http://schemas.microsoft.com/office/drawing/2016/ink" xmlns:am3d="http://schemas.microsoft.com/office/drawing/2017/model3d" xmlns:o="urn:schemas-microsoft-com:office:office" xmlns:r="http://schemas.openxmlformats.org/officeDocument/2006/relationships" xmlns:m="http://schemas.openxmlformats.org/officeDocument/2006/math" xmlns:v="urn:schemas-microsoft-com:vml" xmlns:wp14="http://schemas.microsoft.com/office/word/2010/wordprocessingDrawing" xmlns:wp="http://schemas.openxmlformats.org/drawingml/2006/wordprocessingDrawing" xmlns:w10="urn:schemas-microsoft-com:office:word" xmlns:w="http://schemas.openxmlformats.org/wordprocessingml/2006/main" xmlns:w14="http://schemas.microsoft.com/office/word/2010/wordml" xmlns:w15="http://schemas.microsoft.com/office/word/2012/wordml" xmlns:w16cex="http://schemas.microsoft.com/office/word/2018/wordml/cex" xmlns:w16cid="http://schemas.microsoft.com/office/word/2016/wordml/cid" xmlns:w16="http://schemas.microsoft.com/office/word/2018/wordml" xmlns:w16sdtdh="http://schemas.microsoft.com/office/word/2020/wordml/sdtdatahash" xmlns:w16se="http://schemas.microsoft.com/office/word/2015/wordml/symex" xmlns:wpg="http://schemas.microsoft.com/office/word/2010/wordprocessingGroup" xmlns:wpi="http://schemas.microsoft.com/office/word/2010/wordprocessingInk" xmlns:wne="http://schemas.microsoft.com/office/word/2006/wordml" xmlns:wps="http://schemas.microsoft.com/office/word/2010/wordprocessingShape" mc:Ignorable="w14 w15 w16se w16cid w16 w16cex w16sdtdh wp14">
+<w:endnotes xmlns:wpc="http://schemas.microsoft.com/office/word/2010/wordprocessingCanvas" xmlns:cx="http://schemas.microsoft.com/office/drawing/2014/chartex" xmlns:cx1="http://schemas.microsoft.com/office/drawing/2015/9/8/chartex" xmlns:cx2="http://schemas.microsoft.com/office/drawing/2015/10/21/chartex" xmlns:cx3="http://schemas.microsoft.com/office/drawing/2016/5/9/chartex" xmlns:cx4="http://schemas.microsoft.com/office/drawing/2016/5/10/chartex" xmlns:cx5="http://schemas.microsoft.com/office/drawing/2016/5/11/chartex" xmlns:cx6="http://schemas.microsoft.com/office/drawing/2016/5/12/chartex" xmlns:cx7="http://schemas.microsoft.com/office/drawing/2016/5/13/chartex" xmlns:cx8="http://schemas.microsoft.com/office/drawing/2016/5/14/chartex" xmlns:mc="http://schemas.openxmlformats.org/markup-compatibility/2006" xmlns:aink="http://schemas.microsoft.com/office/drawing/2016/ink" xmlns:am3d="http://schemas.microsoft.com/office/drawing/2017/model3d" xmlns:o="urn:schemas-microsoft-com:office:office" xmlns:oel="http://schemas.microsoft.com/office/2019/extlst" xmlns:r="http://schemas.openxmlformats.org/officeDocument/2006/relationships" xmlns:m="http://schemas.openxmlformats.org/officeDocument/2006/math" xmlns:v="urn:schemas-microsoft-com:vml" xmlns:wp14="http://schemas.microsoft.com/office/word/2010/wordprocessingDrawing" xmlns:wp="http://schemas.openxmlformats.org/drawingml/2006/wordprocessingDrawing" xmlns:w10="urn:schemas-microsoft-com:office:word" xmlns:w="http://schemas.openxmlformats.org/wordprocessingml/2006/main" xmlns:w14="http://schemas.microsoft.com/office/word/2010/wordml" xmlns:w15="http://schemas.microsoft.com/office/word/2012/wordml" xmlns:w16cex="http://schemas.microsoft.com/office/word/2018/wordml/cex" xmlns:w16cid="http://schemas.microsoft.com/office/word/2016/wordml/cid" xmlns:w16="http://schemas.microsoft.com/office/word/2018/wordml" xmlns:w16sdtdh="http://schemas.microsoft.com/office/word/2020/wordml/sdtdatahash" xmlns:w16se="http://schemas.microsoft.com/office/word/2015/wordml/symex" xmlns:wpg="http://schemas.microsoft.com/office/word/2010/wordprocessingGroup" xmlns:wpi="http://schemas.microsoft.com/office/word/2010/wordprocessingInk" xmlns:wne="http://schemas.microsoft.com/office/word/2006/wordml" xmlns:wps="http://schemas.microsoft.com/office/word/2010/wordprocessingShape" mc:Ignorable="w14 w15 w16se w16cid w16 w16cex w16sdtdh wp14">
   <w:endnote w:type="separator" w:id="-1">
     <w:p>
       <w:r>
@@ -25732,7 +25730,7 @@
 </file>
 
 <file path=word/footer1.xml><?xml version="1.0" encoding="utf-8"?>
-<w:ftr xmlns:wpc="http://schemas.microsoft.com/office/word/2010/wordprocessingCanvas" xmlns:cx="http://schemas.microsoft.com/office/drawing/2014/chartex" xmlns:cx1="http://schemas.microsoft.com/office/drawing/2015/9/8/chartex" xmlns:cx2="http://schemas.microsoft.com/office/drawing/2015/10/21/chartex" xmlns:cx3="http://schemas.microsoft.com/office/drawing/2016/5/9/chartex" xmlns:cx4="http://schemas.microsoft.com/office/drawing/2016/5/10/chartex" xmlns:cx5="http://schemas.microsoft.com/office/drawing/2016/5/11/chartex" xmlns:cx6="http://schemas.microsoft.com/office/drawing/2016/5/12/chartex" xmlns:cx7="http://schemas.microsoft.com/office/drawing/2016/5/13/chartex" xmlns:cx8="http://schemas.microsoft.com/office/drawing/2016/5/14/chartex" xmlns:mc="http://schemas.openxmlformats.org/markup-compatibility/2006" xmlns:aink="http://schemas.microsoft.com/office/drawing/2016/ink" xmlns:am3d="http://schemas.microsoft.com/office/drawing/2017/model3d" xmlns:o="urn:schemas-microsoft-com:office:office" xmlns:r="http://schemas.openxmlformats.org/officeDocument/2006/relationships" xmlns:m="http://schemas.openxmlformats.org/officeDocument/2006/math" xmlns:v="urn:schemas-microsoft-com:vml" xmlns:wp14="http://schemas.microsoft.com/office/word/2010/wordprocessingDrawing" xmlns:wp="http://schemas.openxmlformats.org/drawingml/2006/wordprocessingDrawing" xmlns:w10="urn:schemas-microsoft-com:office:word" xmlns:w="http://schemas.openxmlformats.org/wordprocessingml/2006/main" xmlns:w14="http://schemas.microsoft.com/office/word/2010/wordml" xmlns:w15="http://schemas.microsoft.com/office/word/2012/wordml" xmlns:w16cex="http://schemas.microsoft.com/office/word/2018/wordml/cex" xmlns:w16cid="http://schemas.microsoft.com/office/word/2016/wordml/cid" xmlns:w16="http://schemas.microsoft.com/office/word/2018/wordml" xmlns:w16sdtdh="http://schemas.microsoft.com/office/word/2020/wordml/sdtdatahash" xmlns:w16se="http://schemas.microsoft.com/office/word/2015/wordml/symex" xmlns:wpg="http://schemas.microsoft.com/office/word/2010/wordprocessingGroup" xmlns:wpi="http://schemas.microsoft.com/office/word/2010/wordprocessingInk" xmlns:wne="http://schemas.microsoft.com/office/word/2006/wordml" xmlns:wps="http://schemas.microsoft.com/office/word/2010/wordprocessingShape" mc:Ignorable="w14 w15 w16se w16cid w16 w16cex w16sdtdh wp14">
+<w:ftr xmlns:wpc="http://schemas.microsoft.com/office/word/2010/wordprocessingCanvas" xmlns:cx="http://schemas.microsoft.com/office/drawing/2014/chartex" xmlns:cx1="http://schemas.microsoft.com/office/drawing/2015/9/8/chartex" xmlns:cx2="http://schemas.microsoft.com/office/drawing/2015/10/21/chartex" xmlns:cx3="http://schemas.microsoft.com/office/drawing/2016/5/9/chartex" xmlns:cx4="http://schemas.microsoft.com/office/drawing/2016/5/10/chartex" xmlns:cx5="http://schemas.microsoft.com/office/drawing/2016/5/11/chartex" xmlns:cx6="http://schemas.microsoft.com/office/drawing/2016/5/12/chartex" xmlns:cx7="http://schemas.microsoft.com/office/drawing/2016/5/13/chartex" xmlns:cx8="http://schemas.microsoft.com/office/drawing/2016/5/14/chartex" xmlns:mc="http://schemas.openxmlformats.org/markup-compatibility/2006" xmlns:aink="http://schemas.microsoft.com/office/drawing/2016/ink" xmlns:am3d="http://schemas.microsoft.com/office/drawing/2017/model3d" xmlns:o="urn:schemas-microsoft-com:office:office" xmlns:oel="http://schemas.microsoft.com/office/2019/extlst" xmlns:r="http://schemas.openxmlformats.org/officeDocument/2006/relationships" xmlns:m="http://schemas.openxmlformats.org/officeDocument/2006/math" xmlns:v="urn:schemas-microsoft-com:vml" xmlns:wp14="http://schemas.microsoft.com/office/word/2010/wordprocessingDrawing" xmlns:wp="http://schemas.openxmlformats.org/drawingml/2006/wordprocessingDrawing" xmlns:w10="urn:schemas-microsoft-com:office:word" xmlns:w="http://schemas.openxmlformats.org/wordprocessingml/2006/main" xmlns:w14="http://schemas.microsoft.com/office/word/2010/wordml" xmlns:w15="http://schemas.microsoft.com/office/word/2012/wordml" xmlns:w16cex="http://schemas.microsoft.com/office/word/2018/wordml/cex" xmlns:w16cid="http://schemas.microsoft.com/office/word/2016/wordml/cid" xmlns:w16="http://schemas.microsoft.com/office/word/2018/wordml" xmlns:w16sdtdh="http://schemas.microsoft.com/office/word/2020/wordml/sdtdatahash" xmlns:w16se="http://schemas.microsoft.com/office/word/2015/wordml/symex" xmlns:wpg="http://schemas.microsoft.com/office/word/2010/wordprocessingGroup" xmlns:wpi="http://schemas.microsoft.com/office/word/2010/wordprocessingInk" xmlns:wne="http://schemas.microsoft.com/office/word/2006/wordml" xmlns:wps="http://schemas.microsoft.com/office/word/2010/wordprocessingShape" mc:Ignorable="w14 w15 w16se w16cid w16 w16cex w16sdtdh wp14">
   <w:sdt>
     <w:sdtPr>
       <w:id w:val="910883225"/>
@@ -25741,7 +25739,6 @@
         <w:docPartUnique/>
       </w:docPartObj>
     </w:sdtPr>
-    <w:sdtEndPr/>
     <w:sdtContent>
       <w:p>
         <w:pPr>
@@ -25778,7 +25775,7 @@
 </file>
 
 <file path=word/footer2.xml><?xml version="1.0" encoding="utf-8"?>
-<w:ftr xmlns:wpc="http://schemas.microsoft.com/office/word/2010/wordprocessingCanvas" xmlns:cx="http://schemas.microsoft.com/office/drawing/2014/chartex" xmlns:cx1="http://schemas.microsoft.com/office/drawing/2015/9/8/chartex" xmlns:cx2="http://schemas.microsoft.com/office/drawing/2015/10/21/chartex" xmlns:cx3="http://schemas.microsoft.com/office/drawing/2016/5/9/chartex" xmlns:cx4="http://schemas.microsoft.com/office/drawing/2016/5/10/chartex" xmlns:cx5="http://schemas.microsoft.com/office/drawing/2016/5/11/chartex" xmlns:cx6="http://schemas.microsoft.com/office/drawing/2016/5/12/chartex" xmlns:cx7="http://schemas.microsoft.com/office/drawing/2016/5/13/chartex" xmlns:cx8="http://schemas.microsoft.com/office/drawing/2016/5/14/chartex" xmlns:mc="http://schemas.openxmlformats.org/markup-compatibility/2006" xmlns:aink="http://schemas.microsoft.com/office/drawing/2016/ink" xmlns:am3d="http://schemas.microsoft.com/office/drawing/2017/model3d" xmlns:o="urn:schemas-microsoft-com:office:office" xmlns:r="http://schemas.openxmlformats.org/officeDocument/2006/relationships" xmlns:m="http://schemas.openxmlformats.org/officeDocument/2006/math" xmlns:v="urn:schemas-microsoft-com:vml" xmlns:wp14="http://schemas.microsoft.com/office/word/2010/wordprocessingDrawing" xmlns:wp="http://schemas.openxmlformats.org/drawingml/2006/wordprocessingDrawing" xmlns:w10="urn:schemas-microsoft-com:office:word" xmlns:w="http://schemas.openxmlformats.org/wordprocessingml/2006/main" xmlns:w14="http://schemas.microsoft.com/office/word/2010/wordml" xmlns:w15="http://schemas.microsoft.com/office/word/2012/wordml" xmlns:w16cex="http://schemas.microsoft.com/office/word/2018/wordml/cex" xmlns:w16cid="http://schemas.microsoft.com/office/word/2016/wordml/cid" xmlns:w16="http://schemas.microsoft.com/office/word/2018/wordml" xmlns:w16sdtdh="http://schemas.microsoft.com/office/word/2020/wordml/sdtdatahash" xmlns:w16se="http://schemas.microsoft.com/office/word/2015/wordml/symex" xmlns:wpg="http://schemas.microsoft.com/office/word/2010/wordprocessingGroup" xmlns:wpi="http://schemas.microsoft.com/office/word/2010/wordprocessingInk" xmlns:wne="http://schemas.microsoft.com/office/word/2006/wordml" xmlns:wps="http://schemas.microsoft.com/office/word/2010/wordprocessingShape" mc:Ignorable="w14 w15 w16se w16cid w16 w16cex w16sdtdh wp14">
+<w:ftr xmlns:wpc="http://schemas.microsoft.com/office/word/2010/wordprocessingCanvas" xmlns:cx="http://schemas.microsoft.com/office/drawing/2014/chartex" xmlns:cx1="http://schemas.microsoft.com/office/drawing/2015/9/8/chartex" xmlns:cx2="http://schemas.microsoft.com/office/drawing/2015/10/21/chartex" xmlns:cx3="http://schemas.microsoft.com/office/drawing/2016/5/9/chartex" xmlns:cx4="http://schemas.microsoft.com/office/drawing/2016/5/10/chartex" xmlns:cx5="http://schemas.microsoft.com/office/drawing/2016/5/11/chartex" xmlns:cx6="http://schemas.microsoft.com/office/drawing/2016/5/12/chartex" xmlns:cx7="http://schemas.microsoft.com/office/drawing/2016/5/13/chartex" xmlns:cx8="http://schemas.microsoft.com/office/drawing/2016/5/14/chartex" xmlns:mc="http://schemas.openxmlformats.org/markup-compatibility/2006" xmlns:aink="http://schemas.microsoft.com/office/drawing/2016/ink" xmlns:am3d="http://schemas.microsoft.com/office/drawing/2017/model3d" xmlns:o="urn:schemas-microsoft-com:office:office" xmlns:oel="http://schemas.microsoft.com/office/2019/extlst" xmlns:r="http://schemas.openxmlformats.org/officeDocument/2006/relationships" xmlns:m="http://schemas.openxmlformats.org/officeDocument/2006/math" xmlns:v="urn:schemas-microsoft-com:vml" xmlns:wp14="http://schemas.microsoft.com/office/word/2010/wordprocessingDrawing" xmlns:wp="http://schemas.openxmlformats.org/drawingml/2006/wordprocessingDrawing" xmlns:w10="urn:schemas-microsoft-com:office:word" xmlns:w="http://schemas.openxmlformats.org/wordprocessingml/2006/main" xmlns:w14="http://schemas.microsoft.com/office/word/2010/wordml" xmlns:w15="http://schemas.microsoft.com/office/word/2012/wordml" xmlns:w16cex="http://schemas.microsoft.com/office/word/2018/wordml/cex" xmlns:w16cid="http://schemas.microsoft.com/office/word/2016/wordml/cid" xmlns:w16="http://schemas.microsoft.com/office/word/2018/wordml" xmlns:w16sdtdh="http://schemas.microsoft.com/office/word/2020/wordml/sdtdatahash" xmlns:w16se="http://schemas.microsoft.com/office/word/2015/wordml/symex" xmlns:wpg="http://schemas.microsoft.com/office/word/2010/wordprocessingGroup" xmlns:wpi="http://schemas.microsoft.com/office/word/2010/wordprocessingInk" xmlns:wne="http://schemas.microsoft.com/office/word/2006/wordml" xmlns:wps="http://schemas.microsoft.com/office/word/2010/wordprocessingShape" mc:Ignorable="w14 w15 w16se w16cid w16 w16cex w16sdtdh wp14">
   <w:p>
     <w:pPr>
       <w:pStyle w:val="Piedepgina"/>
@@ -25788,7 +25785,7 @@
 </file>
 
 <file path=word/footnotes.xml><?xml version="1.0" encoding="utf-8"?>
-<w:footnotes xmlns:wpc="http://schemas.microsoft.com/office/word/2010/wordprocessingCanvas" xmlns:cx="http://schemas.microsoft.com/office/drawing/2014/chartex" xmlns:cx1="http://schemas.microsoft.com/office/drawing/2015/9/8/chartex" xmlns:cx2="http://schemas.microsoft.com/office/drawing/2015/10/21/chartex" xmlns:cx3="http://schemas.microsoft.com/office/drawing/2016/5/9/chartex" xmlns:cx4="http://schemas.microsoft.com/office/drawing/2016/5/10/chartex" xmlns:cx5="http://schemas.microsoft.com/office/drawing/2016/5/11/chartex" xmlns:cx6="http://schemas.microsoft.com/office/drawing/2016/5/12/chartex" xmlns:cx7="http://schemas.microsoft.com/office/drawing/2016/5/13/chartex" xmlns:cx8="http://schemas.microsoft.com/office/drawing/2016/5/14/chartex" xmlns:mc="http://schemas.openxmlformats.org/markup-compatibility/2006" xmlns:aink="http://schemas.microsoft.com/office/drawing/2016/ink" xmlns:am3d="http://schemas.microsoft.com/office/drawing/2017/model3d" xmlns:o="urn:schemas-microsoft-com:office:office" xmlns:r="http://schemas.openxmlformats.org/officeDocument/2006/relationships" xmlns:m="http://schemas.openxmlformats.org/officeDocument/2006/math" xmlns:v="urn:schemas-microsoft-com:vml" xmlns:wp14="http://schemas.microsoft.com/office/word/2010/wordprocessingDrawing" xmlns:wp="http://schemas.openxmlformats.org/drawingml/2006/wordprocessingDrawing" xmlns:w10="urn:schemas-microsoft-com:office:word" xmlns:w="http://schemas.openxmlformats.org/wordprocessingml/2006/main" xmlns:w14="http://schemas.microsoft.com/office/word/2010/wordml" xmlns:w15="http://schemas.microsoft.com/office/word/2012/wordml" xmlns:w16cex="http://schemas.microsoft.com/office/word/2018/wordml/cex" xmlns:w16cid="http://schemas.microsoft.com/office/word/2016/wordml/cid" xmlns:w16="http://schemas.microsoft.com/office/word/2018/wordml" xmlns:w16sdtdh="http://schemas.microsoft.com/office/word/2020/wordml/sdtdatahash" xmlns:w16se="http://schemas.microsoft.com/office/word/2015/wordml/symex" xmlns:wpg="http://schemas.microsoft.com/office/word/2010/wordprocessingGroup" xmlns:wpi="http://schemas.microsoft.com/office/word/2010/wordprocessingInk" xmlns:wne="http://schemas.microsoft.com/office/word/2006/wordml" xmlns:wps="http://schemas.microsoft.com/office/word/2010/wordprocessingShape" mc:Ignorable="w14 w15 w16se w16cid w16 w16cex w16sdtdh wp14">
+<w:footnotes xmlns:wpc="http://schemas.microsoft.com/office/word/2010/wordprocessingCanvas" xmlns:cx="http://schemas.microsoft.com/office/drawing/2014/chartex" xmlns:cx1="http://schemas.microsoft.com/office/drawing/2015/9/8/chartex" xmlns:cx2="http://schemas.microsoft.com/office/drawing/2015/10/21/chartex" xmlns:cx3="http://schemas.microsoft.com/office/drawing/2016/5/9/chartex" xmlns:cx4="http://schemas.microsoft.com/office/drawing/2016/5/10/chartex" xmlns:cx5="http://schemas.microsoft.com/office/drawing/2016/5/11/chartex" xmlns:cx6="http://schemas.microsoft.com/office/drawing/2016/5/12/chartex" xmlns:cx7="http://schemas.microsoft.com/office/drawing/2016/5/13/chartex" xmlns:cx8="http://schemas.microsoft.com/office/drawing/2016/5/14/chartex" xmlns:mc="http://schemas.openxmlformats.org/markup-compatibility/2006" xmlns:aink="http://schemas.microsoft.com/office/drawing/2016/ink" xmlns:am3d="http://schemas.microsoft.com/office/drawing/2017/model3d" xmlns:o="urn:schemas-microsoft-com:office:office" xmlns:oel="http://schemas.microsoft.com/office/2019/extlst" xmlns:r="http://schemas.openxmlformats.org/officeDocument/2006/relationships" xmlns:m="http://schemas.openxmlformats.org/officeDocument/2006/math" xmlns:v="urn:schemas-microsoft-com:vml" xmlns:wp14="http://schemas.microsoft.com/office/word/2010/wordprocessingDrawing" xmlns:wp="http://schemas.openxmlformats.org/drawingml/2006/wordprocessingDrawing" xmlns:w10="urn:schemas-microsoft-com:office:word" xmlns:w="http://schemas.openxmlformats.org/wordprocessingml/2006/main" xmlns:w14="http://schemas.microsoft.com/office/word/2010/wordml" xmlns:w15="http://schemas.microsoft.com/office/word/2012/wordml" xmlns:w16cex="http://schemas.microsoft.com/office/word/2018/wordml/cex" xmlns:w16cid="http://schemas.microsoft.com/office/word/2016/wordml/cid" xmlns:w16="http://schemas.microsoft.com/office/word/2018/wordml" xmlns:w16sdtdh="http://schemas.microsoft.com/office/word/2020/wordml/sdtdatahash" xmlns:w16se="http://schemas.microsoft.com/office/word/2015/wordml/symex" xmlns:wpg="http://schemas.microsoft.com/office/word/2010/wordprocessingGroup" xmlns:wpi="http://schemas.microsoft.com/office/word/2010/wordprocessingInk" xmlns:wne="http://schemas.microsoft.com/office/word/2006/wordml" xmlns:wps="http://schemas.microsoft.com/office/word/2010/wordprocessingShape" mc:Ignorable="w14 w15 w16se w16cid w16 w16cex w16sdtdh wp14">
   <w:footnote w:type="separator" w:id="-1">
     <w:p>
       <w:r>
@@ -25814,7 +25811,7 @@
 </file>
 
 <file path=word/header1.xml><?xml version="1.0" encoding="utf-8"?>
-<w:hdr xmlns:wpc="http://schemas.microsoft.com/office/word/2010/wordprocessingCanvas" xmlns:cx="http://schemas.microsoft.com/office/drawing/2014/chartex" xmlns:cx1="http://schemas.microsoft.com/office/drawing/2015/9/8/chartex" xmlns:cx2="http://schemas.microsoft.com/office/drawing/2015/10/21/chartex" xmlns:cx3="http://schemas.microsoft.com/office/drawing/2016/5/9/chartex" xmlns:cx4="http://schemas.microsoft.com/office/drawing/2016/5/10/chartex" xmlns:cx5="http://schemas.microsoft.com/office/drawing/2016/5/11/chartex" xmlns:cx6="http://schemas.microsoft.com/office/drawing/2016/5/12/chartex" xmlns:cx7="http://schemas.microsoft.com/office/drawing/2016/5/13/chartex" xmlns:cx8="http://schemas.microsoft.com/office/drawing/2016/5/14/chartex" xmlns:mc="http://schemas.openxmlformats.org/markup-compatibility/2006" xmlns:aink="http://schemas.microsoft.com/office/drawing/2016/ink" xmlns:am3d="http://schemas.microsoft.com/office/drawing/2017/model3d" xmlns:o="urn:schemas-microsoft-com:office:office" xmlns:r="http://schemas.openxmlformats.org/officeDocument/2006/relationships" xmlns:m="http://schemas.openxmlformats.org/officeDocument/2006/math" xmlns:v="urn:schemas-microsoft-com:vml" xmlns:wp14="http://schemas.microsoft.com/office/word/2010/wordprocessingDrawing" xmlns:wp="http://schemas.openxmlformats.org/drawingml/2006/wordprocessingDrawing" xmlns:w10="urn:schemas-microsoft-com:office:word" xmlns:w="http://schemas.openxmlformats.org/wordprocessingml/2006/main" xmlns:w14="http://schemas.microsoft.com/office/word/2010/wordml" xmlns:w15="http://schemas.microsoft.com/office/word/2012/wordml" xmlns:w16cex="http://schemas.microsoft.com/office/word/2018/wordml/cex" xmlns:w16cid="http://schemas.microsoft.com/office/word/2016/wordml/cid" xmlns:w16="http://schemas.microsoft.com/office/word/2018/wordml" xmlns:w16sdtdh="http://schemas.microsoft.com/office/word/2020/wordml/sdtdatahash" xmlns:w16se="http://schemas.microsoft.com/office/word/2015/wordml/symex" xmlns:wpg="http://schemas.microsoft.com/office/word/2010/wordprocessingGroup" xmlns:wpi="http://schemas.microsoft.com/office/word/2010/wordprocessingInk" xmlns:wne="http://schemas.microsoft.com/office/word/2006/wordml" xmlns:wps="http://schemas.microsoft.com/office/word/2010/wordprocessingShape" mc:Ignorable="w14 w15 w16se w16cid w16 w16cex w16sdtdh wp14">
+<w:hdr xmlns:wpc="http://schemas.microsoft.com/office/word/2010/wordprocessingCanvas" xmlns:cx="http://schemas.microsoft.com/office/drawing/2014/chartex" xmlns:cx1="http://schemas.microsoft.com/office/drawing/2015/9/8/chartex" xmlns:cx2="http://schemas.microsoft.com/office/drawing/2015/10/21/chartex" xmlns:cx3="http://schemas.microsoft.com/office/drawing/2016/5/9/chartex" xmlns:cx4="http://schemas.microsoft.com/office/drawing/2016/5/10/chartex" xmlns:cx5="http://schemas.microsoft.com/office/drawing/2016/5/11/chartex" xmlns:cx6="http://schemas.microsoft.com/office/drawing/2016/5/12/chartex" xmlns:cx7="http://schemas.microsoft.com/office/drawing/2016/5/13/chartex" xmlns:cx8="http://schemas.microsoft.com/office/drawing/2016/5/14/chartex" xmlns:mc="http://schemas.openxmlformats.org/markup-compatibility/2006" xmlns:aink="http://schemas.microsoft.com/office/drawing/2016/ink" xmlns:am3d="http://schemas.microsoft.com/office/drawing/2017/model3d" xmlns:o="urn:schemas-microsoft-com:office:office" xmlns:oel="http://schemas.microsoft.com/office/2019/extlst" xmlns:r="http://schemas.openxmlformats.org/officeDocument/2006/relationships" xmlns:m="http://schemas.openxmlformats.org/officeDocument/2006/math" xmlns:v="urn:schemas-microsoft-com:vml" xmlns:wp14="http://schemas.microsoft.com/office/word/2010/wordprocessingDrawing" xmlns:wp="http://schemas.openxmlformats.org/drawingml/2006/wordprocessingDrawing" xmlns:w10="urn:schemas-microsoft-com:office:word" xmlns:w="http://schemas.openxmlformats.org/wordprocessingml/2006/main" xmlns:w14="http://schemas.microsoft.com/office/word/2010/wordml" xmlns:w15="http://schemas.microsoft.com/office/word/2012/wordml" xmlns:w16cex="http://schemas.microsoft.com/office/word/2018/wordml/cex" xmlns:w16cid="http://schemas.microsoft.com/office/word/2016/wordml/cid" xmlns:w16="http://schemas.microsoft.com/office/word/2018/wordml" xmlns:w16sdtdh="http://schemas.microsoft.com/office/word/2020/wordml/sdtdatahash" xmlns:w16se="http://schemas.microsoft.com/office/word/2015/wordml/symex" xmlns:wpg="http://schemas.microsoft.com/office/word/2010/wordprocessingGroup" xmlns:wpi="http://schemas.microsoft.com/office/word/2010/wordprocessingInk" xmlns:wne="http://schemas.microsoft.com/office/word/2006/wordml" xmlns:wps="http://schemas.microsoft.com/office/word/2010/wordprocessingShape" mc:Ignorable="w14 w15 w16se w16cid w16 w16cex w16sdtdh wp14">
   <w:p>
     <w:pPr>
       <w:pStyle w:val="Encabezado"/>
@@ -25824,7 +25821,7 @@
 </file>
 
 <file path=word/numbering.xml><?xml version="1.0" encoding="utf-8"?>
-<w:numbering xmlns:wpc="http://schemas.microsoft.com/office/word/2010/wordprocessingCanvas" xmlns:cx="http://schemas.microsoft.com/office/drawing/2014/chartex" xmlns:cx1="http://schemas.microsoft.com/office/drawing/2015/9/8/chartex" xmlns:cx2="http://schemas.microsoft.com/office/drawing/2015/10/21/chartex" xmlns:cx3="http://schemas.microsoft.com/office/drawing/2016/5/9/chartex" xmlns:cx4="http://schemas.microsoft.com/office/drawing/2016/5/10/chartex" xmlns:cx5="http://schemas.microsoft.com/office/drawing/2016/5/11/chartex" xmlns:cx6="http://schemas.microsoft.com/office/drawing/2016/5/12/chartex" xmlns:cx7="http://schemas.microsoft.com/office/drawing/2016/5/13/chartex" xmlns:cx8="http://schemas.microsoft.com/office/drawing/2016/5/14/chartex" xmlns:mc="http://schemas.openxmlformats.org/markup-compatibility/2006" xmlns:aink="http://schemas.microsoft.com/office/drawing/2016/ink" xmlns:am3d="http://schemas.microsoft.com/office/drawing/2017/model3d" xmlns:o="urn:schemas-microsoft-com:office:office" xmlns:r="http://schemas.openxmlformats.org/officeDocument/2006/relationships" xmlns:m="http://schemas.openxmlformats.org/officeDocument/2006/math" xmlns:v="urn:schemas-microsoft-com:vml" xmlns:wp14="http://schemas.microsoft.com/office/word/2010/wordprocessingDrawing" xmlns:wp="http://schemas.openxmlformats.org/drawingml/2006/wordprocessingDrawing" xmlns:w10="urn:schemas-microsoft-com:office:word" xmlns:w="http://schemas.openxmlformats.org/wordprocessingml/2006/main" xmlns:w14="http://schemas.microsoft.com/office/word/2010/wordml" xmlns:w15="http://schemas.microsoft.com/office/word/2012/wordml" xmlns:w16cex="http://schemas.microsoft.com/office/word/2018/wordml/cex" xmlns:w16cid="http://schemas.microsoft.com/office/word/2016/wordml/cid" xmlns:w16="http://schemas.microsoft.com/office/word/2018/wordml" xmlns:w16sdtdh="http://schemas.microsoft.com/office/word/2020/wordml/sdtdatahash" xmlns:w16se="http://schemas.microsoft.com/office/word/2015/wordml/symex" xmlns:wpg="http://schemas.microsoft.com/office/word/2010/wordprocessingGroup" xmlns:wpi="http://schemas.microsoft.com/office/word/2010/wordprocessingInk" xmlns:wne="http://schemas.microsoft.com/office/word/2006/wordml" xmlns:wps="http://schemas.microsoft.com/office/word/2010/wordprocessingShape" mc:Ignorable="w14 w15 w16se w16cid w16 w16cex w16sdtdh wp14">
+<w:numbering xmlns:wpc="http://schemas.microsoft.com/office/word/2010/wordprocessingCanvas" xmlns:cx="http://schemas.microsoft.com/office/drawing/2014/chartex" xmlns:cx1="http://schemas.microsoft.com/office/drawing/2015/9/8/chartex" xmlns:cx2="http://schemas.microsoft.com/office/drawing/2015/10/21/chartex" xmlns:cx3="http://schemas.microsoft.com/office/drawing/2016/5/9/chartex" xmlns:cx4="http://schemas.microsoft.com/office/drawing/2016/5/10/chartex" xmlns:cx5="http://schemas.microsoft.com/office/drawing/2016/5/11/chartex" xmlns:cx6="http://schemas.microsoft.com/office/drawing/2016/5/12/chartex" xmlns:cx7="http://schemas.microsoft.com/office/drawing/2016/5/13/chartex" xmlns:cx8="http://schemas.microsoft.com/office/drawing/2016/5/14/chartex" xmlns:mc="http://schemas.openxmlformats.org/markup-compatibility/2006" xmlns:aink="http://schemas.microsoft.com/office/drawing/2016/ink" xmlns:am3d="http://schemas.microsoft.com/office/drawing/2017/model3d" xmlns:o="urn:schemas-microsoft-com:office:office" xmlns:oel="http://schemas.microsoft.com/office/2019/extlst" xmlns:r="http://schemas.openxmlformats.org/officeDocument/2006/relationships" xmlns:m="http://schemas.openxmlformats.org/officeDocument/2006/math" xmlns:v="urn:schemas-microsoft-com:vml" xmlns:wp14="http://schemas.microsoft.com/office/word/2010/wordprocessingDrawing" xmlns:wp="http://schemas.openxmlformats.org/drawingml/2006/wordprocessingDrawing" xmlns:w10="urn:schemas-microsoft-com:office:word" xmlns:w="http://schemas.openxmlformats.org/wordprocessingml/2006/main" xmlns:w14="http://schemas.microsoft.com/office/word/2010/wordml" xmlns:w15="http://schemas.microsoft.com/office/word/2012/wordml" xmlns:w16cex="http://schemas.microsoft.com/office/word/2018/wordml/cex" xmlns:w16cid="http://schemas.microsoft.com/office/word/2016/wordml/cid" xmlns:w16="http://schemas.microsoft.com/office/word/2018/wordml" xmlns:w16sdtdh="http://schemas.microsoft.com/office/word/2020/wordml/sdtdatahash" xmlns:w16se="http://schemas.microsoft.com/office/word/2015/wordml/symex" xmlns:wpg="http://schemas.microsoft.com/office/word/2010/wordprocessingGroup" xmlns:wpi="http://schemas.microsoft.com/office/word/2010/wordprocessingInk" xmlns:wne="http://schemas.microsoft.com/office/word/2006/wordml" xmlns:wps="http://schemas.microsoft.com/office/word/2010/wordprocessingShape" mc:Ignorable="w14 w15 w16se w16cid w16 w16cex w16sdtdh wp14">
   <w:abstractNum w:abstractNumId="0" w15:restartNumberingAfterBreak="0">
     <w:nsid w:val="023F627C"/>
     <w:multiLevelType w:val="hybridMultilevel"/>
@@ -30739,133 +30736,133 @@
       </w:rPr>
     </w:lvl>
   </w:abstractNum>
-  <w:num w:numId="1">
+  <w:num w:numId="1" w16cid:durableId="1807234311">
     <w:abstractNumId w:val="42"/>
   </w:num>
-  <w:num w:numId="2">
+  <w:num w:numId="2" w16cid:durableId="89745742">
     <w:abstractNumId w:val="18"/>
   </w:num>
-  <w:num w:numId="3">
+  <w:num w:numId="3" w16cid:durableId="1723288507">
     <w:abstractNumId w:val="34"/>
   </w:num>
-  <w:num w:numId="4">
+  <w:num w:numId="4" w16cid:durableId="1100028623">
     <w:abstractNumId w:val="39"/>
   </w:num>
-  <w:num w:numId="5">
+  <w:num w:numId="5" w16cid:durableId="1603492353">
     <w:abstractNumId w:val="40"/>
   </w:num>
-  <w:num w:numId="6">
+  <w:num w:numId="6" w16cid:durableId="568347975">
     <w:abstractNumId w:val="41"/>
   </w:num>
-  <w:num w:numId="7">
+  <w:num w:numId="7" w16cid:durableId="270094438">
     <w:abstractNumId w:val="10"/>
   </w:num>
-  <w:num w:numId="8">
+  <w:num w:numId="8" w16cid:durableId="808669526">
     <w:abstractNumId w:val="17"/>
   </w:num>
-  <w:num w:numId="9">
+  <w:num w:numId="9" w16cid:durableId="899292315">
     <w:abstractNumId w:val="30"/>
   </w:num>
-  <w:num w:numId="10">
+  <w:num w:numId="10" w16cid:durableId="2069959322">
     <w:abstractNumId w:val="36"/>
   </w:num>
-  <w:num w:numId="11">
+  <w:num w:numId="11" w16cid:durableId="9452524">
     <w:abstractNumId w:val="38"/>
   </w:num>
-  <w:num w:numId="12">
+  <w:num w:numId="12" w16cid:durableId="1228032843">
     <w:abstractNumId w:val="9"/>
   </w:num>
-  <w:num w:numId="13">
+  <w:num w:numId="13" w16cid:durableId="2085298362">
     <w:abstractNumId w:val="20"/>
   </w:num>
-  <w:num w:numId="14">
+  <w:num w:numId="14" w16cid:durableId="1917859325">
     <w:abstractNumId w:val="14"/>
   </w:num>
-  <w:num w:numId="15">
+  <w:num w:numId="15" w16cid:durableId="238489878">
     <w:abstractNumId w:val="11"/>
   </w:num>
-  <w:num w:numId="16">
+  <w:num w:numId="16" w16cid:durableId="289750075">
     <w:abstractNumId w:val="3"/>
   </w:num>
-  <w:num w:numId="17">
+  <w:num w:numId="17" w16cid:durableId="75979902">
     <w:abstractNumId w:val="33"/>
   </w:num>
-  <w:num w:numId="18">
+  <w:num w:numId="18" w16cid:durableId="1384017304">
     <w:abstractNumId w:val="27"/>
   </w:num>
-  <w:num w:numId="19">
+  <w:num w:numId="19" w16cid:durableId="420562126">
     <w:abstractNumId w:val="12"/>
   </w:num>
-  <w:num w:numId="20">
+  <w:num w:numId="20" w16cid:durableId="772628752">
     <w:abstractNumId w:val="19"/>
   </w:num>
-  <w:num w:numId="21">
+  <w:num w:numId="21" w16cid:durableId="279580673">
     <w:abstractNumId w:val="2"/>
   </w:num>
-  <w:num w:numId="22">
+  <w:num w:numId="22" w16cid:durableId="2090030338">
     <w:abstractNumId w:val="21"/>
   </w:num>
-  <w:num w:numId="23">
+  <w:num w:numId="23" w16cid:durableId="828256584">
     <w:abstractNumId w:val="35"/>
   </w:num>
-  <w:num w:numId="24">
+  <w:num w:numId="24" w16cid:durableId="201863314">
     <w:abstractNumId w:val="6"/>
   </w:num>
-  <w:num w:numId="25">
+  <w:num w:numId="25" w16cid:durableId="1705599560">
     <w:abstractNumId w:val="4"/>
   </w:num>
-  <w:num w:numId="26">
+  <w:num w:numId="26" w16cid:durableId="607808576">
     <w:abstractNumId w:val="1"/>
   </w:num>
-  <w:num w:numId="27">
+  <w:num w:numId="27" w16cid:durableId="1458179259">
     <w:abstractNumId w:val="31"/>
   </w:num>
-  <w:num w:numId="28">
+  <w:num w:numId="28" w16cid:durableId="2019237278">
     <w:abstractNumId w:val="28"/>
   </w:num>
-  <w:num w:numId="29">
+  <w:num w:numId="29" w16cid:durableId="2089572339">
     <w:abstractNumId w:val="15"/>
   </w:num>
-  <w:num w:numId="30">
+  <w:num w:numId="30" w16cid:durableId="822165157">
     <w:abstractNumId w:val="26"/>
   </w:num>
-  <w:num w:numId="31">
+  <w:num w:numId="31" w16cid:durableId="1817338104">
     <w:abstractNumId w:val="25"/>
   </w:num>
-  <w:num w:numId="32">
+  <w:num w:numId="32" w16cid:durableId="772557672">
     <w:abstractNumId w:val="32"/>
   </w:num>
-  <w:num w:numId="33">
+  <w:num w:numId="33" w16cid:durableId="744452252">
     <w:abstractNumId w:val="8"/>
   </w:num>
-  <w:num w:numId="34">
+  <w:num w:numId="34" w16cid:durableId="1593968611">
     <w:abstractNumId w:val="29"/>
   </w:num>
-  <w:num w:numId="35">
+  <w:num w:numId="35" w16cid:durableId="436560744">
     <w:abstractNumId w:val="0"/>
   </w:num>
-  <w:num w:numId="36">
+  <w:num w:numId="36" w16cid:durableId="72165295">
     <w:abstractNumId w:val="13"/>
   </w:num>
-  <w:num w:numId="37">
+  <w:num w:numId="37" w16cid:durableId="282620276">
     <w:abstractNumId w:val="7"/>
   </w:num>
-  <w:num w:numId="38">
+  <w:num w:numId="38" w16cid:durableId="482742826">
     <w:abstractNumId w:val="22"/>
   </w:num>
-  <w:num w:numId="39">
+  <w:num w:numId="39" w16cid:durableId="240988358">
     <w:abstractNumId w:val="5"/>
   </w:num>
-  <w:num w:numId="40">
+  <w:num w:numId="40" w16cid:durableId="1537280528">
     <w:abstractNumId w:val="37"/>
   </w:num>
-  <w:num w:numId="41">
+  <w:num w:numId="41" w16cid:durableId="1011646232">
     <w:abstractNumId w:val="24"/>
   </w:num>
-  <w:num w:numId="42">
+  <w:num w:numId="42" w16cid:durableId="1011681132">
     <w:abstractNumId w:val="23"/>
   </w:num>
-  <w:num w:numId="43">
+  <w:num w:numId="43" w16cid:durableId="1462571741">
     <w:abstractNumId w:val="16"/>
   </w:num>
   <w:numIdMacAtCleanup w:val="15"/>

</xml_diff>